<commit_message>
actualizar manual de usuario
</commit_message>
<xml_diff>
--- a/Documentacion/Manual de Usuario.docx
+++ b/Documentacion/Manual de Usuario.docx
@@ -176,7 +176,7 @@
       <w:pPr>
         <w:pStyle w:val="Normal"/>
         <w:suppressAutoHyphens w:val="true"/>
-        <w:overflowPunct w:val="true"/>
+        <w:overflowPunct w:val="false"/>
         <w:bidi w:val="0"/>
         <w:spacing w:lineRule="auto" w:line="240" w:before="0" w:after="0"/>
         <w:jc w:val="left"/>
@@ -205,7 +205,7 @@
       <w:pPr>
         <w:pStyle w:val="Normal"/>
         <w:suppressAutoHyphens w:val="true"/>
-        <w:overflowPunct w:val="true"/>
+        <w:overflowPunct w:val="false"/>
         <w:bidi w:val="0"/>
         <w:spacing w:lineRule="auto" w:line="240" w:before="0" w:after="0"/>
         <w:jc w:val="left"/>
@@ -231,7 +231,7 @@
       <w:pPr>
         <w:pStyle w:val="Normal"/>
         <w:suppressAutoHyphens w:val="true"/>
-        <w:overflowPunct w:val="true"/>
+        <w:overflowPunct w:val="false"/>
         <w:bidi w:val="0"/>
         <w:spacing w:lineRule="auto" w:line="240" w:before="0" w:after="0"/>
         <w:ind w:left="0" w:right="0" w:firstLine="360"/>
@@ -265,7 +265,7 @@
           <w:numId w:val="1"/>
         </w:numPr>
         <w:suppressAutoHyphens w:val="true"/>
-        <w:overflowPunct w:val="true"/>
+        <w:overflowPunct w:val="false"/>
         <w:bidi w:val="0"/>
         <w:spacing w:lineRule="auto" w:line="240" w:before="0" w:after="140"/>
         <w:jc w:val="both"/>
@@ -303,7 +303,7 @@
           <w:numId w:val="1"/>
         </w:numPr>
         <w:suppressAutoHyphens w:val="true"/>
-        <w:overflowPunct w:val="true"/>
+        <w:overflowPunct w:val="false"/>
         <w:bidi w:val="0"/>
         <w:spacing w:lineRule="auto" w:line="240" w:before="0" w:after="140"/>
         <w:jc w:val="both"/>
@@ -334,7 +334,7 @@
           <w:numId w:val="1"/>
         </w:numPr>
         <w:suppressAutoHyphens w:val="true"/>
-        <w:overflowPunct w:val="true"/>
+        <w:overflowPunct w:val="false"/>
         <w:bidi w:val="0"/>
         <w:spacing w:lineRule="auto" w:line="240" w:before="0" w:after="140"/>
         <w:jc w:val="both"/>
@@ -361,7 +361,7 @@
       <w:pPr>
         <w:pStyle w:val="Normal"/>
         <w:suppressAutoHyphens w:val="true"/>
-        <w:overflowPunct w:val="true"/>
+        <w:overflowPunct w:val="false"/>
         <w:bidi w:val="0"/>
         <w:spacing w:lineRule="auto" w:line="240" w:before="0" w:after="0"/>
         <w:jc w:val="left"/>
@@ -458,7 +458,7 @@
       <w:pPr>
         <w:pStyle w:val="Normal"/>
         <w:suppressAutoHyphens w:val="true"/>
-        <w:overflowPunct w:val="true"/>
+        <w:overflowPunct w:val="false"/>
         <w:bidi w:val="0"/>
         <w:spacing w:lineRule="auto" w:line="240" w:before="0" w:after="0"/>
         <w:jc w:val="left"/>
@@ -493,7 +493,7 @@
       <w:pPr>
         <w:pStyle w:val="Normal"/>
         <w:suppressAutoHyphens w:val="true"/>
-        <w:overflowPunct w:val="true"/>
+        <w:overflowPunct w:val="false"/>
         <w:bidi w:val="0"/>
         <w:spacing w:lineRule="auto" w:line="240" w:before="0" w:after="0"/>
         <w:ind w:left="0" w:right="0" w:firstLine="360"/>
@@ -525,7 +525,7 @@
           <w:numId w:val="2"/>
         </w:numPr>
         <w:suppressAutoHyphens w:val="true"/>
-        <w:overflowPunct w:val="true"/>
+        <w:overflowPunct w:val="false"/>
         <w:bidi w:val="0"/>
         <w:spacing w:lineRule="auto" w:line="240" w:before="0" w:after="0"/>
         <w:jc w:val="both"/>
@@ -558,7 +558,7 @@
           <w:numId w:val="2"/>
         </w:numPr>
         <w:suppressAutoHyphens w:val="true"/>
-        <w:overflowPunct w:val="true"/>
+        <w:overflowPunct w:val="false"/>
         <w:bidi w:val="0"/>
         <w:spacing w:lineRule="auto" w:line="240" w:before="0" w:after="0"/>
         <w:jc w:val="both"/>
@@ -606,7 +606,7 @@
           <w:numId w:val="2"/>
         </w:numPr>
         <w:suppressAutoHyphens w:val="true"/>
-        <w:overflowPunct w:val="true"/>
+        <w:overflowPunct w:val="false"/>
         <w:bidi w:val="0"/>
         <w:spacing w:lineRule="auto" w:line="240" w:before="0" w:after="0"/>
         <w:jc w:val="both"/>
@@ -654,7 +654,7 @@
           <w:numId w:val="2"/>
         </w:numPr>
         <w:suppressAutoHyphens w:val="true"/>
-        <w:overflowPunct w:val="true"/>
+        <w:overflowPunct w:val="false"/>
         <w:bidi w:val="0"/>
         <w:spacing w:lineRule="auto" w:line="240" w:before="0" w:after="0"/>
         <w:jc w:val="both"/>
@@ -702,7 +702,7 @@
           <w:numId w:val="2"/>
         </w:numPr>
         <w:suppressAutoHyphens w:val="true"/>
-        <w:overflowPunct w:val="true"/>
+        <w:overflowPunct w:val="false"/>
         <w:bidi w:val="0"/>
         <w:spacing w:lineRule="auto" w:line="240" w:before="0" w:after="0"/>
         <w:jc w:val="both"/>
@@ -746,7 +746,7 @@
       <w:pPr>
         <w:pStyle w:val="Normal"/>
         <w:suppressAutoHyphens w:val="true"/>
-        <w:overflowPunct w:val="true"/>
+        <w:overflowPunct w:val="false"/>
         <w:bidi w:val="0"/>
         <w:spacing w:lineRule="auto" w:line="240" w:before="0" w:after="0"/>
         <w:jc w:val="both"/>
@@ -772,7 +772,7 @@
       <w:pPr>
         <w:pStyle w:val="Normal"/>
         <w:suppressAutoHyphens w:val="true"/>
-        <w:overflowPunct w:val="true"/>
+        <w:overflowPunct w:val="false"/>
         <w:bidi w:val="0"/>
         <w:spacing w:lineRule="auto" w:line="240" w:before="0" w:after="0"/>
         <w:jc w:val="both"/>
@@ -798,7 +798,7 @@
       <w:pPr>
         <w:pStyle w:val="Normal"/>
         <w:suppressAutoHyphens w:val="true"/>
-        <w:overflowPunct w:val="true"/>
+        <w:overflowPunct w:val="false"/>
         <w:bidi w:val="0"/>
         <w:spacing w:lineRule="auto" w:line="240" w:before="0" w:after="0"/>
         <w:jc w:val="both"/>
@@ -824,7 +824,7 @@
       <w:pPr>
         <w:pStyle w:val="Normal"/>
         <w:suppressAutoHyphens w:val="true"/>
-        <w:overflowPunct w:val="true"/>
+        <w:overflowPunct w:val="false"/>
         <w:bidi w:val="0"/>
         <w:spacing w:lineRule="auto" w:line="240" w:before="0" w:after="0"/>
         <w:jc w:val="left"/>
@@ -1053,7 +1053,7 @@
       <w:pPr>
         <w:pStyle w:val="Normal"/>
         <w:suppressAutoHyphens w:val="true"/>
-        <w:overflowPunct w:val="true"/>
+        <w:overflowPunct w:val="false"/>
         <w:bidi w:val="0"/>
         <w:spacing w:lineRule="auto" w:line="240" w:before="0" w:after="0"/>
         <w:jc w:val="left"/>
@@ -1086,7 +1086,7 @@
       <w:pPr>
         <w:pStyle w:val="Normal"/>
         <w:suppressAutoHyphens w:val="true"/>
-        <w:overflowPunct w:val="true"/>
+        <w:overflowPunct w:val="false"/>
         <w:bidi w:val="0"/>
         <w:spacing w:lineRule="auto" w:line="240" w:before="0" w:after="0"/>
         <w:ind w:left="0" w:right="0" w:firstLine="360"/>
@@ -1118,7 +1118,7 @@
           <w:numId w:val="3"/>
         </w:numPr>
         <w:suppressAutoHyphens w:val="true"/>
-        <w:overflowPunct w:val="true"/>
+        <w:overflowPunct w:val="false"/>
         <w:bidi w:val="0"/>
         <w:spacing w:lineRule="auto" w:line="240" w:before="0" w:after="0"/>
         <w:jc w:val="both"/>
@@ -1149,7 +1149,7 @@
           <w:numId w:val="3"/>
         </w:numPr>
         <w:suppressAutoHyphens w:val="true"/>
-        <w:overflowPunct w:val="true"/>
+        <w:overflowPunct w:val="false"/>
         <w:bidi w:val="0"/>
         <w:spacing w:lineRule="auto" w:line="240" w:before="0" w:after="0"/>
         <w:jc w:val="both"/>
@@ -1180,7 +1180,7 @@
           <w:numId w:val="3"/>
         </w:numPr>
         <w:suppressAutoHyphens w:val="true"/>
-        <w:overflowPunct w:val="true"/>
+        <w:overflowPunct w:val="false"/>
         <w:bidi w:val="0"/>
         <w:spacing w:lineRule="auto" w:line="240" w:before="0" w:after="0"/>
         <w:jc w:val="both"/>
@@ -1211,7 +1211,7 @@
           <w:numId w:val="3"/>
         </w:numPr>
         <w:suppressAutoHyphens w:val="true"/>
-        <w:overflowPunct w:val="true"/>
+        <w:overflowPunct w:val="false"/>
         <w:bidi w:val="0"/>
         <w:spacing w:lineRule="auto" w:line="240" w:before="0" w:after="0"/>
         <w:jc w:val="both"/>
@@ -1238,7 +1238,7 @@
       <w:pPr>
         <w:pStyle w:val="Normal"/>
         <w:suppressAutoHyphens w:val="true"/>
-        <w:overflowPunct w:val="true"/>
+        <w:overflowPunct w:val="false"/>
         <w:bidi w:val="0"/>
         <w:spacing w:lineRule="auto" w:line="240" w:before="0" w:after="0"/>
         <w:jc w:val="left"/>
@@ -1271,7 +1271,7 @@
       <w:pPr>
         <w:pStyle w:val="Normal"/>
         <w:suppressAutoHyphens w:val="true"/>
-        <w:overflowPunct w:val="true"/>
+        <w:overflowPunct w:val="false"/>
         <w:bidi w:val="0"/>
         <w:spacing w:lineRule="auto" w:line="240" w:before="0" w:after="0"/>
         <w:jc w:val="left"/>
@@ -1304,7 +1304,7 @@
       <w:pPr>
         <w:pStyle w:val="Normal"/>
         <w:suppressAutoHyphens w:val="true"/>
-        <w:overflowPunct w:val="true"/>
+        <w:overflowPunct w:val="false"/>
         <w:bidi w:val="0"/>
         <w:spacing w:lineRule="auto" w:line="240" w:before="0" w:after="0"/>
         <w:jc w:val="left"/>
@@ -1337,7 +1337,7 @@
       <w:pPr>
         <w:pStyle w:val="Normal"/>
         <w:suppressAutoHyphens w:val="true"/>
-        <w:overflowPunct w:val="true"/>
+        <w:overflowPunct w:val="false"/>
         <w:bidi w:val="0"/>
         <w:spacing w:lineRule="auto" w:line="240" w:before="0" w:after="0"/>
         <w:jc w:val="left"/>
@@ -1370,7 +1370,7 @@
       <w:pPr>
         <w:pStyle w:val="Normal"/>
         <w:suppressAutoHyphens w:val="true"/>
-        <w:overflowPunct w:val="true"/>
+        <w:overflowPunct w:val="false"/>
         <w:bidi w:val="0"/>
         <w:spacing w:lineRule="auto" w:line="240" w:before="0" w:after="0"/>
         <w:jc w:val="left"/>
@@ -1403,7 +1403,7 @@
       <w:pPr>
         <w:pStyle w:val="Normal"/>
         <w:suppressAutoHyphens w:val="true"/>
-        <w:overflowPunct w:val="true"/>
+        <w:overflowPunct w:val="false"/>
         <w:bidi w:val="0"/>
         <w:spacing w:lineRule="auto" w:line="240" w:before="0" w:after="0"/>
         <w:jc w:val="left"/>
@@ -1436,7 +1436,7 @@
       <w:pPr>
         <w:pStyle w:val="Normal"/>
         <w:suppressAutoHyphens w:val="true"/>
-        <w:overflowPunct w:val="true"/>
+        <w:overflowPunct w:val="false"/>
         <w:bidi w:val="0"/>
         <w:spacing w:lineRule="auto" w:line="240" w:before="0" w:after="0"/>
         <w:jc w:val="left"/>
@@ -1469,7 +1469,7 @@
       <w:pPr>
         <w:pStyle w:val="Normal"/>
         <w:suppressAutoHyphens w:val="true"/>
-        <w:overflowPunct w:val="true"/>
+        <w:overflowPunct w:val="false"/>
         <w:bidi w:val="0"/>
         <w:spacing w:lineRule="auto" w:line="240" w:before="0" w:after="0"/>
         <w:jc w:val="left"/>
@@ -1502,7 +1502,7 @@
       <w:pPr>
         <w:pStyle w:val="Normal"/>
         <w:suppressAutoHyphens w:val="true"/>
-        <w:overflowPunct w:val="true"/>
+        <w:overflowPunct w:val="false"/>
         <w:bidi w:val="0"/>
         <w:spacing w:lineRule="auto" w:line="240" w:before="0" w:after="0"/>
         <w:jc w:val="left"/>
@@ -1599,7 +1599,7 @@
       <w:pPr>
         <w:pStyle w:val="Normal"/>
         <w:suppressAutoHyphens w:val="true"/>
-        <w:overflowPunct w:val="true"/>
+        <w:overflowPunct w:val="false"/>
         <w:bidi w:val="0"/>
         <w:spacing w:lineRule="auto" w:line="240" w:before="0" w:after="0"/>
         <w:jc w:val="left"/>
@@ -1626,7 +1626,7 @@
       <w:pPr>
         <w:pStyle w:val="Normal"/>
         <w:suppressAutoHyphens w:val="true"/>
-        <w:overflowPunct w:val="true"/>
+        <w:overflowPunct w:val="false"/>
         <w:bidi w:val="0"/>
         <w:spacing w:lineRule="auto" w:line="240" w:before="0" w:after="0"/>
         <w:jc w:val="left"/>
@@ -1652,7 +1652,7 @@
       <w:pPr>
         <w:pStyle w:val="Normal"/>
         <w:suppressAutoHyphens w:val="true"/>
-        <w:overflowPunct w:val="true"/>
+        <w:overflowPunct w:val="false"/>
         <w:bidi w:val="0"/>
         <w:spacing w:lineRule="auto" w:line="240" w:before="0" w:after="0"/>
         <w:jc w:val="left"/>
@@ -1745,7 +1745,7 @@
       <w:pPr>
         <w:pStyle w:val="Normal"/>
         <w:suppressAutoHyphens w:val="true"/>
-        <w:overflowPunct w:val="true"/>
+        <w:overflowPunct w:val="false"/>
         <w:bidi w:val="0"/>
         <w:spacing w:lineRule="auto" w:line="240" w:before="0" w:after="0"/>
         <w:jc w:val="left"/>
@@ -1772,7 +1772,7 @@
       <w:pPr>
         <w:pStyle w:val="Normal"/>
         <w:suppressAutoHyphens w:val="true"/>
-        <w:overflowPunct w:val="true"/>
+        <w:overflowPunct w:val="false"/>
         <w:bidi w:val="0"/>
         <w:spacing w:lineRule="auto" w:line="240" w:before="0" w:after="0"/>
         <w:jc w:val="left"/>
@@ -1798,7 +1798,7 @@
       <w:pPr>
         <w:pStyle w:val="Normal"/>
         <w:suppressAutoHyphens w:val="true"/>
-        <w:overflowPunct w:val="true"/>
+        <w:overflowPunct w:val="false"/>
         <w:bidi w:val="0"/>
         <w:spacing w:lineRule="auto" w:line="240" w:before="0" w:after="140"/>
         <w:ind w:left="0" w:right="0" w:firstLine="708"/>
@@ -1863,7 +1863,7 @@
           <w:tab w:val="left" w:pos="0" w:leader="none"/>
         </w:tabs>
         <w:suppressAutoHyphens w:val="true"/>
-        <w:overflowPunct w:val="true"/>
+        <w:overflowPunct w:val="false"/>
         <w:bidi w:val="0"/>
         <w:spacing w:lineRule="auto" w:line="240" w:before="0" w:after="140"/>
         <w:jc w:val="both"/>
@@ -1898,7 +1898,7 @@
           <w:tab w:val="left" w:pos="0" w:leader="none"/>
         </w:tabs>
         <w:suppressAutoHyphens w:val="true"/>
-        <w:overflowPunct w:val="true"/>
+        <w:overflowPunct w:val="false"/>
         <w:bidi w:val="0"/>
         <w:spacing w:lineRule="auto" w:line="240" w:before="0" w:after="140"/>
         <w:jc w:val="both"/>
@@ -1933,7 +1933,7 @@
           <w:tab w:val="left" w:pos="0" w:leader="none"/>
         </w:tabs>
         <w:suppressAutoHyphens w:val="true"/>
-        <w:overflowPunct w:val="true"/>
+        <w:overflowPunct w:val="false"/>
         <w:bidi w:val="0"/>
         <w:spacing w:lineRule="auto" w:line="240" w:before="0" w:after="140"/>
         <w:jc w:val="both"/>
@@ -1968,7 +1968,7 @@
           <w:tab w:val="left" w:pos="0" w:leader="none"/>
         </w:tabs>
         <w:suppressAutoHyphens w:val="true"/>
-        <w:overflowPunct w:val="true"/>
+        <w:overflowPunct w:val="false"/>
         <w:bidi w:val="0"/>
         <w:spacing w:lineRule="auto" w:line="240" w:before="0" w:after="140"/>
         <w:jc w:val="both"/>
@@ -1999,7 +1999,7 @@
           <w:tab w:val="left" w:pos="0" w:leader="none"/>
         </w:tabs>
         <w:suppressAutoHyphens w:val="true"/>
-        <w:overflowPunct w:val="true"/>
+        <w:overflowPunct w:val="false"/>
         <w:bidi w:val="0"/>
         <w:spacing w:lineRule="auto" w:line="240" w:before="0" w:after="140"/>
         <w:jc w:val="both"/>
@@ -2087,7 +2087,7 @@
       <w:pPr>
         <w:pStyle w:val="Normal"/>
         <w:suppressAutoHyphens w:val="true"/>
-        <w:overflowPunct w:val="true"/>
+        <w:overflowPunct w:val="false"/>
         <w:bidi w:val="0"/>
         <w:spacing w:lineRule="auto" w:line="240" w:before="0" w:after="0"/>
         <w:jc w:val="left"/>
@@ -2116,7 +2116,7 @@
       <w:pPr>
         <w:pStyle w:val="Normal"/>
         <w:suppressAutoHyphens w:val="true"/>
-        <w:overflowPunct w:val="true"/>
+        <w:overflowPunct w:val="false"/>
         <w:bidi w:val="0"/>
         <w:spacing w:lineRule="auto" w:line="240" w:before="0" w:after="0"/>
         <w:jc w:val="left"/>
@@ -2144,7 +2144,7 @@
       <w:pPr>
         <w:pStyle w:val="Normal"/>
         <w:suppressAutoHyphens w:val="true"/>
-        <w:overflowPunct w:val="true"/>
+        <w:overflowPunct w:val="false"/>
         <w:bidi w:val="0"/>
         <w:spacing w:lineRule="auto" w:line="240" w:before="0" w:after="140"/>
         <w:ind w:left="0" w:right="0" w:firstLine="708"/>
@@ -2243,7 +2243,7 @@
       <w:pPr>
         <w:pStyle w:val="Normal"/>
         <w:suppressAutoHyphens w:val="true"/>
-        <w:overflowPunct w:val="true"/>
+        <w:overflowPunct w:val="false"/>
         <w:bidi w:val="0"/>
         <w:spacing w:lineRule="auto" w:line="240" w:before="0" w:after="0"/>
         <w:jc w:val="left"/>
@@ -2272,7 +2272,7 @@
       <w:pPr>
         <w:pStyle w:val="Normal"/>
         <w:suppressAutoHyphens w:val="true"/>
-        <w:overflowPunct w:val="true"/>
+        <w:overflowPunct w:val="false"/>
         <w:bidi w:val="0"/>
         <w:spacing w:lineRule="auto" w:line="240" w:before="0" w:after="140"/>
         <w:ind w:left="0" w:right="0" w:firstLine="426"/>
@@ -2305,7 +2305,7 @@
           <w:tab w:val="left" w:pos="0" w:leader="none"/>
         </w:tabs>
         <w:suppressAutoHyphens w:val="true"/>
-        <w:overflowPunct w:val="true"/>
+        <w:overflowPunct w:val="false"/>
         <w:bidi w:val="0"/>
         <w:spacing w:lineRule="auto" w:line="240" w:before="0" w:after="140"/>
         <w:jc w:val="left"/>
@@ -2340,7 +2340,7 @@
           <w:tab w:val="left" w:pos="0" w:leader="none"/>
         </w:tabs>
         <w:suppressAutoHyphens w:val="true"/>
-        <w:overflowPunct w:val="true"/>
+        <w:overflowPunct w:val="false"/>
         <w:bidi w:val="0"/>
         <w:spacing w:lineRule="auto" w:line="240" w:before="0" w:after="140"/>
         <w:jc w:val="left"/>
@@ -2375,7 +2375,7 @@
           <w:tab w:val="left" w:pos="0" w:leader="none"/>
         </w:tabs>
         <w:suppressAutoHyphens w:val="true"/>
-        <w:overflowPunct w:val="true"/>
+        <w:overflowPunct w:val="false"/>
         <w:bidi w:val="0"/>
         <w:spacing w:lineRule="auto" w:line="240" w:before="0" w:after="140"/>
         <w:jc w:val="left"/>
@@ -2410,7 +2410,7 @@
           <w:tab w:val="left" w:pos="0" w:leader="none"/>
         </w:tabs>
         <w:suppressAutoHyphens w:val="true"/>
-        <w:overflowPunct w:val="true"/>
+        <w:overflowPunct w:val="false"/>
         <w:bidi w:val="0"/>
         <w:spacing w:lineRule="auto" w:line="240" w:before="0" w:after="140"/>
         <w:jc w:val="left"/>
@@ -2437,7 +2437,7 @@
       <w:pPr>
         <w:pStyle w:val="Normal"/>
         <w:suppressAutoHyphens w:val="true"/>
-        <w:overflowPunct w:val="true"/>
+        <w:overflowPunct w:val="false"/>
         <w:bidi w:val="0"/>
         <w:spacing w:lineRule="auto" w:line="240" w:before="0" w:after="0"/>
         <w:jc w:val="left"/>
@@ -2463,7 +2463,7 @@
       <w:pPr>
         <w:pStyle w:val="Normal"/>
         <w:suppressAutoHyphens w:val="true"/>
-        <w:overflowPunct w:val="true"/>
+        <w:overflowPunct w:val="false"/>
         <w:bidi w:val="0"/>
         <w:spacing w:lineRule="auto" w:line="240" w:before="240" w:after="0"/>
         <w:jc w:val="left"/>
@@ -2527,7 +2527,7 @@
       <w:pPr>
         <w:pStyle w:val="Normal"/>
         <w:suppressAutoHyphens w:val="true"/>
-        <w:overflowPunct w:val="true"/>
+        <w:overflowPunct w:val="false"/>
         <w:bidi w:val="0"/>
         <w:spacing w:lineRule="auto" w:line="240" w:before="240" w:after="0"/>
         <w:jc w:val="left"/>
@@ -2559,7 +2559,7 @@
       <w:pPr>
         <w:pStyle w:val="Normal"/>
         <w:suppressAutoHyphens w:val="true"/>
-        <w:overflowPunct w:val="true"/>
+        <w:overflowPunct w:val="false"/>
         <w:bidi w:val="0"/>
         <w:spacing w:lineRule="auto" w:line="240" w:before="0" w:after="0"/>
         <w:jc w:val="left"/>
@@ -2588,7 +2588,7 @@
       <w:pPr>
         <w:pStyle w:val="Normal"/>
         <w:suppressAutoHyphens w:val="true"/>
-        <w:overflowPunct w:val="true"/>
+        <w:overflowPunct w:val="false"/>
         <w:bidi w:val="0"/>
         <w:spacing w:lineRule="auto" w:line="240" w:before="0" w:after="0"/>
         <w:jc w:val="left"/>
@@ -2614,7 +2614,7 @@
       <w:pPr>
         <w:pStyle w:val="Normal"/>
         <w:suppressAutoHyphens w:val="true"/>
-        <w:overflowPunct w:val="true"/>
+        <w:overflowPunct w:val="false"/>
         <w:bidi w:val="0"/>
         <w:spacing w:lineRule="auto" w:line="240" w:before="0" w:after="140"/>
         <w:ind w:left="0" w:right="0" w:firstLine="360"/>
@@ -2643,7 +2643,7 @@
           <w:numId w:val="6"/>
         </w:numPr>
         <w:suppressAutoHyphens w:val="true"/>
-        <w:overflowPunct w:val="true"/>
+        <w:overflowPunct w:val="false"/>
         <w:bidi w:val="0"/>
         <w:spacing w:lineRule="auto" w:line="240" w:before="0" w:after="140"/>
         <w:jc w:val="both"/>
@@ -2674,7 +2674,7 @@
           <w:numId w:val="6"/>
         </w:numPr>
         <w:suppressAutoHyphens w:val="true"/>
-        <w:overflowPunct w:val="true"/>
+        <w:overflowPunct w:val="false"/>
         <w:bidi w:val="0"/>
         <w:spacing w:lineRule="auto" w:line="240" w:before="0" w:after="140"/>
         <w:jc w:val="both"/>
@@ -2705,7 +2705,7 @@
           <w:numId w:val="6"/>
         </w:numPr>
         <w:suppressAutoHyphens w:val="true"/>
-        <w:overflowPunct w:val="true"/>
+        <w:overflowPunct w:val="false"/>
         <w:bidi w:val="0"/>
         <w:spacing w:lineRule="auto" w:line="240" w:before="0" w:after="140"/>
         <w:jc w:val="both"/>
@@ -2736,7 +2736,7 @@
           <w:numId w:val="6"/>
         </w:numPr>
         <w:suppressAutoHyphens w:val="true"/>
-        <w:overflowPunct w:val="true"/>
+        <w:overflowPunct w:val="false"/>
         <w:bidi w:val="0"/>
         <w:spacing w:lineRule="auto" w:line="240" w:before="0" w:after="140"/>
         <w:jc w:val="both"/>
@@ -2767,7 +2767,7 @@
           <w:numId w:val="6"/>
         </w:numPr>
         <w:suppressAutoHyphens w:val="true"/>
-        <w:overflowPunct w:val="true"/>
+        <w:overflowPunct w:val="false"/>
         <w:bidi w:val="0"/>
         <w:spacing w:lineRule="auto" w:line="240" w:before="0" w:after="140"/>
         <w:jc w:val="both"/>
@@ -2794,7 +2794,7 @@
       <w:pPr>
         <w:pStyle w:val="Normal"/>
         <w:suppressAutoHyphens w:val="true"/>
-        <w:overflowPunct w:val="true"/>
+        <w:overflowPunct w:val="false"/>
         <w:bidi w:val="0"/>
         <w:spacing w:lineRule="auto" w:line="240" w:before="0" w:after="140"/>
         <w:jc w:val="both"/>
@@ -6474,9 +6474,198 @@
     </w:p>
     <w:p>
       <w:pPr>
+        <w:pStyle w:val="TextBody"/>
+        <w:numPr>
+          <w:ilvl w:val="0"/>
+          <w:numId w:val="0"/>
+        </w:numPr>
+        <w:tabs>
+          <w:tab w:val="left" w:pos="709" w:leader="none"/>
+        </w:tabs>
+        <w:bidi w:val="0"/>
+        <w:spacing w:lineRule="auto" w:line="240"/>
+        <w:ind w:hanging="0"/>
+        <w:jc w:val="left"/>
+        <w:rPr>
+          <w:b/>
+          <w:b/>
+          <w:bCs/>
+          <w:sz w:val="32"/>
+          <w:szCs w:val="32"/>
+        </w:rPr>
+      </w:pPr>
+      <w:r>
+        <w:rPr>
+          <w:b/>
+          <w:bCs/>
+          <w:sz w:val="32"/>
+          <w:szCs w:val="32"/>
+          <w:lang w:val="zxx" w:eastAsia="zxx" w:bidi="zxx"/>
+        </w:rPr>
+        <w:t>Como editar la constancia generada?</w:t>
+      </w:r>
+    </w:p>
+    <w:p>
+      <w:pPr>
+        <w:pStyle w:val="TextBody"/>
+        <w:numPr>
+          <w:ilvl w:val="0"/>
+          <w:numId w:val="0"/>
+        </w:numPr>
+        <w:tabs>
+          <w:tab w:val="left" w:pos="709" w:leader="none"/>
+        </w:tabs>
+        <w:bidi w:val="0"/>
+        <w:spacing w:lineRule="auto" w:line="240"/>
+        <w:ind w:hanging="0"/>
+        <w:jc w:val="left"/>
+        <w:rPr>
+          <w:sz w:val="24"/>
+          <w:szCs w:val="24"/>
+        </w:rPr>
+      </w:pPr>
+      <w:r>
+        <w:rPr>
+          <w:sz w:val="24"/>
+          <w:szCs w:val="24"/>
+          <w:lang w:val="zxx" w:eastAsia="zxx" w:bidi="zxx"/>
+        </w:rPr>
+        <w:t>Si cambia el final .pdf a .docx en la url, se le descargara el archivo editable</w:t>
+      </w:r>
+    </w:p>
+    <w:p>
+      <w:pPr>
+        <w:pStyle w:val="TextBody"/>
+        <w:numPr>
+          <w:ilvl w:val="0"/>
+          <w:numId w:val="0"/>
+        </w:numPr>
+        <w:tabs>
+          <w:tab w:val="left" w:pos="709" w:leader="none"/>
+        </w:tabs>
+        <w:bidi w:val="0"/>
+        <w:spacing w:lineRule="auto" w:line="240"/>
+        <w:ind w:hanging="0"/>
+        <w:jc w:val="left"/>
+        <w:rPr>
+          <w:b/>
+          <w:b/>
+          <w:bCs/>
+          <w:sz w:val="32"/>
+          <w:szCs w:val="32"/>
+        </w:rPr>
+      </w:pPr>
+      <w:r>
+        <w:rPr>
+          <w:b/>
+          <w:bCs/>
+          <w:sz w:val="32"/>
+          <w:szCs w:val="32"/>
+          <w:lang w:val="zxx" w:eastAsia="zxx" w:bidi="zxx"/>
+        </w:rPr>
+        <w:t>Porque no genera pdf, solo archivos editables como antes?</w:t>
+      </w:r>
+    </w:p>
+    <w:p>
+      <w:pPr>
+        <w:pStyle w:val="TextBody"/>
+        <w:numPr>
+          <w:ilvl w:val="0"/>
+          <w:numId w:val="0"/>
+        </w:numPr>
+        <w:tabs>
+          <w:tab w:val="left" w:pos="709" w:leader="none"/>
+        </w:tabs>
+        <w:bidi w:val="0"/>
+        <w:spacing w:lineRule="auto" w:line="240"/>
+        <w:ind w:hanging="0"/>
+        <w:jc w:val="left"/>
+        <w:rPr>
+          <w:sz w:val="24"/>
+          <w:szCs w:val="24"/>
+        </w:rPr>
+      </w:pPr>
+      <w:r>
+        <w:rPr>
+          <w:sz w:val="24"/>
+          <w:szCs w:val="24"/>
+          <w:lang w:val="zxx" w:eastAsia="zxx" w:bidi="zxx"/>
+        </w:rPr>
+        <w:t>Posiblemente no este instalado cualquier version de microsoft word o libre office, cuando eso ocurre, el programa no convierte el archivo editable en un pdf para imprimir</w:t>
+      </w:r>
+    </w:p>
+    <w:p>
+      <w:pPr>
+        <w:pStyle w:val="TextBody"/>
+        <w:numPr>
+          <w:ilvl w:val="0"/>
+          <w:numId w:val="0"/>
+        </w:numPr>
+        <w:tabs>
+          <w:tab w:val="left" w:pos="709" w:leader="none"/>
+        </w:tabs>
+        <w:bidi w:val="0"/>
+        <w:spacing w:lineRule="auto" w:line="240"/>
+        <w:ind w:hanging="0"/>
+        <w:jc w:val="left"/>
+        <w:rPr>
+          <w:b/>
+          <w:b/>
+          <w:bCs/>
+          <w:position w:val="0"/>
+          <w:sz w:val="32"/>
+          <w:sz w:val="32"/>
+          <w:szCs w:val="32"/>
+          <w:vertAlign w:val="baseline"/>
+        </w:rPr>
+      </w:pPr>
+      <w:r>
+        <w:rPr>
+          <w:b/>
+          <w:bCs/>
+          <w:position w:val="0"/>
+          <w:sz w:val="32"/>
+          <w:sz w:val="32"/>
+          <w:szCs w:val="32"/>
+          <w:vertAlign w:val="baseline"/>
+          <w:lang w:val="zxx" w:eastAsia="zxx" w:bidi="zxx"/>
+        </w:rPr>
+        <w:t>Porque si tengo instalado Microsoft Word y LibreOffice todavia sigue dando error "" al intentar generar un pdf?</w:t>
+      </w:r>
+    </w:p>
+    <w:p>
+      <w:pPr>
+        <w:pStyle w:val="TextBody"/>
+        <w:numPr>
+          <w:ilvl w:val="0"/>
+          <w:numId w:val="0"/>
+        </w:numPr>
+        <w:tabs>
+          <w:tab w:val="left" w:pos="709" w:leader="none"/>
+        </w:tabs>
+        <w:bidi w:val="0"/>
+        <w:spacing w:lineRule="auto" w:line="240"/>
+        <w:ind w:hanging="0"/>
+        <w:jc w:val="left"/>
+        <w:rPr>
+          <w:sz w:val="24"/>
+          <w:szCs w:val="24"/>
+        </w:rPr>
+      </w:pPr>
+      <w:r>
+        <w:rPr>
+          <w:sz w:val="24"/>
+          <w:szCs w:val="24"/>
+          <w:lang w:val="zxx" w:eastAsia="zxx" w:bidi="zxx"/>
+        </w:rPr>
+        <w:t>Esto es por como Windows maneja los permisos de usuario, para solucionarlo...</w:t>
+      </w:r>
+    </w:p>
+    <w:p>
+      <w:pPr>
         <w:pStyle w:val="Heading2"/>
         <w:suppressAutoHyphens w:val="true"/>
-        <w:overflowPunct w:val="true"/>
+        <w:overflowPunct w:val="false"/>
         <w:bidi w:val="0"/>
         <w:spacing w:lineRule="auto" w:line="240" w:before="0" w:after="140"/>
         <w:ind w:left="0" w:hanging="0"/>
@@ -7418,7 +7607,7 @@
       <w:pPr>
         <w:pStyle w:val="TextBody"/>
         <w:suppressAutoHyphens w:val="true"/>
-        <w:overflowPunct w:val="true"/>
+        <w:overflowPunct w:val="false"/>
         <w:bidi w:val="0"/>
         <w:spacing w:lineRule="auto" w:line="240" w:before="0" w:after="140"/>
         <w:jc w:val="both"/>
@@ -11768,7 +11957,7 @@
     <w:pPr>
       <w:widowControl/>
       <w:suppressAutoHyphens w:val="true"/>
-      <w:overflowPunct w:val="true"/>
+      <w:overflowPunct w:val="false"/>
       <w:bidi w:val="0"/>
       <w:spacing w:before="0" w:after="0"/>
       <w:jc w:val="left"/>
@@ -11965,7 +12154,7 @@
     <w:pPr>
       <w:widowControl/>
       <w:suppressAutoHyphens w:val="true"/>
-      <w:overflowPunct w:val="true"/>
+      <w:overflowPunct w:val="false"/>
       <w:bidi w:val="0"/>
       <w:spacing w:lineRule="auto" w:line="240" w:before="0" w:after="0"/>
       <w:jc w:val="left"/>

</xml_diff>

<commit_message>
agregar funcion para preparar el comando de lire office en windows
</commit_message>
<xml_diff>
--- a/Documentacion/Manual de Usuario.docx
+++ b/Documentacion/Manual de Usuario.docx
@@ -21,7 +21,7 @@
       <w:bookmarkEnd w:id="0"/>
       <w:r>
         <w:rPr>
-          <w:lang w:val="es-VE" w:eastAsia="zxx" w:bidi="zxx"/>
+          <w:lang w:val="es-VE"/>
         </w:rPr>
         <w:drawing>
           <wp:inline distT="0" distB="0" distL="0" distR="0">
@@ -67,7 +67,7 @@
         <w:pStyle w:val="Graficos"/>
         <w:spacing w:lineRule="auto" w:line="240"/>
         <w:rPr>
-          <w:lang w:val="es-VE" w:eastAsia="zxx" w:bidi="zxx"/>
+          <w:lang w:val="es-VE"/>
         </w:rPr>
       </w:pPr>
       <w:bookmarkStart w:id="1" w:name="_Toc210586743"/>
@@ -86,7 +86,7 @@
         <w:spacing w:lineRule="auto" w:line="240"/>
         <w:jc w:val="left"/>
         <w:rPr>
-          <w:lang w:val="es-VE" w:eastAsia="zxx" w:bidi="zxx"/>
+          <w:lang w:val="es-VE"/>
         </w:rPr>
       </w:pPr>
       <w:r>
@@ -104,7 +104,7 @@
         <w:pStyle w:val="Graficos"/>
         <w:spacing w:lineRule="auto" w:line="240"/>
         <w:rPr>
-          <w:lang w:val="es-VE" w:eastAsia="zxx" w:bidi="zxx"/>
+          <w:lang w:val="es-VE"/>
         </w:rPr>
       </w:pPr>
       <w:bookmarkStart w:id="2" w:name="_Toc210586744"/>
@@ -175,12 +175,12 @@
       <w:pPr>
         <w:pStyle w:val="Normal"/>
         <w:suppressAutoHyphens w:val="true"/>
-        <w:overflowPunct w:val="true"/>
+        <w:overflowPunct w:val="false"/>
         <w:bidi w:val="0"/>
         <w:spacing w:lineRule="auto" w:line="240" w:before="0" w:after="0"/>
         <w:jc w:val="left"/>
         <w:rPr>
-          <w:lang w:val="es-VE" w:eastAsia="zxx" w:bidi="zxx"/>
+          <w:lang w:val="es-VE"/>
         </w:rPr>
       </w:pPr>
       <w:r>
@@ -199,7 +199,7 @@
       <w:pPr>
         <w:pStyle w:val="Normal"/>
         <w:suppressAutoHyphens w:val="true"/>
-        <w:overflowPunct w:val="true"/>
+        <w:overflowPunct w:val="false"/>
         <w:bidi w:val="0"/>
         <w:spacing w:lineRule="auto" w:line="240" w:before="0" w:after="0"/>
         <w:jc w:val="left"/>
@@ -225,13 +225,13 @@
       <w:pPr>
         <w:pStyle w:val="Normal"/>
         <w:suppressAutoHyphens w:val="true"/>
-        <w:overflowPunct w:val="true"/>
+        <w:overflowPunct w:val="false"/>
         <w:bidi w:val="0"/>
         <w:spacing w:lineRule="auto" w:line="240" w:before="0" w:after="0"/>
         <w:ind w:left="0" w:right="0" w:firstLine="360"/>
         <w:jc w:val="both"/>
         <w:rPr>
-          <w:lang w:val="es-VE" w:eastAsia="zxx" w:bidi="zxx"/>
+          <w:lang w:val="es-VE"/>
         </w:rPr>
       </w:pPr>
       <w:r>
@@ -254,12 +254,12 @@
           <w:numId w:val="1"/>
         </w:numPr>
         <w:suppressAutoHyphens w:val="true"/>
-        <w:overflowPunct w:val="true"/>
+        <w:overflowPunct w:val="false"/>
         <w:bidi w:val="0"/>
         <w:spacing w:lineRule="auto" w:line="240" w:before="0" w:after="140"/>
         <w:jc w:val="both"/>
         <w:rPr>
-          <w:lang w:val="es-VE" w:eastAsia="zxx" w:bidi="zxx"/>
+          <w:lang w:val="es-VE"/>
         </w:rPr>
       </w:pPr>
       <w:r>
@@ -292,12 +292,12 @@
           <w:numId w:val="1"/>
         </w:numPr>
         <w:suppressAutoHyphens w:val="true"/>
-        <w:overflowPunct w:val="true"/>
+        <w:overflowPunct w:val="false"/>
         <w:bidi w:val="0"/>
         <w:spacing w:lineRule="auto" w:line="240" w:before="0" w:after="140"/>
         <w:jc w:val="both"/>
         <w:rPr>
-          <w:lang w:val="es-VE" w:eastAsia="zxx" w:bidi="zxx"/>
+          <w:lang w:val="es-VE"/>
         </w:rPr>
       </w:pPr>
       <w:r>
@@ -319,12 +319,12 @@
           <w:numId w:val="1"/>
         </w:numPr>
         <w:suppressAutoHyphens w:val="true"/>
-        <w:overflowPunct w:val="true"/>
+        <w:overflowPunct w:val="false"/>
         <w:bidi w:val="0"/>
         <w:spacing w:lineRule="auto" w:line="240" w:before="0" w:after="140"/>
         <w:jc w:val="both"/>
         <w:rPr>
-          <w:lang w:val="es-VE" w:eastAsia="zxx" w:bidi="zxx"/>
+          <w:lang w:val="es-VE"/>
         </w:rPr>
       </w:pPr>
       <w:r>
@@ -342,7 +342,7 @@
       <w:pPr>
         <w:pStyle w:val="Normal"/>
         <w:suppressAutoHyphens w:val="true"/>
-        <w:overflowPunct w:val="true"/>
+        <w:overflowPunct w:val="false"/>
         <w:bidi w:val="0"/>
         <w:spacing w:lineRule="auto" w:line="240" w:before="0" w:after="0"/>
         <w:jc w:val="left"/>
@@ -376,7 +376,7 @@
         <w:pStyle w:val="Graficos"/>
         <w:spacing w:lineRule="auto" w:line="240"/>
         <w:rPr>
-          <w:lang w:val="es-VE" w:eastAsia="zxx" w:bidi="zxx"/>
+          <w:lang w:val="es-VE"/>
         </w:rPr>
       </w:pPr>
       <w:bookmarkStart w:id="4" w:name="_Toc210586745"/>
@@ -439,12 +439,12 @@
       <w:pPr>
         <w:pStyle w:val="Normal"/>
         <w:suppressAutoHyphens w:val="true"/>
-        <w:overflowPunct w:val="true"/>
+        <w:overflowPunct w:val="false"/>
         <w:bidi w:val="0"/>
         <w:spacing w:lineRule="auto" w:line="240" w:before="0" w:after="0"/>
         <w:jc w:val="left"/>
         <w:rPr>
-          <w:lang w:val="es-VE" w:eastAsia="zxx" w:bidi="zxx"/>
+          <w:lang w:val="es-VE"/>
         </w:rPr>
       </w:pPr>
       <w:r>
@@ -474,13 +474,13 @@
       <w:pPr>
         <w:pStyle w:val="Normal"/>
         <w:suppressAutoHyphens w:val="true"/>
-        <w:overflowPunct w:val="true"/>
+        <w:overflowPunct w:val="false"/>
         <w:bidi w:val="0"/>
         <w:spacing w:lineRule="auto" w:line="240" w:before="0" w:after="0"/>
         <w:ind w:left="0" w:right="0" w:firstLine="360"/>
         <w:jc w:val="both"/>
         <w:rPr>
-          <w:lang w:val="es-VE" w:eastAsia="zxx" w:bidi="zxx"/>
+          <w:lang w:val="es-VE"/>
         </w:rPr>
       </w:pPr>
       <w:r>
@@ -502,12 +502,12 @@
           <w:numId w:val="2"/>
         </w:numPr>
         <w:suppressAutoHyphens w:val="true"/>
-        <w:overflowPunct w:val="true"/>
+        <w:overflowPunct w:val="false"/>
         <w:bidi w:val="0"/>
         <w:spacing w:lineRule="auto" w:line="240" w:before="0" w:after="0"/>
         <w:jc w:val="both"/>
         <w:rPr>
-          <w:lang w:val="es-VE" w:eastAsia="zxx" w:bidi="zxx"/>
+          <w:lang w:val="es-VE"/>
         </w:rPr>
       </w:pPr>
       <w:r>
@@ -530,12 +530,12 @@
           <w:numId w:val="2"/>
         </w:numPr>
         <w:suppressAutoHyphens w:val="true"/>
-        <w:overflowPunct w:val="true"/>
+        <w:overflowPunct w:val="false"/>
         <w:bidi w:val="0"/>
         <w:spacing w:lineRule="auto" w:line="240" w:before="0" w:after="0"/>
         <w:jc w:val="both"/>
         <w:rPr>
-          <w:lang w:val="es-VE" w:eastAsia="zxx" w:bidi="zxx"/>
+          <w:lang w:val="es-VE"/>
         </w:rPr>
       </w:pPr>
       <w:r>
@@ -578,12 +578,12 @@
           <w:numId w:val="2"/>
         </w:numPr>
         <w:suppressAutoHyphens w:val="true"/>
-        <w:overflowPunct w:val="true"/>
+        <w:overflowPunct w:val="false"/>
         <w:bidi w:val="0"/>
         <w:spacing w:lineRule="auto" w:line="240" w:before="0" w:after="0"/>
         <w:jc w:val="both"/>
         <w:rPr>
-          <w:lang w:val="es-VE" w:eastAsia="zxx" w:bidi="zxx"/>
+          <w:lang w:val="es-VE"/>
         </w:rPr>
       </w:pPr>
       <w:r>
@@ -626,12 +626,12 @@
           <w:numId w:val="2"/>
         </w:numPr>
         <w:suppressAutoHyphens w:val="true"/>
-        <w:overflowPunct w:val="true"/>
+        <w:overflowPunct w:val="false"/>
         <w:bidi w:val="0"/>
         <w:spacing w:lineRule="auto" w:line="240" w:before="0" w:after="0"/>
         <w:jc w:val="both"/>
         <w:rPr>
-          <w:lang w:val="es-VE" w:eastAsia="zxx" w:bidi="zxx"/>
+          <w:lang w:val="es-VE"/>
         </w:rPr>
       </w:pPr>
       <w:r>
@@ -674,12 +674,12 @@
           <w:numId w:val="2"/>
         </w:numPr>
         <w:suppressAutoHyphens w:val="true"/>
-        <w:overflowPunct w:val="true"/>
+        <w:overflowPunct w:val="false"/>
         <w:bidi w:val="0"/>
         <w:spacing w:lineRule="auto" w:line="240" w:before="0" w:after="0"/>
         <w:jc w:val="both"/>
         <w:rPr>
-          <w:lang w:val="es-VE" w:eastAsia="zxx" w:bidi="zxx"/>
+          <w:lang w:val="es-VE"/>
         </w:rPr>
       </w:pPr>
       <w:r>
@@ -718,7 +718,7 @@
       <w:pPr>
         <w:pStyle w:val="Normal"/>
         <w:suppressAutoHyphens w:val="true"/>
-        <w:overflowPunct w:val="true"/>
+        <w:overflowPunct w:val="false"/>
         <w:bidi w:val="0"/>
         <w:spacing w:lineRule="auto" w:line="240" w:before="0" w:after="0"/>
         <w:jc w:val="both"/>
@@ -744,7 +744,7 @@
       <w:pPr>
         <w:pStyle w:val="Normal"/>
         <w:suppressAutoHyphens w:val="true"/>
-        <w:overflowPunct w:val="true"/>
+        <w:overflowPunct w:val="false"/>
         <w:bidi w:val="0"/>
         <w:spacing w:lineRule="auto" w:line="240" w:before="0" w:after="0"/>
         <w:jc w:val="both"/>
@@ -770,7 +770,7 @@
       <w:pPr>
         <w:pStyle w:val="Normal"/>
         <w:suppressAutoHyphens w:val="true"/>
-        <w:overflowPunct w:val="true"/>
+        <w:overflowPunct w:val="false"/>
         <w:bidi w:val="0"/>
         <w:spacing w:lineRule="auto" w:line="240" w:before="0" w:after="0"/>
         <w:jc w:val="both"/>
@@ -796,12 +796,12 @@
       <w:pPr>
         <w:pStyle w:val="Normal"/>
         <w:suppressAutoHyphens w:val="true"/>
-        <w:overflowPunct w:val="true"/>
+        <w:overflowPunct w:val="false"/>
         <w:bidi w:val="0"/>
         <w:spacing w:lineRule="auto" w:line="240" w:before="0" w:after="0"/>
         <w:jc w:val="left"/>
         <w:rPr>
-          <w:lang w:val="es-VE" w:eastAsia="zxx" w:bidi="zxx"/>
+          <w:lang w:val="es-VE"/>
         </w:rPr>
       </w:pPr>
       <w:r>
@@ -823,7 +823,7 @@
         <w:pStyle w:val="Graficos"/>
         <w:spacing w:lineRule="auto" w:line="240"/>
         <w:rPr>
-          <w:lang w:val="es-VE" w:eastAsia="zxx" w:bidi="zxx"/>
+          <w:lang w:val="es-VE"/>
         </w:rPr>
       </w:pPr>
       <w:bookmarkStart w:id="5" w:name="_Toc210586746"/>
@@ -897,7 +897,7 @@
         <w:ind w:left="0" w:right="4" w:hanging="0"/>
         <w:jc w:val="both"/>
         <w:rPr>
-          <w:lang w:val="es-VE" w:eastAsia="zxx" w:bidi="zxx"/>
+          <w:lang w:val="es-VE"/>
         </w:rPr>
       </w:pPr>
       <w:r>
@@ -919,7 +919,7 @@
         <w:ind w:left="0" w:right="4" w:firstLine="708"/>
         <w:jc w:val="both"/>
         <w:rPr>
-          <w:lang w:val="es-VE" w:eastAsia="zxx" w:bidi="zxx"/>
+          <w:lang w:val="es-VE"/>
         </w:rPr>
       </w:pPr>
       <w:r>
@@ -950,7 +950,7 @@
         <w:pStyle w:val="Graficos"/>
         <w:spacing w:lineRule="auto" w:line="240"/>
         <w:rPr>
-          <w:lang w:val="es-VE" w:eastAsia="zxx" w:bidi="zxx"/>
+          <w:lang w:val="es-VE"/>
         </w:rPr>
       </w:pPr>
       <w:bookmarkStart w:id="6" w:name="_Toc210586747"/>
@@ -1013,12 +1013,12 @@
       <w:pPr>
         <w:pStyle w:val="Normal"/>
         <w:suppressAutoHyphens w:val="true"/>
-        <w:overflowPunct w:val="true"/>
+        <w:overflowPunct w:val="false"/>
         <w:bidi w:val="0"/>
         <w:spacing w:lineRule="auto" w:line="240" w:before="0" w:after="0"/>
         <w:jc w:val="left"/>
         <w:rPr>
-          <w:lang w:val="es-VE" w:eastAsia="zxx" w:bidi="zxx"/>
+          <w:lang w:val="es-VE"/>
         </w:rPr>
       </w:pPr>
       <w:r>
@@ -1046,13 +1046,13 @@
       <w:pPr>
         <w:pStyle w:val="Normal"/>
         <w:suppressAutoHyphens w:val="true"/>
-        <w:overflowPunct w:val="true"/>
+        <w:overflowPunct w:val="false"/>
         <w:bidi w:val="0"/>
         <w:spacing w:lineRule="auto" w:line="240" w:before="0" w:after="0"/>
         <w:ind w:left="0" w:right="0" w:firstLine="360"/>
         <w:jc w:val="both"/>
         <w:rPr>
-          <w:lang w:val="es-VE" w:eastAsia="zxx" w:bidi="zxx"/>
+          <w:lang w:val="es-VE"/>
         </w:rPr>
       </w:pPr>
       <w:r>
@@ -1074,12 +1074,12 @@
           <w:numId w:val="3"/>
         </w:numPr>
         <w:suppressAutoHyphens w:val="true"/>
-        <w:overflowPunct w:val="true"/>
+        <w:overflowPunct w:val="false"/>
         <w:bidi w:val="0"/>
         <w:spacing w:lineRule="auto" w:line="240" w:before="0" w:after="0"/>
         <w:jc w:val="both"/>
         <w:rPr>
-          <w:lang w:val="es-VE" w:eastAsia="zxx" w:bidi="zxx"/>
+          <w:lang w:val="es-VE"/>
         </w:rPr>
       </w:pPr>
       <w:r>
@@ -1101,12 +1101,12 @@
           <w:numId w:val="3"/>
         </w:numPr>
         <w:suppressAutoHyphens w:val="true"/>
-        <w:overflowPunct w:val="true"/>
+        <w:overflowPunct w:val="false"/>
         <w:bidi w:val="0"/>
         <w:spacing w:lineRule="auto" w:line="240" w:before="0" w:after="0"/>
         <w:jc w:val="both"/>
         <w:rPr>
-          <w:lang w:val="es-VE" w:eastAsia="zxx" w:bidi="zxx"/>
+          <w:lang w:val="es-VE"/>
         </w:rPr>
       </w:pPr>
       <w:r>
@@ -1128,12 +1128,12 @@
           <w:numId w:val="3"/>
         </w:numPr>
         <w:suppressAutoHyphens w:val="true"/>
-        <w:overflowPunct w:val="true"/>
+        <w:overflowPunct w:val="false"/>
         <w:bidi w:val="0"/>
         <w:spacing w:lineRule="auto" w:line="240" w:before="0" w:after="0"/>
         <w:jc w:val="both"/>
         <w:rPr>
-          <w:lang w:val="es-VE" w:eastAsia="zxx" w:bidi="zxx"/>
+          <w:lang w:val="es-VE"/>
         </w:rPr>
       </w:pPr>
       <w:r>
@@ -1155,12 +1155,12 @@
           <w:numId w:val="3"/>
         </w:numPr>
         <w:suppressAutoHyphens w:val="true"/>
-        <w:overflowPunct w:val="true"/>
+        <w:overflowPunct w:val="false"/>
         <w:bidi w:val="0"/>
         <w:spacing w:lineRule="auto" w:line="240" w:before="0" w:after="0"/>
         <w:jc w:val="both"/>
         <w:rPr>
-          <w:lang w:val="es-VE" w:eastAsia="zxx" w:bidi="zxx"/>
+          <w:lang w:val="es-VE"/>
         </w:rPr>
       </w:pPr>
       <w:r>
@@ -1178,7 +1178,7 @@
       <w:pPr>
         <w:pStyle w:val="Normal"/>
         <w:suppressAutoHyphens w:val="true"/>
-        <w:overflowPunct w:val="true"/>
+        <w:overflowPunct w:val="false"/>
         <w:bidi w:val="0"/>
         <w:spacing w:lineRule="auto" w:line="240" w:before="0" w:after="0"/>
         <w:jc w:val="left"/>
@@ -1211,7 +1211,7 @@
       <w:pPr>
         <w:pStyle w:val="Normal"/>
         <w:suppressAutoHyphens w:val="true"/>
-        <w:overflowPunct w:val="true"/>
+        <w:overflowPunct w:val="false"/>
         <w:bidi w:val="0"/>
         <w:spacing w:lineRule="auto" w:line="240" w:before="0" w:after="0"/>
         <w:jc w:val="left"/>
@@ -1244,7 +1244,7 @@
       <w:pPr>
         <w:pStyle w:val="Normal"/>
         <w:suppressAutoHyphens w:val="true"/>
-        <w:overflowPunct w:val="true"/>
+        <w:overflowPunct w:val="false"/>
         <w:bidi w:val="0"/>
         <w:spacing w:lineRule="auto" w:line="240" w:before="0" w:after="0"/>
         <w:jc w:val="left"/>
@@ -1277,7 +1277,7 @@
       <w:pPr>
         <w:pStyle w:val="Normal"/>
         <w:suppressAutoHyphens w:val="true"/>
-        <w:overflowPunct w:val="true"/>
+        <w:overflowPunct w:val="false"/>
         <w:bidi w:val="0"/>
         <w:spacing w:lineRule="auto" w:line="240" w:before="0" w:after="0"/>
         <w:jc w:val="left"/>
@@ -1310,7 +1310,7 @@
       <w:pPr>
         <w:pStyle w:val="Normal"/>
         <w:suppressAutoHyphens w:val="true"/>
-        <w:overflowPunct w:val="true"/>
+        <w:overflowPunct w:val="false"/>
         <w:bidi w:val="0"/>
         <w:spacing w:lineRule="auto" w:line="240" w:before="0" w:after="0"/>
         <w:jc w:val="left"/>
@@ -1343,7 +1343,7 @@
       <w:pPr>
         <w:pStyle w:val="Normal"/>
         <w:suppressAutoHyphens w:val="true"/>
-        <w:overflowPunct w:val="true"/>
+        <w:overflowPunct w:val="false"/>
         <w:bidi w:val="0"/>
         <w:spacing w:lineRule="auto" w:line="240" w:before="0" w:after="0"/>
         <w:jc w:val="left"/>
@@ -1376,7 +1376,7 @@
       <w:pPr>
         <w:pStyle w:val="Normal"/>
         <w:suppressAutoHyphens w:val="true"/>
-        <w:overflowPunct w:val="true"/>
+        <w:overflowPunct w:val="false"/>
         <w:bidi w:val="0"/>
         <w:spacing w:lineRule="auto" w:line="240" w:before="0" w:after="0"/>
         <w:jc w:val="left"/>
@@ -1409,7 +1409,7 @@
       <w:pPr>
         <w:pStyle w:val="Normal"/>
         <w:suppressAutoHyphens w:val="true"/>
-        <w:overflowPunct w:val="true"/>
+        <w:overflowPunct w:val="false"/>
         <w:bidi w:val="0"/>
         <w:spacing w:lineRule="auto" w:line="240" w:before="0" w:after="0"/>
         <w:jc w:val="left"/>
@@ -1442,7 +1442,7 @@
       <w:pPr>
         <w:pStyle w:val="Normal"/>
         <w:suppressAutoHyphens w:val="true"/>
-        <w:overflowPunct w:val="true"/>
+        <w:overflowPunct w:val="false"/>
         <w:bidi w:val="0"/>
         <w:spacing w:lineRule="auto" w:line="240" w:before="0" w:after="0"/>
         <w:jc w:val="left"/>
@@ -1476,7 +1476,7 @@
         <w:pStyle w:val="Graficos"/>
         <w:spacing w:lineRule="auto" w:line="240"/>
         <w:rPr>
-          <w:lang w:val="es-VE" w:eastAsia="zxx" w:bidi="zxx"/>
+          <w:lang w:val="es-VE"/>
         </w:rPr>
       </w:pPr>
       <w:bookmarkStart w:id="7" w:name="_Toc210586748"/>
@@ -1539,12 +1539,12 @@
       <w:pPr>
         <w:pStyle w:val="Normal"/>
         <w:suppressAutoHyphens w:val="true"/>
-        <w:overflowPunct w:val="true"/>
+        <w:overflowPunct w:val="false"/>
         <w:bidi w:val="0"/>
         <w:spacing w:lineRule="auto" w:line="240" w:before="0" w:after="0"/>
         <w:jc w:val="left"/>
         <w:rPr>
-          <w:lang w:val="es-VE" w:eastAsia="zxx" w:bidi="zxx"/>
+          <w:lang w:val="es-VE"/>
         </w:rPr>
       </w:pPr>
       <w:r>
@@ -1562,7 +1562,7 @@
       <w:pPr>
         <w:pStyle w:val="Normal"/>
         <w:suppressAutoHyphens w:val="true"/>
-        <w:overflowPunct w:val="true"/>
+        <w:overflowPunct w:val="false"/>
         <w:bidi w:val="0"/>
         <w:spacing w:lineRule="auto" w:line="240" w:before="0" w:after="0"/>
         <w:jc w:val="left"/>
@@ -1588,7 +1588,7 @@
       <w:pPr>
         <w:pStyle w:val="Normal"/>
         <w:suppressAutoHyphens w:val="true"/>
-        <w:overflowPunct w:val="true"/>
+        <w:overflowPunct w:val="false"/>
         <w:bidi w:val="0"/>
         <w:spacing w:lineRule="auto" w:line="240" w:before="0" w:after="0"/>
         <w:jc w:val="left"/>
@@ -1665,7 +1665,7 @@
         <w:pStyle w:val="Graficos"/>
         <w:spacing w:lineRule="auto" w:line="240"/>
         <w:rPr>
-          <w:lang w:val="es-VE" w:eastAsia="zxx" w:bidi="zxx"/>
+          <w:lang w:val="es-VE"/>
         </w:rPr>
       </w:pPr>
       <w:bookmarkStart w:id="8" w:name="_Toc210586749"/>
@@ -1681,12 +1681,12 @@
       <w:pPr>
         <w:pStyle w:val="Normal"/>
         <w:suppressAutoHyphens w:val="true"/>
-        <w:overflowPunct w:val="true"/>
+        <w:overflowPunct w:val="false"/>
         <w:bidi w:val="0"/>
         <w:spacing w:lineRule="auto" w:line="240" w:before="0" w:after="0"/>
         <w:jc w:val="left"/>
         <w:rPr>
-          <w:lang w:val="es-VE" w:eastAsia="zxx" w:bidi="zxx"/>
+          <w:lang w:val="es-VE"/>
         </w:rPr>
       </w:pPr>
       <w:r>
@@ -1704,7 +1704,7 @@
       <w:pPr>
         <w:pStyle w:val="Normal"/>
         <w:suppressAutoHyphens w:val="true"/>
-        <w:overflowPunct w:val="true"/>
+        <w:overflowPunct w:val="false"/>
         <w:bidi w:val="0"/>
         <w:spacing w:lineRule="auto" w:line="240" w:before="0" w:after="0"/>
         <w:jc w:val="left"/>
@@ -1730,13 +1730,13 @@
       <w:pPr>
         <w:pStyle w:val="Normal"/>
         <w:suppressAutoHyphens w:val="true"/>
-        <w:overflowPunct w:val="true"/>
+        <w:overflowPunct w:val="false"/>
         <w:bidi w:val="0"/>
         <w:spacing w:lineRule="auto" w:line="240" w:before="0" w:after="140"/>
         <w:ind w:left="0" w:right="0" w:firstLine="708"/>
         <w:jc w:val="both"/>
         <w:rPr>
-          <w:lang w:val="es-VE" w:eastAsia="zxx" w:bidi="zxx"/>
+          <w:lang w:val="es-VE"/>
         </w:rPr>
       </w:pPr>
       <w:r>
@@ -1758,7 +1758,7 @@
         <w:spacing w:lineRule="auto" w:line="240"/>
         <w:jc w:val="left"/>
         <w:rPr>
-          <w:lang w:val="es-VE" w:eastAsia="zxx" w:bidi="zxx"/>
+          <w:lang w:val="es-VE"/>
         </w:rPr>
       </w:pPr>
       <w:r>
@@ -1790,12 +1790,12 @@
           <w:tab w:val="left" w:pos="0" w:leader="none"/>
         </w:tabs>
         <w:suppressAutoHyphens w:val="true"/>
-        <w:overflowPunct w:val="true"/>
+        <w:overflowPunct w:val="false"/>
         <w:bidi w:val="0"/>
         <w:spacing w:lineRule="auto" w:line="240" w:before="0" w:after="140"/>
         <w:jc w:val="both"/>
         <w:rPr>
-          <w:lang w:val="es-VE" w:eastAsia="zxx" w:bidi="zxx"/>
+          <w:lang w:val="es-VE"/>
         </w:rPr>
       </w:pPr>
       <w:r>
@@ -1821,12 +1821,12 @@
           <w:tab w:val="left" w:pos="0" w:leader="none"/>
         </w:tabs>
         <w:suppressAutoHyphens w:val="true"/>
-        <w:overflowPunct w:val="true"/>
+        <w:overflowPunct w:val="false"/>
         <w:bidi w:val="0"/>
         <w:spacing w:lineRule="auto" w:line="240" w:before="0" w:after="140"/>
         <w:jc w:val="both"/>
         <w:rPr>
-          <w:lang w:val="es-VE" w:eastAsia="zxx" w:bidi="zxx"/>
+          <w:lang w:val="es-VE"/>
         </w:rPr>
       </w:pPr>
       <w:r>
@@ -1852,12 +1852,12 @@
           <w:tab w:val="left" w:pos="0" w:leader="none"/>
         </w:tabs>
         <w:suppressAutoHyphens w:val="true"/>
-        <w:overflowPunct w:val="true"/>
+        <w:overflowPunct w:val="false"/>
         <w:bidi w:val="0"/>
         <w:spacing w:lineRule="auto" w:line="240" w:before="0" w:after="140"/>
         <w:jc w:val="both"/>
         <w:rPr>
-          <w:lang w:val="es-VE" w:eastAsia="zxx" w:bidi="zxx"/>
+          <w:lang w:val="es-VE"/>
         </w:rPr>
       </w:pPr>
       <w:r>
@@ -1883,12 +1883,12 @@
           <w:tab w:val="left" w:pos="0" w:leader="none"/>
         </w:tabs>
         <w:suppressAutoHyphens w:val="true"/>
-        <w:overflowPunct w:val="true"/>
+        <w:overflowPunct w:val="false"/>
         <w:bidi w:val="0"/>
         <w:spacing w:lineRule="auto" w:line="240" w:before="0" w:after="140"/>
         <w:jc w:val="both"/>
         <w:rPr>
-          <w:lang w:val="es-VE" w:eastAsia="zxx" w:bidi="zxx"/>
+          <w:lang w:val="es-VE"/>
         </w:rPr>
       </w:pPr>
       <w:r>
@@ -1910,7 +1910,7 @@
           <w:tab w:val="left" w:pos="0" w:leader="none"/>
         </w:tabs>
         <w:suppressAutoHyphens w:val="true"/>
-        <w:overflowPunct w:val="true"/>
+        <w:overflowPunct w:val="false"/>
         <w:bidi w:val="0"/>
         <w:spacing w:lineRule="auto" w:line="240" w:before="0" w:after="140"/>
         <w:jc w:val="both"/>
@@ -1982,7 +1982,7 @@
         <w:pStyle w:val="Graficos"/>
         <w:spacing w:lineRule="auto" w:line="240"/>
         <w:rPr>
-          <w:lang w:val="es-VE" w:eastAsia="zxx" w:bidi="zxx"/>
+          <w:lang w:val="es-VE"/>
         </w:rPr>
       </w:pPr>
       <w:bookmarkStart w:id="9" w:name="_Toc210586750"/>
@@ -1998,12 +1998,12 @@
       <w:pPr>
         <w:pStyle w:val="Normal"/>
         <w:suppressAutoHyphens w:val="true"/>
-        <w:overflowPunct w:val="true"/>
+        <w:overflowPunct w:val="false"/>
         <w:bidi w:val="0"/>
         <w:spacing w:lineRule="auto" w:line="240" w:before="0" w:after="0"/>
         <w:jc w:val="left"/>
         <w:rPr>
-          <w:lang w:val="es-VE" w:eastAsia="zxx" w:bidi="zxx"/>
+          <w:lang w:val="es-VE"/>
         </w:rPr>
       </w:pPr>
       <w:r>
@@ -2022,7 +2022,7 @@
       <w:pPr>
         <w:pStyle w:val="Normal"/>
         <w:suppressAutoHyphens w:val="true"/>
-        <w:overflowPunct w:val="true"/>
+        <w:overflowPunct w:val="false"/>
         <w:bidi w:val="0"/>
         <w:spacing w:lineRule="auto" w:line="240" w:before="0" w:after="0"/>
         <w:jc w:val="left"/>
@@ -2050,13 +2050,13 @@
       <w:pPr>
         <w:pStyle w:val="Normal"/>
         <w:suppressAutoHyphens w:val="true"/>
-        <w:overflowPunct w:val="true"/>
+        <w:overflowPunct w:val="false"/>
         <w:bidi w:val="0"/>
         <w:spacing w:lineRule="auto" w:line="240" w:before="0" w:after="140"/>
         <w:ind w:left="0" w:right="0" w:firstLine="708"/>
         <w:jc w:val="both"/>
         <w:rPr>
-          <w:lang w:val="es-VE" w:eastAsia="zxx" w:bidi="zxx"/>
+          <w:lang w:val="es-VE"/>
         </w:rPr>
       </w:pPr>
       <w:r>
@@ -2086,7 +2086,7 @@
         <w:pStyle w:val="Graficos"/>
         <w:spacing w:lineRule="auto" w:line="240"/>
         <w:rPr>
-          <w:lang w:val="es-VE" w:eastAsia="zxx" w:bidi="zxx"/>
+          <w:lang w:val="es-VE"/>
         </w:rPr>
       </w:pPr>
       <w:bookmarkStart w:id="10" w:name="_Toc210586751"/>
@@ -2149,12 +2149,12 @@
       <w:pPr>
         <w:pStyle w:val="Normal"/>
         <w:suppressAutoHyphens w:val="true"/>
-        <w:overflowPunct w:val="true"/>
+        <w:overflowPunct w:val="false"/>
         <w:bidi w:val="0"/>
         <w:spacing w:lineRule="auto" w:line="240" w:before="0" w:after="0"/>
         <w:jc w:val="left"/>
         <w:rPr>
-          <w:lang w:val="es-VE" w:eastAsia="zxx" w:bidi="zxx"/>
+          <w:lang w:val="es-VE"/>
         </w:rPr>
       </w:pPr>
       <w:r>
@@ -2173,13 +2173,13 @@
       <w:pPr>
         <w:pStyle w:val="Normal"/>
         <w:suppressAutoHyphens w:val="true"/>
-        <w:overflowPunct w:val="true"/>
+        <w:overflowPunct w:val="false"/>
         <w:bidi w:val="0"/>
         <w:spacing w:lineRule="auto" w:line="240" w:before="0" w:after="140"/>
         <w:ind w:left="0" w:right="0" w:firstLine="426"/>
         <w:jc w:val="left"/>
         <w:rPr>
-          <w:lang w:val="es-VE" w:eastAsia="zxx" w:bidi="zxx"/>
+          <w:lang w:val="es-VE"/>
         </w:rPr>
       </w:pPr>
       <w:r>
@@ -2206,12 +2206,12 @@
           <w:tab w:val="left" w:pos="0" w:leader="none"/>
         </w:tabs>
         <w:suppressAutoHyphens w:val="true"/>
-        <w:overflowPunct w:val="true"/>
+        <w:overflowPunct w:val="false"/>
         <w:bidi w:val="0"/>
         <w:spacing w:lineRule="auto" w:line="240" w:before="0" w:after="140"/>
         <w:jc w:val="left"/>
         <w:rPr>
-          <w:lang w:val="es-VE" w:eastAsia="zxx" w:bidi="zxx"/>
+          <w:lang w:val="es-VE"/>
         </w:rPr>
       </w:pPr>
       <w:r>
@@ -2237,12 +2237,12 @@
           <w:tab w:val="left" w:pos="0" w:leader="none"/>
         </w:tabs>
         <w:suppressAutoHyphens w:val="true"/>
-        <w:overflowPunct w:val="true"/>
+        <w:overflowPunct w:val="false"/>
         <w:bidi w:val="0"/>
         <w:spacing w:lineRule="auto" w:line="240" w:before="0" w:after="140"/>
         <w:jc w:val="left"/>
         <w:rPr>
-          <w:lang w:val="es-VE" w:eastAsia="zxx" w:bidi="zxx"/>
+          <w:lang w:val="es-VE"/>
         </w:rPr>
       </w:pPr>
       <w:r>
@@ -2268,12 +2268,12 @@
           <w:tab w:val="left" w:pos="0" w:leader="none"/>
         </w:tabs>
         <w:suppressAutoHyphens w:val="true"/>
-        <w:overflowPunct w:val="true"/>
+        <w:overflowPunct w:val="false"/>
         <w:bidi w:val="0"/>
         <w:spacing w:lineRule="auto" w:line="240" w:before="0" w:after="140"/>
         <w:jc w:val="left"/>
         <w:rPr>
-          <w:lang w:val="es-VE" w:eastAsia="zxx" w:bidi="zxx"/>
+          <w:lang w:val="es-VE"/>
         </w:rPr>
       </w:pPr>
       <w:r>
@@ -2299,12 +2299,12 @@
           <w:tab w:val="left" w:pos="0" w:leader="none"/>
         </w:tabs>
         <w:suppressAutoHyphens w:val="true"/>
-        <w:overflowPunct w:val="true"/>
+        <w:overflowPunct w:val="false"/>
         <w:bidi w:val="0"/>
         <w:spacing w:lineRule="auto" w:line="240" w:before="0" w:after="140"/>
         <w:jc w:val="left"/>
         <w:rPr>
-          <w:lang w:val="es-VE" w:eastAsia="zxx" w:bidi="zxx"/>
+          <w:lang w:val="es-VE"/>
         </w:rPr>
       </w:pPr>
       <w:r>
@@ -2322,7 +2322,7 @@
       <w:pPr>
         <w:pStyle w:val="Normal"/>
         <w:suppressAutoHyphens w:val="true"/>
-        <w:overflowPunct w:val="true"/>
+        <w:overflowPunct w:val="false"/>
         <w:bidi w:val="0"/>
         <w:spacing w:lineRule="auto" w:line="240" w:before="0" w:after="0"/>
         <w:jc w:val="left"/>
@@ -2348,7 +2348,7 @@
       <w:pPr>
         <w:pStyle w:val="Normal"/>
         <w:suppressAutoHyphens w:val="true"/>
-        <w:overflowPunct w:val="true"/>
+        <w:overflowPunct w:val="false"/>
         <w:bidi w:val="0"/>
         <w:spacing w:lineRule="auto" w:line="240" w:before="240" w:after="0"/>
         <w:jc w:val="left"/>
@@ -2411,7 +2411,7 @@
       <w:pPr>
         <w:pStyle w:val="Normal"/>
         <w:suppressAutoHyphens w:val="true"/>
-        <w:overflowPunct w:val="true"/>
+        <w:overflowPunct w:val="false"/>
         <w:bidi w:val="0"/>
         <w:spacing w:lineRule="auto" w:line="240" w:before="240" w:after="0"/>
         <w:jc w:val="left"/>
@@ -2443,12 +2443,12 @@
       <w:pPr>
         <w:pStyle w:val="Normal"/>
         <w:suppressAutoHyphens w:val="true"/>
-        <w:overflowPunct w:val="true"/>
+        <w:overflowPunct w:val="false"/>
         <w:bidi w:val="0"/>
         <w:spacing w:lineRule="auto" w:line="240" w:before="0" w:after="0"/>
         <w:jc w:val="left"/>
         <w:rPr>
-          <w:lang w:val="es-VE" w:eastAsia="zxx" w:bidi="zxx"/>
+          <w:lang w:val="es-VE"/>
         </w:rPr>
       </w:pPr>
       <w:r>
@@ -2467,7 +2467,7 @@
       <w:pPr>
         <w:pStyle w:val="Normal"/>
         <w:suppressAutoHyphens w:val="true"/>
-        <w:overflowPunct w:val="true"/>
+        <w:overflowPunct w:val="false"/>
         <w:bidi w:val="0"/>
         <w:spacing w:lineRule="auto" w:line="240" w:before="0" w:after="0"/>
         <w:jc w:val="left"/>
@@ -2493,13 +2493,13 @@
       <w:pPr>
         <w:pStyle w:val="Normal"/>
         <w:suppressAutoHyphens w:val="true"/>
-        <w:overflowPunct w:val="true"/>
+        <w:overflowPunct w:val="false"/>
         <w:bidi w:val="0"/>
         <w:spacing w:lineRule="auto" w:line="240" w:before="0" w:after="140"/>
         <w:ind w:left="0" w:right="0" w:firstLine="360"/>
         <w:jc w:val="both"/>
         <w:rPr>
-          <w:lang w:val="es-VE" w:eastAsia="zxx" w:bidi="zxx"/>
+          <w:lang w:val="es-VE"/>
         </w:rPr>
       </w:pPr>
       <w:r>
@@ -2522,12 +2522,12 @@
           <w:numId w:val="6"/>
         </w:numPr>
         <w:suppressAutoHyphens w:val="true"/>
-        <w:overflowPunct w:val="true"/>
+        <w:overflowPunct w:val="false"/>
         <w:bidi w:val="0"/>
         <w:spacing w:lineRule="auto" w:line="240" w:before="0" w:after="140"/>
         <w:jc w:val="both"/>
         <w:rPr>
-          <w:lang w:val="es-VE" w:eastAsia="zxx" w:bidi="zxx"/>
+          <w:lang w:val="es-VE"/>
         </w:rPr>
       </w:pPr>
       <w:r>
@@ -2549,12 +2549,12 @@
           <w:numId w:val="6"/>
         </w:numPr>
         <w:suppressAutoHyphens w:val="true"/>
-        <w:overflowPunct w:val="true"/>
+        <w:overflowPunct w:val="false"/>
         <w:bidi w:val="0"/>
         <w:spacing w:lineRule="auto" w:line="240" w:before="0" w:after="140"/>
         <w:jc w:val="both"/>
         <w:rPr>
-          <w:lang w:val="es-VE" w:eastAsia="zxx" w:bidi="zxx"/>
+          <w:lang w:val="es-VE"/>
         </w:rPr>
       </w:pPr>
       <w:r>
@@ -2576,12 +2576,12 @@
           <w:numId w:val="6"/>
         </w:numPr>
         <w:suppressAutoHyphens w:val="true"/>
-        <w:overflowPunct w:val="true"/>
+        <w:overflowPunct w:val="false"/>
         <w:bidi w:val="0"/>
         <w:spacing w:lineRule="auto" w:line="240" w:before="0" w:after="140"/>
         <w:jc w:val="both"/>
         <w:rPr>
-          <w:lang w:val="es-VE" w:eastAsia="zxx" w:bidi="zxx"/>
+          <w:lang w:val="es-VE"/>
         </w:rPr>
       </w:pPr>
       <w:r>
@@ -2603,12 +2603,12 @@
           <w:numId w:val="6"/>
         </w:numPr>
         <w:suppressAutoHyphens w:val="true"/>
-        <w:overflowPunct w:val="true"/>
+        <w:overflowPunct w:val="false"/>
         <w:bidi w:val="0"/>
         <w:spacing w:lineRule="auto" w:line="240" w:before="0" w:after="140"/>
         <w:jc w:val="both"/>
         <w:rPr>
-          <w:lang w:val="es-VE" w:eastAsia="zxx" w:bidi="zxx"/>
+          <w:lang w:val="es-VE"/>
         </w:rPr>
       </w:pPr>
       <w:r>
@@ -2630,12 +2630,12 @@
           <w:numId w:val="6"/>
         </w:numPr>
         <w:suppressAutoHyphens w:val="true"/>
-        <w:overflowPunct w:val="true"/>
+        <w:overflowPunct w:val="false"/>
         <w:bidi w:val="0"/>
         <w:spacing w:lineRule="auto" w:line="240" w:before="0" w:after="140"/>
         <w:jc w:val="both"/>
         <w:rPr>
-          <w:lang w:val="es-VE" w:eastAsia="zxx" w:bidi="zxx"/>
+          <w:lang w:val="es-VE"/>
         </w:rPr>
       </w:pPr>
       <w:r>
@@ -2653,7 +2653,7 @@
       <w:pPr>
         <w:pStyle w:val="Normal"/>
         <w:suppressAutoHyphens w:val="true"/>
-        <w:overflowPunct w:val="true"/>
+        <w:overflowPunct w:val="false"/>
         <w:bidi w:val="0"/>
         <w:spacing w:lineRule="auto" w:line="240" w:before="0" w:after="140"/>
         <w:jc w:val="both"/>
@@ -2683,7 +2683,7 @@
         <w:ind w:left="0" w:hanging="0"/>
         <w:jc w:val="left"/>
         <w:rPr>
-          <w:lang w:val="es-VE" w:eastAsia="zxx" w:bidi="zxx"/>
+          <w:lang w:val="es-VE"/>
         </w:rPr>
       </w:pPr>
       <w:r>
@@ -2815,7 +2815,7 @@
         <w:spacing w:lineRule="auto" w:line="240"/>
         <w:jc w:val="left"/>
         <w:rPr>
-          <w:lang w:val="es-VE" w:eastAsia="zxx" w:bidi="zxx"/>
+          <w:lang w:val="es-VE"/>
         </w:rPr>
       </w:pPr>
       <w:r>
@@ -2832,7 +2832,7 @@
         <w:spacing w:lineRule="auto" w:line="240"/>
         <w:jc w:val="left"/>
         <w:rPr>
-          <w:lang w:val="es-VE" w:eastAsia="zxx" w:bidi="zxx"/>
+          <w:lang w:val="es-VE"/>
         </w:rPr>
       </w:pPr>
       <w:r>
@@ -2911,7 +2911,7 @@
         <w:ind w:left="709" w:hanging="283"/>
         <w:jc w:val="left"/>
         <w:rPr>
-          <w:lang w:val="es-VE" w:eastAsia="zxx" w:bidi="zxx"/>
+          <w:lang w:val="es-VE"/>
         </w:rPr>
       </w:pPr>
       <w:r>
@@ -2944,7 +2944,7 @@
         <w:spacing w:lineRule="auto" w:line="240"/>
         <w:jc w:val="left"/>
         <w:rPr>
-          <w:lang w:val="es-VE" w:eastAsia="zxx" w:bidi="zxx"/>
+          <w:lang w:val="es-VE"/>
         </w:rPr>
       </w:pPr>
       <w:r>
@@ -3005,7 +3005,7 @@
         <w:ind w:left="709" w:hanging="283"/>
         <w:jc w:val="left"/>
         <w:rPr>
-          <w:lang w:val="es-VE" w:eastAsia="zxx" w:bidi="zxx"/>
+          <w:lang w:val="es-VE"/>
         </w:rPr>
       </w:pPr>
       <w:r>
@@ -3182,7 +3182,7 @@
         <w:spacing w:lineRule="auto" w:line="240"/>
         <w:jc w:val="left"/>
         <w:rPr>
-          <w:lang w:val="es-VE" w:eastAsia="zxx" w:bidi="zxx"/>
+          <w:lang w:val="es-VE"/>
         </w:rPr>
       </w:pPr>
       <w:r>
@@ -3285,7 +3285,7 @@
         <w:ind w:left="709" w:hanging="283"/>
         <w:jc w:val="left"/>
         <w:rPr>
-          <w:lang w:val="es-VE" w:eastAsia="zxx" w:bidi="zxx"/>
+          <w:lang w:val="es-VE"/>
         </w:rPr>
       </w:pPr>
       <w:r>
@@ -3309,7 +3309,7 @@
         <w:ind w:left="0" w:hanging="0"/>
         <w:jc w:val="left"/>
         <w:rPr>
-          <w:lang w:val="es-VE" w:eastAsia="zxx" w:bidi="zxx"/>
+          <w:lang w:val="es-VE"/>
         </w:rPr>
       </w:pPr>
       <w:r>
@@ -3387,7 +3387,7 @@
         <w:spacing w:lineRule="auto" w:line="240"/>
         <w:jc w:val="left"/>
         <w:rPr>
-          <w:lang w:val="es-VE" w:eastAsia="zxx" w:bidi="zxx"/>
+          <w:lang w:val="es-VE"/>
         </w:rPr>
       </w:pPr>
       <w:r>
@@ -3520,7 +3520,7 @@
         <w:ind w:left="709" w:hanging="283"/>
         <w:jc w:val="left"/>
         <w:rPr>
-          <w:lang w:val="es-VE" w:eastAsia="zxx" w:bidi="zxx"/>
+          <w:lang w:val="es-VE"/>
         </w:rPr>
       </w:pPr>
       <w:r>
@@ -3546,7 +3546,7 @@
         <w:ind w:left="1418" w:hanging="283"/>
         <w:jc w:val="left"/>
         <w:rPr>
-          <w:lang w:val="es-VE" w:eastAsia="zxx" w:bidi="zxx"/>
+          <w:lang w:val="es-VE"/>
         </w:rPr>
       </w:pPr>
       <w:r>
@@ -3572,7 +3572,7 @@
         <w:ind w:left="1418" w:hanging="283"/>
         <w:jc w:val="left"/>
         <w:rPr>
-          <w:lang w:val="es-VE" w:eastAsia="zxx" w:bidi="zxx"/>
+          <w:lang w:val="es-VE"/>
         </w:rPr>
       </w:pPr>
       <w:r>
@@ -3598,7 +3598,7 @@
         <w:ind w:left="1418" w:hanging="283"/>
         <w:jc w:val="left"/>
         <w:rPr>
-          <w:lang w:val="es-VE" w:eastAsia="zxx" w:bidi="zxx"/>
+          <w:lang w:val="es-VE"/>
         </w:rPr>
       </w:pPr>
       <w:r>
@@ -3624,7 +3624,7 @@
         <w:ind w:left="1418" w:hanging="283"/>
         <w:jc w:val="left"/>
         <w:rPr>
-          <w:lang w:val="es-VE" w:eastAsia="zxx" w:bidi="zxx"/>
+          <w:lang w:val="es-VE"/>
         </w:rPr>
       </w:pPr>
       <w:r>
@@ -3650,7 +3650,7 @@
         <w:ind w:left="1418" w:hanging="283"/>
         <w:jc w:val="left"/>
         <w:rPr>
-          <w:lang w:val="es-VE" w:eastAsia="zxx" w:bidi="zxx"/>
+          <w:lang w:val="es-VE"/>
         </w:rPr>
       </w:pPr>
       <w:r>
@@ -3667,7 +3667,7 @@
         <w:spacing w:lineRule="auto" w:line="240"/>
         <w:jc w:val="left"/>
         <w:rPr>
-          <w:lang w:val="es-VE" w:eastAsia="zxx" w:bidi="zxx"/>
+          <w:lang w:val="es-VE"/>
         </w:rPr>
       </w:pPr>
       <w:r>
@@ -3684,7 +3684,7 @@
         <w:spacing w:lineRule="auto" w:line="240"/>
         <w:jc w:val="left"/>
         <w:rPr>
-          <w:lang w:val="es-VE" w:eastAsia="zxx" w:bidi="zxx"/>
+          <w:lang w:val="es-VE"/>
         </w:rPr>
       </w:pPr>
       <w:r>
@@ -3745,7 +3745,7 @@
         <w:ind w:left="709" w:hanging="283"/>
         <w:jc w:val="left"/>
         <w:rPr>
-          <w:lang w:val="es-VE" w:eastAsia="zxx" w:bidi="zxx"/>
+          <w:lang w:val="es-VE"/>
         </w:rPr>
       </w:pPr>
       <w:r>
@@ -3814,7 +3814,7 @@
         <w:spacing w:lineRule="auto" w:line="240"/>
         <w:jc w:val="left"/>
         <w:rPr>
-          <w:lang w:val="es-VE" w:eastAsia="zxx" w:bidi="zxx"/>
+          <w:lang w:val="es-VE"/>
         </w:rPr>
       </w:pPr>
       <w:r>
@@ -4061,7 +4061,7 @@
         <w:ind w:left="1418" w:hanging="283"/>
         <w:jc w:val="left"/>
         <w:rPr>
-          <w:lang w:val="es-VE" w:eastAsia="zxx" w:bidi="zxx"/>
+          <w:lang w:val="es-VE"/>
         </w:rPr>
       </w:pPr>
       <w:r>
@@ -4087,7 +4087,7 @@
         <w:ind w:left="1418" w:hanging="283"/>
         <w:jc w:val="left"/>
         <w:rPr>
-          <w:lang w:val="es-VE" w:eastAsia="zxx" w:bidi="zxx"/>
+          <w:lang w:val="es-VE"/>
         </w:rPr>
       </w:pPr>
       <w:r>
@@ -4104,7 +4104,7 @@
         <w:spacing w:lineRule="auto" w:line="240"/>
         <w:jc w:val="left"/>
         <w:rPr>
-          <w:lang w:val="es-VE" w:eastAsia="zxx" w:bidi="zxx"/>
+          <w:lang w:val="es-VE"/>
         </w:rPr>
       </w:pPr>
       <w:r>
@@ -4213,7 +4213,7 @@
         <w:ind w:left="709" w:hanging="283"/>
         <w:jc w:val="left"/>
         <w:rPr>
-          <w:lang w:val="es-VE" w:eastAsia="zxx" w:bidi="zxx"/>
+          <w:lang w:val="es-VE"/>
         </w:rPr>
       </w:pPr>
       <w:r>
@@ -4258,7 +4258,7 @@
         <w:ind w:left="0" w:hanging="0"/>
         <w:jc w:val="left"/>
         <w:rPr>
-          <w:lang w:val="es-VE" w:eastAsia="zxx" w:bidi="zxx"/>
+          <w:lang w:val="es-VE"/>
         </w:rPr>
       </w:pPr>
       <w:r>
@@ -4277,7 +4277,7 @@
         <w:spacing w:lineRule="auto" w:line="240"/>
         <w:jc w:val="left"/>
         <w:rPr>
-          <w:lang w:val="es-VE" w:eastAsia="zxx" w:bidi="zxx"/>
+          <w:lang w:val="es-VE"/>
         </w:rPr>
       </w:pPr>
       <w:r>
@@ -4310,7 +4310,7 @@
         <w:spacing w:lineRule="auto" w:line="240"/>
         <w:jc w:val="left"/>
         <w:rPr>
-          <w:lang w:val="es-VE" w:eastAsia="zxx" w:bidi="zxx"/>
+          <w:lang w:val="es-VE"/>
         </w:rPr>
       </w:pPr>
       <w:r>
@@ -4327,7 +4327,7 @@
         <w:spacing w:lineRule="auto" w:line="240"/>
         <w:jc w:val="left"/>
         <w:rPr>
-          <w:lang w:val="es-VE" w:eastAsia="zxx" w:bidi="zxx"/>
+          <w:lang w:val="es-VE"/>
         </w:rPr>
       </w:pPr>
       <w:r>
@@ -4428,7 +4428,7 @@
         <w:spacing w:lineRule="auto" w:line="240"/>
         <w:jc w:val="left"/>
         <w:rPr>
-          <w:lang w:val="es-VE" w:eastAsia="zxx" w:bidi="zxx"/>
+          <w:lang w:val="es-VE"/>
         </w:rPr>
       </w:pPr>
       <w:r>
@@ -4445,7 +4445,7 @@
         <w:spacing w:lineRule="auto" w:line="240"/>
         <w:jc w:val="left"/>
         <w:rPr>
-          <w:lang w:val="es-VE" w:eastAsia="zxx" w:bidi="zxx"/>
+          <w:lang w:val="es-VE"/>
         </w:rPr>
       </w:pPr>
       <w:r>
@@ -4470,7 +4470,7 @@
         <w:ind w:left="709" w:hanging="283"/>
         <w:jc w:val="left"/>
         <w:rPr>
-          <w:lang w:val="es-VE" w:eastAsia="zxx" w:bidi="zxx"/>
+          <w:lang w:val="es-VE"/>
         </w:rPr>
       </w:pPr>
       <w:r>
@@ -4495,7 +4495,7 @@
         <w:ind w:left="709" w:hanging="283"/>
         <w:jc w:val="left"/>
         <w:rPr>
-          <w:lang w:val="es-VE" w:eastAsia="zxx" w:bidi="zxx"/>
+          <w:lang w:val="es-VE"/>
         </w:rPr>
       </w:pPr>
       <w:r>
@@ -4544,7 +4544,7 @@
         <w:spacing w:lineRule="auto" w:line="240"/>
         <w:jc w:val="left"/>
         <w:rPr>
-          <w:lang w:val="es-VE" w:eastAsia="zxx" w:bidi="zxx"/>
+          <w:lang w:val="es-VE"/>
         </w:rPr>
       </w:pPr>
       <w:r>
@@ -4600,7 +4600,7 @@
         <w:ind w:left="709" w:hanging="283"/>
         <w:jc w:val="left"/>
         <w:rPr>
-          <w:lang w:val="es-VE" w:eastAsia="zxx" w:bidi="zxx"/>
+          <w:lang w:val="es-VE"/>
         </w:rPr>
       </w:pPr>
       <w:r>
@@ -4618,7 +4618,7 @@
         <w:ind w:left="0" w:hanging="0"/>
         <w:jc w:val="left"/>
         <w:rPr>
-          <w:lang w:val="es-VE" w:eastAsia="zxx" w:bidi="zxx"/>
+          <w:lang w:val="es-VE"/>
         </w:rPr>
       </w:pPr>
       <w:r>
@@ -4637,7 +4637,7 @@
         <w:spacing w:lineRule="auto" w:line="240"/>
         <w:jc w:val="left"/>
         <w:rPr>
-          <w:lang w:val="es-VE" w:eastAsia="zxx" w:bidi="zxx"/>
+          <w:lang w:val="es-VE"/>
         </w:rPr>
       </w:pPr>
       <w:r>
@@ -4670,7 +4670,7 @@
         <w:spacing w:lineRule="auto" w:line="240"/>
         <w:jc w:val="left"/>
         <w:rPr>
-          <w:lang w:val="es-VE" w:eastAsia="zxx" w:bidi="zxx"/>
+          <w:lang w:val="es-VE"/>
         </w:rPr>
       </w:pPr>
       <w:r>
@@ -4687,7 +4687,7 @@
         <w:spacing w:lineRule="auto" w:line="240"/>
         <w:jc w:val="left"/>
         <w:rPr>
-          <w:lang w:val="es-VE" w:eastAsia="zxx" w:bidi="zxx"/>
+          <w:lang w:val="es-VE"/>
         </w:rPr>
       </w:pPr>
       <w:r>
@@ -4844,7 +4844,7 @@
         <w:spacing w:lineRule="auto" w:line="240"/>
         <w:jc w:val="left"/>
         <w:rPr>
-          <w:lang w:val="es-VE" w:eastAsia="zxx" w:bidi="zxx"/>
+          <w:lang w:val="es-VE"/>
         </w:rPr>
       </w:pPr>
       <w:r>
@@ -4899,7 +4899,7 @@
         <w:ind w:left="709" w:hanging="283"/>
         <w:jc w:val="left"/>
         <w:rPr>
-          <w:lang w:val="es-VE" w:eastAsia="zxx" w:bidi="zxx"/>
+          <w:lang w:val="es-VE"/>
         </w:rPr>
       </w:pPr>
       <w:r>
@@ -4989,7 +4989,7 @@
         <w:spacing w:lineRule="auto" w:line="240"/>
         <w:jc w:val="left"/>
         <w:rPr>
-          <w:lang w:val="es-VE" w:eastAsia="zxx" w:bidi="zxx"/>
+          <w:lang w:val="es-VE"/>
         </w:rPr>
       </w:pPr>
       <w:r>
@@ -5006,7 +5006,7 @@
         <w:spacing w:lineRule="auto" w:line="240"/>
         <w:jc w:val="left"/>
         <w:rPr>
-          <w:lang w:val="es-VE" w:eastAsia="zxx" w:bidi="zxx"/>
+          <w:lang w:val="es-VE"/>
         </w:rPr>
       </w:pPr>
       <w:r>
@@ -5139,7 +5139,7 @@
         <w:spacing w:lineRule="auto" w:line="240"/>
         <w:jc w:val="left"/>
         <w:rPr>
-          <w:lang w:val="es-VE" w:eastAsia="zxx" w:bidi="zxx"/>
+          <w:lang w:val="es-VE"/>
         </w:rPr>
       </w:pPr>
       <w:r>
@@ -5156,7 +5156,7 @@
         <w:spacing w:lineRule="auto" w:line="240"/>
         <w:jc w:val="left"/>
         <w:rPr>
-          <w:lang w:val="es-VE" w:eastAsia="zxx" w:bidi="zxx"/>
+          <w:lang w:val="es-VE"/>
         </w:rPr>
       </w:pPr>
       <w:r>
@@ -5197,7 +5197,7 @@
         <w:spacing w:lineRule="auto" w:line="240"/>
         <w:jc w:val="left"/>
         <w:rPr>
-          <w:lang w:val="es-VE" w:eastAsia="zxx" w:bidi="zxx"/>
+          <w:lang w:val="es-VE"/>
         </w:rPr>
       </w:pPr>
       <w:r>
@@ -5238,7 +5238,7 @@
         <w:spacing w:lineRule="auto" w:line="240"/>
         <w:jc w:val="left"/>
         <w:rPr>
-          <w:lang w:val="es-VE" w:eastAsia="zxx" w:bidi="zxx"/>
+          <w:lang w:val="es-VE"/>
         </w:rPr>
       </w:pPr>
       <w:r>
@@ -5271,7 +5271,7 @@
         <w:spacing w:lineRule="auto" w:line="240"/>
         <w:jc w:val="left"/>
         <w:rPr>
-          <w:lang w:val="es-VE" w:eastAsia="zxx" w:bidi="zxx"/>
+          <w:lang w:val="es-VE"/>
         </w:rPr>
       </w:pPr>
       <w:r>
@@ -5332,7 +5332,7 @@
         <w:ind w:left="709" w:hanging="283"/>
         <w:jc w:val="left"/>
         <w:rPr>
-          <w:lang w:val="es-VE" w:eastAsia="zxx" w:bidi="zxx"/>
+          <w:lang w:val="es-VE"/>
         </w:rPr>
       </w:pPr>
       <w:r>
@@ -5350,7 +5350,7 @@
         <w:ind w:left="0" w:hanging="0"/>
         <w:jc w:val="left"/>
         <w:rPr>
-          <w:lang w:val="es-VE" w:eastAsia="zxx" w:bidi="zxx"/>
+          <w:lang w:val="es-VE"/>
         </w:rPr>
       </w:pPr>
       <w:r>
@@ -5369,7 +5369,7 @@
         <w:spacing w:lineRule="auto" w:line="240"/>
         <w:jc w:val="left"/>
         <w:rPr>
-          <w:lang w:val="es-VE" w:eastAsia="zxx" w:bidi="zxx"/>
+          <w:lang w:val="es-VE"/>
         </w:rPr>
       </w:pPr>
       <w:r>
@@ -5471,7 +5471,7 @@
         <w:ind w:left="709" w:hanging="283"/>
         <w:jc w:val="left"/>
         <w:rPr>
-          <w:lang w:val="es-VE" w:eastAsia="zxx" w:bidi="zxx"/>
+          <w:lang w:val="es-VE"/>
         </w:rPr>
       </w:pPr>
       <w:r>
@@ -5538,127 +5538,15 @@
         </w:rPr>
         <w:t>DB_DIR_BACKUP=\ruta\a\tu\directorio\respaldo\</w:t>
       </w:r>
-      <w:r>
-        <w:rPr>
-          <w:lang w:val="es-VE" w:eastAsia="zxx" w:bidi="zxx"/>
-        </w:rPr>
-        <w:br/>
-      </w:r>
-      <w:r>
-        <w:rPr>
-          <w:rStyle w:val="Emphasis"/>
-          <w:lang w:val="es-VE" w:eastAsia="zxx" w:bidi="zxx"/>
-        </w:rPr>
-        <w:t>Nota:</w:t>
-      </w:r>
-      <w:r>
-        <w:rPr>
-          <w:lang w:val="es-VE" w:eastAsia="zxx" w:bidi="zxx"/>
-        </w:rPr>
-        <w:t xml:space="preserve"> Asegúrate de que la ruta termine con </w:t>
-      </w:r>
-      <w:r>
-        <w:rPr>
-          <w:rStyle w:val="StrongEmphasis"/>
-          <w:lang w:val="es-VE" w:eastAsia="zxx" w:bidi="zxx"/>
-        </w:rPr>
-        <w:t>una barra inclinada (</w:t>
-      </w:r>
-      <w:r>
-        <w:rPr>
-          <w:rStyle w:val="SourceText"/>
-          <w:lang w:val="es-VE" w:eastAsia="zxx" w:bidi="zxx"/>
-        </w:rPr>
-        <w:t>/</w:t>
-      </w:r>
-      <w:r>
-        <w:rPr>
-          <w:rStyle w:val="StrongEmphasis"/>
-          <w:lang w:val="es-VE" w:eastAsia="zxx" w:bidi="zxx"/>
-        </w:rPr>
-        <w:t>)</w:t>
-      </w:r>
-      <w:r>
-        <w:rPr>
-          <w:lang w:val="es-VE" w:eastAsia="zxx" w:bidi="zxx"/>
-        </w:rPr>
-        <w:t xml:space="preserve"> si estás en </w:t>
-      </w:r>
-      <w:r>
-        <w:rPr>
-          <w:rStyle w:val="StrongEmphasis"/>
-          <w:lang w:val="es-VE" w:eastAsia="zxx" w:bidi="zxx"/>
-        </w:rPr>
-        <w:t>Linux</w:t>
-      </w:r>
-      <w:r>
-        <w:rPr>
-          <w:lang w:val="es-VE" w:eastAsia="zxx" w:bidi="zxx"/>
-        </w:rPr>
-        <w:t xml:space="preserve"> o </w:t>
-      </w:r>
-      <w:r>
-        <w:rPr>
-          <w:rStyle w:val="StrongEmphasis"/>
-          <w:lang w:val="es-VE" w:eastAsia="zxx" w:bidi="zxx"/>
-        </w:rPr>
-        <w:t>Mac</w:t>
-      </w:r>
-      <w:r>
-        <w:rPr>
-          <w:lang w:val="es-VE" w:eastAsia="zxx" w:bidi="zxx"/>
-        </w:rPr>
-        <w:t xml:space="preserve">, o con </w:t>
-      </w:r>
-      <w:r>
-        <w:rPr>
-          <w:rStyle w:val="StrongEmphasis"/>
-          <w:lang w:val="es-VE" w:eastAsia="zxx" w:bidi="zxx"/>
-        </w:rPr>
-        <w:t>una barra invertida (</w:t>
-      </w:r>
-      <w:r>
-        <w:rPr>
-          <w:rStyle w:val="SourceText"/>
-          <w:lang w:val="es-VE" w:eastAsia="zxx" w:bidi="zxx"/>
-        </w:rPr>
-        <w:t>\</w:t>
-      </w:r>
-      <w:r>
-        <w:rPr>
-          <w:rStyle w:val="StrongEmphasis"/>
-          <w:lang w:val="es-VE" w:eastAsia="zxx" w:bidi="zxx"/>
-        </w:rPr>
-        <w:t>)</w:t>
-      </w:r>
-      <w:r>
-        <w:rPr>
-          <w:lang w:val="es-VE" w:eastAsia="zxx" w:bidi="zxx"/>
-        </w:rPr>
-        <w:t xml:space="preserve"> si estás en </w:t>
-      </w:r>
-      <w:r>
-        <w:rPr>
-          <w:rStyle w:val="StrongEmphasis"/>
-          <w:lang w:val="es-VE" w:eastAsia="zxx" w:bidi="zxx"/>
-        </w:rPr>
-        <w:t>Windows</w:t>
-      </w:r>
-      <w:r>
-        <w:rPr>
-          <w:lang w:val="es-VE" w:eastAsia="zxx" w:bidi="zxx"/>
-        </w:rPr>
-        <w:t>.</w:t>
-      </w:r>
-    </w:p>
-    <w:p>
-      <w:pPr>
-        <w:pStyle w:val="TextBody"/>
-        <w:bidi w:val="0"/>
-        <w:spacing w:lineRule="auto" w:line="240"/>
-        <w:jc w:val="left"/>
-        <w:rPr>
-          <w:lang w:val="es-VE" w:eastAsia="zxx" w:bidi="zxx"/>
+    </w:p>
+    <w:p>
+      <w:pPr>
+        <w:pStyle w:val="TextBody"/>
+        <w:bidi w:val="0"/>
+        <w:spacing w:lineRule="auto" w:line="240"/>
+        <w:jc w:val="left"/>
+        <w:rPr>
+          <w:lang w:val="es-VE"/>
         </w:rPr>
       </w:pPr>
       <w:r>
@@ -5767,7 +5655,7 @@
         <w:spacing w:lineRule="auto" w:line="240"/>
         <w:jc w:val="left"/>
         <w:rPr>
-          <w:lang w:val="es-VE" w:eastAsia="zxx" w:bidi="zxx"/>
+          <w:lang w:val="es-VE"/>
         </w:rPr>
       </w:pPr>
       <w:r>
@@ -5793,7 +5681,7 @@
         <w:ind w:left="709" w:hanging="283"/>
         <w:jc w:val="left"/>
         <w:rPr>
-          <w:lang w:val="es-VE" w:eastAsia="zxx" w:bidi="zxx"/>
+          <w:lang w:val="es-VE"/>
         </w:rPr>
       </w:pPr>
       <w:r>
@@ -5825,7 +5713,7 @@
         <w:ind w:left="709" w:hanging="283"/>
         <w:jc w:val="left"/>
         <w:rPr>
-          <w:lang w:val="es-VE" w:eastAsia="zxx" w:bidi="zxx"/>
+          <w:lang w:val="es-VE"/>
         </w:rPr>
       </w:pPr>
       <w:r>
@@ -5865,7 +5753,7 @@
         <w:spacing w:lineRule="auto" w:line="240"/>
         <w:jc w:val="left"/>
         <w:rPr>
-          <w:lang w:val="es-VE" w:eastAsia="zxx" w:bidi="zxx"/>
+          <w:lang w:val="es-VE"/>
         </w:rPr>
       </w:pPr>
       <w:r>
@@ -5882,7 +5770,7 @@
         <w:spacing w:lineRule="auto" w:line="240"/>
         <w:jc w:val="left"/>
         <w:rPr>
-          <w:lang w:val="es-VE" w:eastAsia="zxx" w:bidi="zxx"/>
+          <w:lang w:val="es-VE"/>
         </w:rPr>
       </w:pPr>
       <w:r>
@@ -6195,7 +6083,7 @@
         <w:spacing w:lineRule="auto" w:line="240"/>
         <w:jc w:val="left"/>
         <w:rPr>
-          <w:lang w:val="es-VE" w:eastAsia="zxx" w:bidi="zxx"/>
+          <w:lang w:val="es-VE"/>
         </w:rPr>
       </w:pPr>
       <w:r>
@@ -6308,9 +6196,7 @@
         <w:ind w:left="0" w:hanging="0"/>
         <w:jc w:val="left"/>
         <w:rPr>
-          <w:sz w:val="32"/>
-          <w:szCs w:val="32"/>
-          <w:lang w:val="es-VE" w:eastAsia="zxx" w:bidi="zxx"/>
+          <w:lang w:val="es-VE"/>
         </w:rPr>
       </w:pPr>
       <w:r>
@@ -6339,12 +6225,7 @@
         <w:ind w:left="0" w:hanging="0"/>
         <w:jc w:val="left"/>
         <w:rPr>
-          <w:b w:val="false"/>
-          <w:b w:val="false"/>
-          <w:bCs w:val="false"/>
-          <w:sz w:val="24"/>
-          <w:szCs w:val="24"/>
-          <w:lang w:val="es-VE" w:eastAsia="zxx" w:bidi="zxx"/>
+          <w:lang w:val="es-VE"/>
         </w:rPr>
       </w:pPr>
       <w:r>
@@ -6479,10 +6360,7 @@
         <w:ind w:left="0" w:hanging="0"/>
         <w:jc w:val="left"/>
         <w:rPr>
-          <w:b/>
-          <w:sz w:val="32"/>
-          <w:szCs w:val="32"/>
-          <w:lang w:val="es-VE" w:eastAsia="zxx" w:bidi="zxx"/>
+          <w:lang w:val="es-VE"/>
         </w:rPr>
       </w:pPr>
       <w:r>
@@ -6587,7 +6465,7 @@
         <w:ind w:left="0" w:hanging="0"/>
         <w:jc w:val="left"/>
         <w:rPr>
-          <w:lang w:val="es-VE" w:eastAsia="zxx" w:bidi="zxx"/>
+          <w:lang w:val="es-VE"/>
         </w:rPr>
       </w:pPr>
       <w:r>
@@ -6601,111 +6479,7 @@
           <w:vertAlign w:val="baseline"/>
           <w:lang w:val="es-VE" w:eastAsia="zxx" w:bidi="zxx"/>
         </w:rPr>
-        <w:t xml:space="preserve">Porque si tengo instalado LibreOffice </w:t>
-      </w:r>
-      <w:r>
-        <w:rPr>
-          <w:b/>
-          <w:bCs/>
-          <w:position w:val="0"/>
-          <w:sz w:val="32"/>
-          <w:sz w:val="32"/>
-          <w:szCs w:val="32"/>
-          <w:vertAlign w:val="baseline"/>
-          <w:lang w:val="es-VE" w:eastAsia="zxx" w:bidi="zxx"/>
-        </w:rPr>
-        <w:t>sigue</w:t>
-      </w:r>
-      <w:r>
-        <w:rPr>
-          <w:b/>
-          <w:bCs/>
-          <w:position w:val="0"/>
-          <w:sz w:val="32"/>
-          <w:sz w:val="32"/>
-          <w:szCs w:val="32"/>
-          <w:vertAlign w:val="baseline"/>
-          <w:lang w:val="es-VE" w:eastAsia="zxx" w:bidi="zxx"/>
-        </w:rPr>
-        <w:t xml:space="preserve"> </w:t>
-      </w:r>
-      <w:r>
-        <w:rPr>
-          <w:b/>
-          <w:bCs/>
-          <w:position w:val="0"/>
-          <w:sz w:val="32"/>
-          <w:sz w:val="32"/>
-          <w:szCs w:val="32"/>
-          <w:vertAlign w:val="baseline"/>
-          <w:lang w:val="es-VE" w:eastAsia="zxx" w:bidi="zxx"/>
-        </w:rPr>
-        <w:t>sin</w:t>
-      </w:r>
-      <w:r>
-        <w:rPr>
-          <w:b/>
-          <w:bCs/>
-          <w:position w:val="0"/>
-          <w:sz w:val="32"/>
-          <w:sz w:val="32"/>
-          <w:szCs w:val="32"/>
-          <w:vertAlign w:val="baseline"/>
-          <w:lang w:val="es-VE" w:eastAsia="zxx" w:bidi="zxx"/>
-        </w:rPr>
-        <w:t xml:space="preserve"> generar </w:t>
-      </w:r>
-      <w:r>
-        <w:rPr>
-          <w:b/>
-          <w:bCs/>
-          <w:position w:val="0"/>
-          <w:sz w:val="32"/>
-          <w:sz w:val="32"/>
-          <w:szCs w:val="32"/>
-          <w:vertAlign w:val="baseline"/>
-          <w:lang w:val="es-VE" w:eastAsia="zxx" w:bidi="zxx"/>
-        </w:rPr>
-        <w:t>PDFs</w:t>
-      </w:r>
-      <w:r>
-        <w:rPr>
-          <w:b/>
-          <w:bCs/>
-          <w:position w:val="0"/>
-          <w:sz w:val="32"/>
-          <w:sz w:val="32"/>
-          <w:szCs w:val="32"/>
-          <w:vertAlign w:val="baseline"/>
-          <w:lang w:val="es-VE" w:eastAsia="zxx" w:bidi="zxx"/>
-        </w:rPr>
-        <w:t xml:space="preserve">, </w:t>
-      </w:r>
-      <w:r>
-        <w:rPr>
-          <w:b/>
-          <w:bCs/>
-          <w:position w:val="0"/>
-          <w:sz w:val="32"/>
-          <w:sz w:val="32"/>
-          <w:szCs w:val="32"/>
-          <w:vertAlign w:val="baseline"/>
-          <w:lang w:val="es-VE" w:eastAsia="zxx" w:bidi="zxx"/>
-        </w:rPr>
-        <w:t>solo archivos Word .docx</w:t>
-      </w:r>
-      <w:r>
-        <w:rPr>
-          <w:b/>
-          <w:bCs/>
-          <w:position w:val="0"/>
-          <w:sz w:val="32"/>
-          <w:sz w:val="32"/>
-          <w:szCs w:val="32"/>
-          <w:vertAlign w:val="baseline"/>
-          <w:lang w:val="es-VE" w:eastAsia="zxx" w:bidi="zxx"/>
-        </w:rPr>
-        <w:t>?</w:t>
+        <w:t>Porque si tengo instalado LibreOffice sigue sin generar PDFs, solo archivos Word .docx?</w:t>
       </w:r>
     </w:p>
     <w:p>
@@ -6723,7 +6497,7 @@
         <w:ind w:left="0" w:hanging="0"/>
         <w:jc w:val="left"/>
         <w:rPr>
-          <w:lang w:val="es-VE" w:eastAsia="zxx" w:bidi="zxx"/>
+          <w:lang w:val="es-VE"/>
         </w:rPr>
       </w:pPr>
       <w:r>
@@ -6732,20 +6506,538 @@
           <w:szCs w:val="24"/>
           <w:lang w:val="es-VE" w:eastAsia="zxx" w:bidi="zxx"/>
         </w:rPr>
-        <w:t>Esto es por como Windows maneja los permisos de usuario, para solucionarlo...</w:t>
+        <w:t>Esto es por</w:t>
+      </w:r>
+      <w:r>
+        <w:rPr>
+          <w:sz w:val="24"/>
+          <w:szCs w:val="24"/>
+          <w:lang w:val="es-VE" w:eastAsia="zxx" w:bidi="zxx"/>
+        </w:rPr>
+        <w:t xml:space="preserve">que ocurrio algun fallo relacionado con LibreOffice, asegurese que el usuario que corra el servicio de apache sea </w:t>
+      </w:r>
+      <w:r>
+        <w:rPr>
+          <w:rFonts w:ascii="Liberation Mono" w:hAnsi="Liberation Mono"/>
+          <w:sz w:val="24"/>
+          <w:szCs w:val="24"/>
+          <w:lang w:val="es-VE" w:eastAsia="zxx" w:bidi="zxx"/>
+        </w:rPr>
+        <w:t>nt authority\system</w:t>
+      </w:r>
+    </w:p>
+    <w:p>
+      <w:pPr>
+        <w:pStyle w:val="TextBody"/>
+        <w:numPr>
+          <w:ilvl w:val="0"/>
+          <w:numId w:val="0"/>
+        </w:numPr>
+        <w:tabs>
+          <w:tab w:val="left" w:pos="709" w:leader="none"/>
+        </w:tabs>
+        <w:bidi w:val="0"/>
+        <w:spacing w:lineRule="auto" w:line="240"/>
+        <w:ind w:left="0" w:hanging="0"/>
+        <w:jc w:val="left"/>
+        <w:rPr>
+          <w:b/>
+          <w:b/>
+          <w:bCs/>
+          <w:sz w:val="32"/>
+          <w:szCs w:val="32"/>
+          <w:lang w:val="es-VE"/>
+        </w:rPr>
+      </w:pPr>
+      <w:r>
+        <w:rPr>
+          <w:b/>
+          <w:bCs/>
+          <w:sz w:val="32"/>
+          <w:szCs w:val="32"/>
+          <w:lang w:val="es-VE" w:eastAsia="zxx" w:bidi="zxx"/>
+        </w:rPr>
+        <w:t>Porque el sistema no genera ningun archivo .docx ni pdf?</w:t>
+      </w:r>
+    </w:p>
+    <w:p>
+      <w:pPr>
+        <w:pStyle w:val="TextBody"/>
+        <w:numPr>
+          <w:ilvl w:val="0"/>
+          <w:numId w:val="0"/>
+        </w:numPr>
+        <w:tabs>
+          <w:tab w:val="left" w:pos="709" w:leader="none"/>
+        </w:tabs>
+        <w:bidi w:val="0"/>
+        <w:spacing w:lineRule="auto" w:line="240"/>
+        <w:ind w:left="0" w:hanging="0"/>
+        <w:jc w:val="left"/>
+        <w:rPr>
+          <w:b w:val="false"/>
+          <w:b w:val="false"/>
+          <w:bCs w:val="false"/>
+          <w:sz w:val="24"/>
+          <w:szCs w:val="24"/>
+          <w:lang w:val="es-VE"/>
+        </w:rPr>
+      </w:pPr>
+      <w:r>
+        <w:rPr>
+          <w:b w:val="false"/>
+          <w:bCs w:val="false"/>
+          <w:sz w:val="24"/>
+          <w:szCs w:val="24"/>
+          <w:lang w:val="es-VE" w:eastAsia="zxx" w:bidi="zxx"/>
+        </w:rPr>
+        <w:t>lo más probable es que se trate de una de estas tres cosas:</w:t>
+      </w:r>
+    </w:p>
+    <w:p>
+      <w:pPr>
+        <w:pStyle w:val="Heading4"/>
+        <w:rPr/>
+      </w:pPr>
+      <w:r>
+        <w:rPr>
+          <w:lang w:val="es-VE"/>
+        </w:rPr>
+        <w:t xml:space="preserve">A. La extensión </w:t>
+      </w:r>
+      <w:r>
+        <w:rPr>
+          <w:rStyle w:val="SourceText"/>
+          <w:lang w:val="es-VE"/>
+        </w:rPr>
+        <w:t>zip</w:t>
+      </w:r>
+      <w:r>
+        <w:rPr>
+          <w:lang w:val="es-VE"/>
+        </w:rPr>
+        <w:t xml:space="preserve"> de PHP no está habilitada</w:t>
+      </w:r>
+    </w:p>
+    <w:p>
+      <w:pPr>
+        <w:pStyle w:val="TextBody"/>
+        <w:rPr/>
+      </w:pPr>
+      <w:r>
+        <w:rPr>
+          <w:rStyle w:val="SourceText"/>
+          <w:lang w:val="es-VE"/>
+        </w:rPr>
+        <w:t>PhpWord</w:t>
+      </w:r>
+      <w:r>
+        <w:rPr>
+          <w:lang w:val="es-VE"/>
+        </w:rPr>
+        <w:t xml:space="preserve"> (y su </w:t>
+      </w:r>
+      <w:r>
+        <w:rPr>
+          <w:rStyle w:val="SourceText"/>
+          <w:lang w:val="es-VE"/>
+        </w:rPr>
+        <w:t>TemplateProcessor</w:t>
+      </w:r>
+      <w:r>
+        <w:rPr>
+          <w:lang w:val="es-VE"/>
+        </w:rPr>
+        <w:t xml:space="preserve">) no lee archivos </w:t>
+      </w:r>
+      <w:r>
+        <w:rPr>
+          <w:rStyle w:val="SourceText"/>
+          <w:lang w:val="es-VE"/>
+        </w:rPr>
+        <w:t>.docx</w:t>
+      </w:r>
+      <w:r>
+        <w:rPr>
+          <w:lang w:val="es-VE"/>
+        </w:rPr>
+        <w:t xml:space="preserve"> como texto, los lee como archivos comprimidos (porque un .docx es en realidad un conjunto de archivos XML dentro de un ZIP).</w:t>
+      </w:r>
+    </w:p>
+    <w:p>
+      <w:pPr>
+        <w:pStyle w:val="TextBody"/>
+        <w:numPr>
+          <w:ilvl w:val="0"/>
+          <w:numId w:val="36"/>
+        </w:numPr>
+        <w:tabs>
+          <w:tab w:val="clear" w:pos="709"/>
+          <w:tab w:val="left" w:pos="0" w:leader="none"/>
+        </w:tabs>
+        <w:ind w:left="709" w:hanging="283"/>
+        <w:rPr/>
+      </w:pPr>
+      <w:r>
+        <w:rPr>
+          <w:b/>
+          <w:lang w:val="es-VE"/>
+        </w:rPr>
+        <w:t>En Windows 11</w:t>
+      </w:r>
+      <w:r>
+        <w:rPr>
+          <w:lang w:val="es-VE"/>
+        </w:rPr>
+        <w:t xml:space="preserve">, a veces XAMPP viene con la extensión </w:t>
+      </w:r>
+      <w:r>
+        <w:rPr>
+          <w:rStyle w:val="SourceText"/>
+          <w:lang w:val="es-VE"/>
+        </w:rPr>
+        <w:t>extension=zip</w:t>
+      </w:r>
+      <w:r>
+        <w:rPr>
+          <w:lang w:val="es-VE"/>
+        </w:rPr>
+        <w:t xml:space="preserve"> comentada en el </w:t>
+      </w:r>
+      <w:r>
+        <w:rPr>
+          <w:rStyle w:val="SourceText"/>
+          <w:lang w:val="es-VE"/>
+        </w:rPr>
+        <w:t>php.ini</w:t>
+      </w:r>
+      <w:r>
+        <w:rPr>
+          <w:lang w:val="es-VE"/>
+        </w:rPr>
+        <w:t>.</w:t>
+      </w:r>
+    </w:p>
+    <w:p>
+      <w:pPr>
+        <w:pStyle w:val="TextBody"/>
+        <w:numPr>
+          <w:ilvl w:val="0"/>
+          <w:numId w:val="36"/>
+        </w:numPr>
+        <w:tabs>
+          <w:tab w:val="clear" w:pos="709"/>
+          <w:tab w:val="left" w:pos="0" w:leader="none"/>
+        </w:tabs>
+        <w:ind w:left="709" w:hanging="283"/>
+        <w:rPr/>
+      </w:pPr>
+      <w:r>
+        <w:rPr>
+          <w:b/>
+          <w:lang w:val="es-VE"/>
+        </w:rPr>
+        <w:t>Síntoma:</w:t>
+      </w:r>
+      <w:r>
+        <w:rPr>
+          <w:lang w:val="es-VE"/>
+        </w:rPr>
+        <w:t xml:space="preserve"> El script se detiene (muere) silenciosamente cuando intentas instanciar </w:t>
+      </w:r>
+      <w:r>
+        <w:rPr>
+          <w:rStyle w:val="SourceText"/>
+          <w:lang w:val="es-VE"/>
+        </w:rPr>
+        <w:t>new TemplateProcessor()</w:t>
+      </w:r>
+      <w:r>
+        <w:rPr>
+          <w:lang w:val="es-VE"/>
+        </w:rPr>
+        <w:t>.</w:t>
+      </w:r>
+    </w:p>
+    <w:p>
+      <w:pPr>
+        <w:pStyle w:val="TextBody"/>
+        <w:numPr>
+          <w:ilvl w:val="0"/>
+          <w:numId w:val="36"/>
+        </w:numPr>
+        <w:tabs>
+          <w:tab w:val="clear" w:pos="709"/>
+          <w:tab w:val="left" w:pos="0" w:leader="none"/>
+        </w:tabs>
+        <w:ind w:left="709" w:hanging="283"/>
+        <w:rPr/>
+      </w:pPr>
+      <w:r>
+        <w:rPr>
+          <w:b/>
+          <w:lang w:val="es-VE"/>
+        </w:rPr>
+        <w:t>Solución:</w:t>
+      </w:r>
+      <w:r>
+        <w:rPr>
+          <w:lang w:val="es-VE"/>
+        </w:rPr>
+        <w:t xml:space="preserve"> Ve al </w:t>
+      </w:r>
+      <w:r>
+        <w:rPr>
+          <w:rStyle w:val="SourceText"/>
+          <w:lang w:val="es-VE"/>
+        </w:rPr>
+        <w:t>php.ini</w:t>
+      </w:r>
+      <w:r>
+        <w:rPr>
+          <w:lang w:val="es-VE"/>
+        </w:rPr>
+        <w:t xml:space="preserve"> de la secretaria, busca </w:t>
+      </w:r>
+      <w:r>
+        <w:rPr>
+          <w:rStyle w:val="SourceText"/>
+          <w:lang w:val="es-VE"/>
+        </w:rPr>
+        <w:t>;extension=zip</w:t>
+      </w:r>
+      <w:r>
+        <w:rPr>
+          <w:lang w:val="es-VE"/>
+        </w:rPr>
+        <w:t>, quita el punto y coma (</w:t>
+      </w:r>
+      <w:r>
+        <w:rPr>
+          <w:rStyle w:val="SourceText"/>
+          <w:lang w:val="es-VE"/>
+        </w:rPr>
+        <w:t>;</w:t>
+      </w:r>
+      <w:r>
+        <w:rPr>
+          <w:lang w:val="es-VE"/>
+        </w:rPr>
+        <w:t>) y reinicia Apache.</w:t>
+      </w:r>
+    </w:p>
+    <w:p>
+      <w:pPr>
+        <w:pStyle w:val="Heading4"/>
+        <w:rPr>
+          <w:lang w:val="es-VE"/>
+        </w:rPr>
+      </w:pPr>
+      <w:r>
+        <w:rPr>
+          <w:lang w:val="es-VE"/>
+        </w:rPr>
+        <w:t>B. Permisos en la carpeta Temporal</w:t>
+      </w:r>
+    </w:p>
+    <w:p>
+      <w:pPr>
+        <w:pStyle w:val="TextBody"/>
+        <w:rPr/>
+      </w:pPr>
+      <w:r>
+        <w:rPr>
+          <w:rStyle w:val="SourceText"/>
+          <w:lang w:val="es-VE"/>
+        </w:rPr>
+        <w:t>TemplateProcessor</w:t>
+      </w:r>
+      <w:r>
+        <w:rPr>
+          <w:lang w:val="es-VE"/>
+        </w:rPr>
+        <w:t xml:space="preserve"> crea una copia del documento en la carpeta temporal de Windows antes de editarlo.</w:t>
+      </w:r>
+    </w:p>
+    <w:p>
+      <w:pPr>
+        <w:pStyle w:val="TextBody"/>
+        <w:numPr>
+          <w:ilvl w:val="0"/>
+          <w:numId w:val="37"/>
+        </w:numPr>
+        <w:tabs>
+          <w:tab w:val="clear" w:pos="709"/>
+          <w:tab w:val="left" w:pos="0" w:leader="none"/>
+        </w:tabs>
+        <w:ind w:left="709" w:hanging="283"/>
+        <w:rPr/>
+      </w:pPr>
+      <w:r>
+        <w:rPr>
+          <w:lang w:val="es-VE"/>
+        </w:rPr>
+        <w:t xml:space="preserve">En Windows 11, las políticas de seguridad sobre </w:t>
+      </w:r>
+      <w:r>
+        <w:rPr>
+          <w:rStyle w:val="SourceText"/>
+          <w:lang w:val="es-VE"/>
+        </w:rPr>
+        <w:t>C:\Windows\Temp</w:t>
+      </w:r>
+      <w:r>
+        <w:rPr>
+          <w:lang w:val="es-VE"/>
+        </w:rPr>
+        <w:t xml:space="preserve"> son más estrictas.</w:t>
+      </w:r>
+    </w:p>
+    <w:p>
+      <w:pPr>
+        <w:pStyle w:val="TextBody"/>
+        <w:numPr>
+          <w:ilvl w:val="0"/>
+          <w:numId w:val="37"/>
+        </w:numPr>
+        <w:tabs>
+          <w:tab w:val="clear" w:pos="709"/>
+          <w:tab w:val="left" w:pos="0" w:leader="none"/>
+        </w:tabs>
+        <w:ind w:left="709" w:hanging="283"/>
+        <w:rPr/>
+      </w:pPr>
+      <w:r>
+        <w:rPr>
+          <w:b/>
+          <w:lang w:val="es-VE"/>
+        </w:rPr>
+        <w:t>Prueba esto:</w:t>
+      </w:r>
+      <w:r>
+        <w:rPr>
+          <w:lang w:val="es-VE"/>
+        </w:rPr>
+        <w:t xml:space="preserve"> En el script de PHP, antes de procesar el Word, intenta imprimir </w:t>
+      </w:r>
+      <w:r>
+        <w:rPr>
+          <w:rStyle w:val="SourceText"/>
+          <w:lang w:val="es-VE"/>
+        </w:rPr>
+        <w:t>sys_get_temp_dir()</w:t>
+      </w:r>
+      <w:r>
+        <w:rPr>
+          <w:lang w:val="es-VE"/>
+        </w:rPr>
+        <w:t xml:space="preserve"> para ver dónde está intentando escribir PHP y verifica que esa carpeta sea accesible.</w:t>
+      </w:r>
+    </w:p>
+    <w:p>
+      <w:pPr>
+        <w:pStyle w:val="Heading4"/>
+        <w:rPr>
+          <w:lang w:val="es-VE"/>
+        </w:rPr>
+      </w:pPr>
+      <w:r>
+        <w:rPr>
+          <w:lang w:val="es-VE"/>
+        </w:rPr>
+        <w:t>C. El "Modo Bloqueado" de archivos descargados</w:t>
+      </w:r>
+    </w:p>
+    <w:p>
+      <w:pPr>
+        <w:pStyle w:val="TextBody"/>
+        <w:rPr/>
+      </w:pPr>
+      <w:r>
+        <w:rPr>
+          <w:lang w:val="es-VE"/>
+        </w:rPr>
+        <w:t xml:space="preserve">Si el archivo </w:t>
+      </w:r>
+      <w:r>
+        <w:rPr>
+          <w:rStyle w:val="SourceText"/>
+          <w:lang w:val="es-VE"/>
+        </w:rPr>
+        <w:t>.docx</w:t>
+      </w:r>
+      <w:r>
+        <w:rPr>
+          <w:lang w:val="es-VE"/>
+        </w:rPr>
+        <w:t xml:space="preserve"> que intentas editar fue descargado de internet o enviado por correo, Windows 11 a veces le pone un atributo de </w:t>
+      </w:r>
+      <w:r>
+        <w:rPr>
+          <w:b/>
+          <w:lang w:val="es-VE"/>
+        </w:rPr>
+        <w:t>"Bloqueado"</w:t>
+      </w:r>
+      <w:r>
+        <w:rPr>
+          <w:lang w:val="es-VE"/>
+        </w:rPr>
+        <w:t xml:space="preserve"> por seguridad.</w:t>
+      </w:r>
+    </w:p>
+    <w:p>
+      <w:pPr>
+        <w:pStyle w:val="TextBody"/>
+        <w:numPr>
+          <w:ilvl w:val="0"/>
+          <w:numId w:val="38"/>
+        </w:numPr>
+        <w:tabs>
+          <w:tab w:val="clear" w:pos="709"/>
+          <w:tab w:val="left" w:pos="0" w:leader="none"/>
+        </w:tabs>
+        <w:ind w:left="709" w:hanging="283"/>
+        <w:rPr/>
+      </w:pPr>
+      <w:r>
+        <w:rPr>
+          <w:b/>
+          <w:lang w:val="es-VE"/>
+        </w:rPr>
+        <w:t>Solución:</w:t>
+      </w:r>
+      <w:r>
+        <w:rPr>
+          <w:lang w:val="es-VE"/>
+        </w:rPr>
+        <w:t xml:space="preserve"> Clic derecho al archivo </w:t>
+      </w:r>
+      <w:r>
+        <w:rPr>
+          <w:rStyle w:val="SourceText"/>
+          <w:lang w:val="es-VE"/>
+        </w:rPr>
+        <w:t>.docx</w:t>
+      </w:r>
+      <w:r>
+        <w:rPr>
+          <w:lang w:val="es-VE"/>
+        </w:rPr>
+        <w:t xml:space="preserve"> → Propiedades → General → Marcar "Desbloquear" (si aparece abajo).</w:t>
       </w:r>
     </w:p>
     <w:p>
       <w:pPr>
         <w:pStyle w:val="Heading2"/>
         <w:suppressAutoHyphens w:val="true"/>
-        <w:overflowPunct w:val="true"/>
+        <w:overflowPunct w:val="false"/>
         <w:bidi w:val="0"/>
         <w:spacing w:lineRule="auto" w:line="240" w:before="0" w:after="140"/>
         <w:ind w:left="0" w:hanging="0"/>
         <w:jc w:val="both"/>
         <w:rPr>
-          <w:lang w:val="es-VE" w:eastAsia="zxx" w:bidi="zxx"/>
+          <w:lang w:val="es-VE"/>
         </w:rPr>
       </w:pPr>
       <w:r>
@@ -6766,7 +7058,7 @@
         <w:spacing w:lineRule="auto" w:line="240"/>
         <w:jc w:val="left"/>
         <w:rPr>
-          <w:lang w:val="es-VE" w:eastAsia="zxx" w:bidi="zxx"/>
+          <w:lang w:val="es-VE"/>
         </w:rPr>
       </w:pPr>
       <w:r>
@@ -6799,7 +7091,7 @@
         <w:spacing w:lineRule="auto" w:line="240"/>
         <w:jc w:val="left"/>
         <w:rPr>
-          <w:lang w:val="es-VE" w:eastAsia="zxx" w:bidi="zxx"/>
+          <w:lang w:val="es-VE"/>
         </w:rPr>
       </w:pPr>
       <w:r>
@@ -6963,7 +7255,7 @@
         <w:spacing w:lineRule="auto" w:line="240"/>
         <w:jc w:val="left"/>
         <w:rPr>
-          <w:lang w:val="es-VE" w:eastAsia="zxx" w:bidi="zxx"/>
+          <w:lang w:val="es-VE"/>
         </w:rPr>
       </w:pPr>
       <w:r>
@@ -7161,7 +7453,7 @@
         <w:spacing w:lineRule="auto" w:line="240"/>
         <w:jc w:val="left"/>
         <w:rPr>
-          <w:lang w:val="es-VE" w:eastAsia="zxx" w:bidi="zxx"/>
+          <w:lang w:val="es-VE"/>
         </w:rPr>
       </w:pPr>
       <w:r>
@@ -7268,6 +7560,104 @@
     </w:p>
     <w:p>
       <w:pPr>
+        <w:pStyle w:val="TextBody"/>
+        <w:numPr>
+          <w:ilvl w:val="0"/>
+          <w:numId w:val="28"/>
+        </w:numPr>
+        <w:tabs>
+          <w:tab w:val="left" w:pos="709" w:leader="none"/>
+        </w:tabs>
+        <w:bidi w:val="0"/>
+        <w:spacing w:lineRule="auto" w:line="240"/>
+        <w:ind w:left="709" w:hanging="283"/>
+        <w:jc w:val="left"/>
+        <w:rPr>
+          <w:lang w:val="es-VE"/>
+        </w:rPr>
+      </w:pPr>
+      <w:r>
+        <w:rPr>
+          <w:lang w:val="es-VE" w:eastAsia="zxx" w:bidi="zxx"/>
+        </w:rPr>
+        <w:t xml:space="preserve">En </w:t>
+      </w:r>
+      <w:r>
+        <w:rPr>
+          <w:rFonts w:ascii="Liberation Mono" w:hAnsi="Liberation Mono"/>
+          <w:lang w:val="es-VE" w:eastAsia="zxx" w:bidi="zxx"/>
+        </w:rPr>
+        <w:t>public/plantillas</w:t>
+      </w:r>
+      <w:r>
+        <w:rPr>
+          <w:lang w:val="es-VE" w:eastAsia="zxx" w:bidi="zxx"/>
+        </w:rPr>
+        <w:t xml:space="preserve"> estan las plantillas .docx, </w:t>
+      </w:r>
+      <w:r>
+        <w:rPr>
+          <w:lang w:val="es-VE" w:eastAsia="zxx" w:bidi="zxx"/>
+        </w:rPr>
+        <w:t xml:space="preserve">Windows 11 a veces le pone un atributo de </w:t>
+      </w:r>
+      <w:r>
+        <w:rPr>
+          <w:b/>
+          <w:lang w:val="es-VE" w:eastAsia="zxx" w:bidi="zxx"/>
+        </w:rPr>
+        <w:t>"Bloqueado"</w:t>
+      </w:r>
+      <w:r>
+        <w:rPr>
+          <w:lang w:val="es-VE" w:eastAsia="zxx" w:bidi="zxx"/>
+        </w:rPr>
+        <w:t xml:space="preserve"> por seguridad.</w:t>
+      </w:r>
+    </w:p>
+    <w:p>
+      <w:pPr>
+        <w:pStyle w:val="TextBody"/>
+        <w:numPr>
+          <w:ilvl w:val="0"/>
+          <w:numId w:val="35"/>
+        </w:numPr>
+        <w:tabs>
+          <w:tab w:val="clear" w:pos="709"/>
+          <w:tab w:val="left" w:pos="0" w:leader="none"/>
+        </w:tabs>
+        <w:ind w:left="1069" w:hanging="283"/>
+        <w:rPr/>
+      </w:pPr>
+      <w:r>
+        <w:rPr>
+          <w:b/>
+          <w:lang w:val="es-VE"/>
+        </w:rPr>
+        <w:t>Solución:</w:t>
+      </w:r>
+      <w:r>
+        <w:rPr>
+          <w:lang w:val="es-VE"/>
+        </w:rPr>
+        <w:t xml:space="preserve"> Clic derecho al archivo </w:t>
+      </w:r>
+      <w:r>
+        <w:rPr>
+          <w:rStyle w:val="SourceText"/>
+          <w:lang w:val="es-VE"/>
+        </w:rPr>
+        <w:t>.docx</w:t>
+      </w:r>
+      <w:r>
+        <w:rPr>
+          <w:lang w:val="es-VE"/>
+        </w:rPr>
+        <w:t xml:space="preserve"> → Propiedades → General → Marcar "Desbloquear" (si aparece abajo).</w:t>
+      </w:r>
+    </w:p>
+    <w:p>
+      <w:pPr>
         <w:pStyle w:val="HorizontalLine"/>
         <w:bidi w:val="0"/>
         <w:spacing w:lineRule="auto" w:line="240"/>
@@ -7289,7 +7679,7 @@
         <w:spacing w:lineRule="auto" w:line="240"/>
         <w:jc w:val="left"/>
         <w:rPr>
-          <w:lang w:val="es-VE" w:eastAsia="zxx" w:bidi="zxx"/>
+          <w:lang w:val="es-VE"/>
         </w:rPr>
       </w:pPr>
       <w:r>
@@ -7478,7 +7868,7 @@
         <w:spacing w:lineRule="auto" w:line="240"/>
         <w:jc w:val="left"/>
         <w:rPr>
-          <w:lang w:val="es-VE" w:eastAsia="zxx" w:bidi="zxx"/>
+          <w:lang w:val="es-VE"/>
         </w:rPr>
       </w:pPr>
       <w:r>
@@ -7677,15 +8067,12 @@
       <w:pPr>
         <w:pStyle w:val="TextBody"/>
         <w:suppressAutoHyphens w:val="true"/>
-        <w:overflowPunct w:val="true"/>
+        <w:overflowPunct w:val="false"/>
         <w:bidi w:val="0"/>
         <w:spacing w:lineRule="auto" w:line="240" w:before="0" w:after="140"/>
         <w:jc w:val="both"/>
         <w:rPr>
-          <w:b/>
-          <w:b/>
-          <w:bCs/>
-          <w:lang w:val="es-VE" w:eastAsia="zxx" w:bidi="zxx"/>
+          <w:lang w:val="es-VE"/>
         </w:rPr>
       </w:pPr>
       <w:r>
@@ -7711,12 +8098,12 @@
       <w:pPr>
         <w:pStyle w:val="TextBody"/>
         <w:suppressAutoHyphens w:val="true"/>
-        <w:overflowPunct w:val="true"/>
+        <w:overflowPunct w:val="false"/>
         <w:bidi w:val="0"/>
         <w:spacing w:lineRule="auto" w:line="240" w:before="0" w:after="140"/>
         <w:jc w:val="both"/>
         <w:rPr>
-          <w:lang w:val="es-VE" w:eastAsia="zxx" w:bidi="zxx"/>
+          <w:lang w:val="es-VE"/>
         </w:rPr>
       </w:pPr>
       <w:r>
@@ -7739,7 +8126,7 @@
         </w:tabs>
         <w:ind w:left="709" w:hanging="283"/>
         <w:rPr>
-          <w:lang w:val="es-VE" w:eastAsia="zxx" w:bidi="zxx"/>
+          <w:lang w:val="es-VE"/>
         </w:rPr>
       </w:pPr>
       <w:r>
@@ -7795,7 +8182,7 @@
         </w:tabs>
         <w:ind w:left="709" w:hanging="283"/>
         <w:rPr>
-          <w:lang w:val="es-VE" w:eastAsia="zxx" w:bidi="zxx"/>
+          <w:lang w:val="es-VE"/>
         </w:rPr>
       </w:pPr>
       <w:r>
@@ -7864,7 +8251,7 @@
         </w:tabs>
         <w:ind w:left="709" w:hanging="283"/>
         <w:rPr>
-          <w:lang w:val="es-VE" w:eastAsia="zxx" w:bidi="zxx"/>
+          <w:lang w:val="es-VE"/>
         </w:rPr>
       </w:pPr>
       <w:r>
@@ -7907,7 +8294,7 @@
         </w:tabs>
         <w:ind w:left="709" w:hanging="283"/>
         <w:rPr>
-          <w:lang w:val="es-VE" w:eastAsia="zxx" w:bidi="zxx"/>
+          <w:lang w:val="es-VE"/>
         </w:rPr>
       </w:pPr>
       <w:r>
@@ -7941,17 +8328,17 @@
       <w:pPr>
         <w:pStyle w:val="TextBody"/>
         <w:suppressAutoHyphens w:val="true"/>
-        <w:overflowPunct w:val="true"/>
+        <w:overflowPunct w:val="false"/>
         <w:bidi w:val="0"/>
         <w:spacing w:lineRule="auto" w:line="240" w:before="0" w:after="140"/>
         <w:jc w:val="both"/>
         <w:rPr>
-          <w:lang w:val="es-VE" w:eastAsia="zxx" w:bidi="zxx"/>
-        </w:rPr>
-      </w:pPr>
-      <w:r>
-        <w:rPr>
-          <w:lang w:val="es-VE" w:eastAsia="zxx" w:bidi="zxx"/>
+          <w:lang w:val="es-VE"/>
+        </w:rPr>
+      </w:pPr>
+      <w:r>
+        <w:rPr>
+          <w:lang w:val="es-VE"/>
         </w:rPr>
       </w:r>
     </w:p>
@@ -12425,6 +12812,554 @@
   <w:abstractNum w:abstractNumId="35">
     <w:lvl w:ilvl="0">
       <w:start w:val="1"/>
+      <w:numFmt w:val="bullet"/>
+      <w:lvlText w:val=""/>
+      <w:lvlJc w:val="left"/>
+      <w:pPr>
+        <w:tabs>
+          <w:tab w:val="num" w:pos="1069"/>
+        </w:tabs>
+        <w:ind w:left="1069" w:hanging="283"/>
+      </w:pPr>
+      <w:rPr>
+        <w:rFonts w:ascii="Symbol" w:hAnsi="Symbol" w:cs="Symbol" w:hint="default"/>
+      </w:rPr>
+    </w:lvl>
+    <w:lvl w:ilvl="1">
+      <w:start w:val="1"/>
+      <w:numFmt w:val="bullet"/>
+      <w:lvlText w:val=""/>
+      <w:lvlJc w:val="left"/>
+      <w:pPr>
+        <w:tabs>
+          <w:tab w:val="num" w:pos="1778"/>
+        </w:tabs>
+        <w:ind w:left="1778" w:hanging="283"/>
+      </w:pPr>
+      <w:rPr>
+        <w:rFonts w:ascii="Symbol" w:hAnsi="Symbol" w:cs="Symbol" w:hint="default"/>
+      </w:rPr>
+    </w:lvl>
+    <w:lvl w:ilvl="2">
+      <w:start w:val="1"/>
+      <w:numFmt w:val="bullet"/>
+      <w:lvlText w:val=""/>
+      <w:lvlJc w:val="left"/>
+      <w:pPr>
+        <w:tabs>
+          <w:tab w:val="num" w:pos="2487"/>
+        </w:tabs>
+        <w:ind w:left="2487" w:hanging="283"/>
+      </w:pPr>
+      <w:rPr>
+        <w:rFonts w:ascii="Symbol" w:hAnsi="Symbol" w:cs="Symbol" w:hint="default"/>
+      </w:rPr>
+    </w:lvl>
+    <w:lvl w:ilvl="3">
+      <w:start w:val="1"/>
+      <w:numFmt w:val="bullet"/>
+      <w:lvlText w:val=""/>
+      <w:lvlJc w:val="left"/>
+      <w:pPr>
+        <w:tabs>
+          <w:tab w:val="num" w:pos="3196"/>
+        </w:tabs>
+        <w:ind w:left="3196" w:hanging="283"/>
+      </w:pPr>
+      <w:rPr>
+        <w:rFonts w:ascii="Symbol" w:hAnsi="Symbol" w:cs="Symbol" w:hint="default"/>
+      </w:rPr>
+    </w:lvl>
+    <w:lvl w:ilvl="4">
+      <w:start w:val="1"/>
+      <w:numFmt w:val="bullet"/>
+      <w:lvlText w:val=""/>
+      <w:lvlJc w:val="left"/>
+      <w:pPr>
+        <w:tabs>
+          <w:tab w:val="num" w:pos="3905"/>
+        </w:tabs>
+        <w:ind w:left="3905" w:hanging="283"/>
+      </w:pPr>
+      <w:rPr>
+        <w:rFonts w:ascii="Symbol" w:hAnsi="Symbol" w:cs="Symbol" w:hint="default"/>
+      </w:rPr>
+    </w:lvl>
+    <w:lvl w:ilvl="5">
+      <w:start w:val="1"/>
+      <w:numFmt w:val="bullet"/>
+      <w:lvlText w:val=""/>
+      <w:lvlJc w:val="left"/>
+      <w:pPr>
+        <w:tabs>
+          <w:tab w:val="num" w:pos="4614"/>
+        </w:tabs>
+        <w:ind w:left="4614" w:hanging="283"/>
+      </w:pPr>
+      <w:rPr>
+        <w:rFonts w:ascii="Symbol" w:hAnsi="Symbol" w:cs="Symbol" w:hint="default"/>
+      </w:rPr>
+    </w:lvl>
+    <w:lvl w:ilvl="6">
+      <w:start w:val="1"/>
+      <w:numFmt w:val="bullet"/>
+      <w:lvlText w:val=""/>
+      <w:lvlJc w:val="left"/>
+      <w:pPr>
+        <w:tabs>
+          <w:tab w:val="num" w:pos="5323"/>
+        </w:tabs>
+        <w:ind w:left="5323" w:hanging="283"/>
+      </w:pPr>
+      <w:rPr>
+        <w:rFonts w:ascii="Symbol" w:hAnsi="Symbol" w:cs="Symbol" w:hint="default"/>
+      </w:rPr>
+    </w:lvl>
+    <w:lvl w:ilvl="7">
+      <w:start w:val="1"/>
+      <w:numFmt w:val="bullet"/>
+      <w:lvlText w:val=""/>
+      <w:lvlJc w:val="left"/>
+      <w:pPr>
+        <w:tabs>
+          <w:tab w:val="num" w:pos="6032"/>
+        </w:tabs>
+        <w:ind w:left="6032" w:hanging="283"/>
+      </w:pPr>
+      <w:rPr>
+        <w:rFonts w:ascii="Symbol" w:hAnsi="Symbol" w:cs="Symbol" w:hint="default"/>
+      </w:rPr>
+    </w:lvl>
+    <w:lvl w:ilvl="8">
+      <w:start w:val="1"/>
+      <w:numFmt w:val="bullet"/>
+      <w:lvlText w:val=""/>
+      <w:lvlJc w:val="left"/>
+      <w:pPr>
+        <w:tabs>
+          <w:tab w:val="num" w:pos="6741"/>
+        </w:tabs>
+        <w:ind w:left="6741" w:hanging="283"/>
+      </w:pPr>
+      <w:rPr>
+        <w:rFonts w:ascii="Symbol" w:hAnsi="Symbol" w:cs="Symbol" w:hint="default"/>
+      </w:rPr>
+    </w:lvl>
+  </w:abstractNum>
+  <w:abstractNum w:abstractNumId="36">
+    <w:lvl w:ilvl="0">
+      <w:start w:val="1"/>
+      <w:numFmt w:val="bullet"/>
+      <w:lvlText w:val=""/>
+      <w:lvlJc w:val="left"/>
+      <w:pPr>
+        <w:tabs>
+          <w:tab w:val="num" w:pos="709"/>
+        </w:tabs>
+        <w:ind w:left="709" w:hanging="283"/>
+      </w:pPr>
+      <w:rPr>
+        <w:rFonts w:ascii="Symbol" w:hAnsi="Symbol" w:cs="Symbol" w:hint="default"/>
+      </w:rPr>
+    </w:lvl>
+    <w:lvl w:ilvl="1">
+      <w:start w:val="1"/>
+      <w:numFmt w:val="bullet"/>
+      <w:lvlText w:val=""/>
+      <w:lvlJc w:val="left"/>
+      <w:pPr>
+        <w:tabs>
+          <w:tab w:val="num" w:pos="1418"/>
+        </w:tabs>
+        <w:ind w:left="1418" w:hanging="283"/>
+      </w:pPr>
+      <w:rPr>
+        <w:rFonts w:ascii="Symbol" w:hAnsi="Symbol" w:cs="Symbol" w:hint="default"/>
+      </w:rPr>
+    </w:lvl>
+    <w:lvl w:ilvl="2">
+      <w:start w:val="1"/>
+      <w:numFmt w:val="bullet"/>
+      <w:lvlText w:val=""/>
+      <w:lvlJc w:val="left"/>
+      <w:pPr>
+        <w:tabs>
+          <w:tab w:val="num" w:pos="2127"/>
+        </w:tabs>
+        <w:ind w:left="2127" w:hanging="283"/>
+      </w:pPr>
+      <w:rPr>
+        <w:rFonts w:ascii="Symbol" w:hAnsi="Symbol" w:cs="Symbol" w:hint="default"/>
+      </w:rPr>
+    </w:lvl>
+    <w:lvl w:ilvl="3">
+      <w:start w:val="1"/>
+      <w:numFmt w:val="bullet"/>
+      <w:lvlText w:val=""/>
+      <w:lvlJc w:val="left"/>
+      <w:pPr>
+        <w:tabs>
+          <w:tab w:val="num" w:pos="2836"/>
+        </w:tabs>
+        <w:ind w:left="2836" w:hanging="283"/>
+      </w:pPr>
+      <w:rPr>
+        <w:rFonts w:ascii="Symbol" w:hAnsi="Symbol" w:cs="Symbol" w:hint="default"/>
+      </w:rPr>
+    </w:lvl>
+    <w:lvl w:ilvl="4">
+      <w:start w:val="1"/>
+      <w:numFmt w:val="bullet"/>
+      <w:lvlText w:val=""/>
+      <w:lvlJc w:val="left"/>
+      <w:pPr>
+        <w:tabs>
+          <w:tab w:val="num" w:pos="3545"/>
+        </w:tabs>
+        <w:ind w:left="3545" w:hanging="283"/>
+      </w:pPr>
+      <w:rPr>
+        <w:rFonts w:ascii="Symbol" w:hAnsi="Symbol" w:cs="Symbol" w:hint="default"/>
+      </w:rPr>
+    </w:lvl>
+    <w:lvl w:ilvl="5">
+      <w:start w:val="1"/>
+      <w:numFmt w:val="bullet"/>
+      <w:lvlText w:val=""/>
+      <w:lvlJc w:val="left"/>
+      <w:pPr>
+        <w:tabs>
+          <w:tab w:val="num" w:pos="4254"/>
+        </w:tabs>
+        <w:ind w:left="4254" w:hanging="283"/>
+      </w:pPr>
+      <w:rPr>
+        <w:rFonts w:ascii="Symbol" w:hAnsi="Symbol" w:cs="Symbol" w:hint="default"/>
+      </w:rPr>
+    </w:lvl>
+    <w:lvl w:ilvl="6">
+      <w:start w:val="1"/>
+      <w:numFmt w:val="bullet"/>
+      <w:lvlText w:val=""/>
+      <w:lvlJc w:val="left"/>
+      <w:pPr>
+        <w:tabs>
+          <w:tab w:val="num" w:pos="4963"/>
+        </w:tabs>
+        <w:ind w:left="4963" w:hanging="283"/>
+      </w:pPr>
+      <w:rPr>
+        <w:rFonts w:ascii="Symbol" w:hAnsi="Symbol" w:cs="Symbol" w:hint="default"/>
+      </w:rPr>
+    </w:lvl>
+    <w:lvl w:ilvl="7">
+      <w:start w:val="1"/>
+      <w:numFmt w:val="bullet"/>
+      <w:lvlText w:val=""/>
+      <w:lvlJc w:val="left"/>
+      <w:pPr>
+        <w:tabs>
+          <w:tab w:val="num" w:pos="5672"/>
+        </w:tabs>
+        <w:ind w:left="5672" w:hanging="283"/>
+      </w:pPr>
+      <w:rPr>
+        <w:rFonts w:ascii="Symbol" w:hAnsi="Symbol" w:cs="Symbol" w:hint="default"/>
+      </w:rPr>
+    </w:lvl>
+    <w:lvl w:ilvl="8">
+      <w:start w:val="1"/>
+      <w:numFmt w:val="bullet"/>
+      <w:lvlText w:val=""/>
+      <w:lvlJc w:val="left"/>
+      <w:pPr>
+        <w:tabs>
+          <w:tab w:val="num" w:pos="6381"/>
+        </w:tabs>
+        <w:ind w:left="6381" w:hanging="283"/>
+      </w:pPr>
+      <w:rPr>
+        <w:rFonts w:ascii="Symbol" w:hAnsi="Symbol" w:cs="Symbol" w:hint="default"/>
+      </w:rPr>
+    </w:lvl>
+  </w:abstractNum>
+  <w:abstractNum w:abstractNumId="37">
+    <w:lvl w:ilvl="0">
+      <w:start w:val="1"/>
+      <w:numFmt w:val="bullet"/>
+      <w:lvlText w:val=""/>
+      <w:lvlJc w:val="left"/>
+      <w:pPr>
+        <w:tabs>
+          <w:tab w:val="num" w:pos="709"/>
+        </w:tabs>
+        <w:ind w:left="709" w:hanging="283"/>
+      </w:pPr>
+      <w:rPr>
+        <w:rFonts w:ascii="Symbol" w:hAnsi="Symbol" w:cs="Symbol" w:hint="default"/>
+      </w:rPr>
+    </w:lvl>
+    <w:lvl w:ilvl="1">
+      <w:start w:val="1"/>
+      <w:numFmt w:val="bullet"/>
+      <w:lvlText w:val=""/>
+      <w:lvlJc w:val="left"/>
+      <w:pPr>
+        <w:tabs>
+          <w:tab w:val="num" w:pos="1418"/>
+        </w:tabs>
+        <w:ind w:left="1418" w:hanging="283"/>
+      </w:pPr>
+      <w:rPr>
+        <w:rFonts w:ascii="Symbol" w:hAnsi="Symbol" w:cs="Symbol" w:hint="default"/>
+      </w:rPr>
+    </w:lvl>
+    <w:lvl w:ilvl="2">
+      <w:start w:val="1"/>
+      <w:numFmt w:val="bullet"/>
+      <w:lvlText w:val=""/>
+      <w:lvlJc w:val="left"/>
+      <w:pPr>
+        <w:tabs>
+          <w:tab w:val="num" w:pos="2127"/>
+        </w:tabs>
+        <w:ind w:left="2127" w:hanging="283"/>
+      </w:pPr>
+      <w:rPr>
+        <w:rFonts w:ascii="Symbol" w:hAnsi="Symbol" w:cs="Symbol" w:hint="default"/>
+      </w:rPr>
+    </w:lvl>
+    <w:lvl w:ilvl="3">
+      <w:start w:val="1"/>
+      <w:numFmt w:val="bullet"/>
+      <w:lvlText w:val=""/>
+      <w:lvlJc w:val="left"/>
+      <w:pPr>
+        <w:tabs>
+          <w:tab w:val="num" w:pos="2836"/>
+        </w:tabs>
+        <w:ind w:left="2836" w:hanging="283"/>
+      </w:pPr>
+      <w:rPr>
+        <w:rFonts w:ascii="Symbol" w:hAnsi="Symbol" w:cs="Symbol" w:hint="default"/>
+      </w:rPr>
+    </w:lvl>
+    <w:lvl w:ilvl="4">
+      <w:start w:val="1"/>
+      <w:numFmt w:val="bullet"/>
+      <w:lvlText w:val=""/>
+      <w:lvlJc w:val="left"/>
+      <w:pPr>
+        <w:tabs>
+          <w:tab w:val="num" w:pos="3545"/>
+        </w:tabs>
+        <w:ind w:left="3545" w:hanging="283"/>
+      </w:pPr>
+      <w:rPr>
+        <w:rFonts w:ascii="Symbol" w:hAnsi="Symbol" w:cs="Symbol" w:hint="default"/>
+      </w:rPr>
+    </w:lvl>
+    <w:lvl w:ilvl="5">
+      <w:start w:val="1"/>
+      <w:numFmt w:val="bullet"/>
+      <w:lvlText w:val=""/>
+      <w:lvlJc w:val="left"/>
+      <w:pPr>
+        <w:tabs>
+          <w:tab w:val="num" w:pos="4254"/>
+        </w:tabs>
+        <w:ind w:left="4254" w:hanging="283"/>
+      </w:pPr>
+      <w:rPr>
+        <w:rFonts w:ascii="Symbol" w:hAnsi="Symbol" w:cs="Symbol" w:hint="default"/>
+      </w:rPr>
+    </w:lvl>
+    <w:lvl w:ilvl="6">
+      <w:start w:val="1"/>
+      <w:numFmt w:val="bullet"/>
+      <w:lvlText w:val=""/>
+      <w:lvlJc w:val="left"/>
+      <w:pPr>
+        <w:tabs>
+          <w:tab w:val="num" w:pos="4963"/>
+        </w:tabs>
+        <w:ind w:left="4963" w:hanging="283"/>
+      </w:pPr>
+      <w:rPr>
+        <w:rFonts w:ascii="Symbol" w:hAnsi="Symbol" w:cs="Symbol" w:hint="default"/>
+      </w:rPr>
+    </w:lvl>
+    <w:lvl w:ilvl="7">
+      <w:start w:val="1"/>
+      <w:numFmt w:val="bullet"/>
+      <w:lvlText w:val=""/>
+      <w:lvlJc w:val="left"/>
+      <w:pPr>
+        <w:tabs>
+          <w:tab w:val="num" w:pos="5672"/>
+        </w:tabs>
+        <w:ind w:left="5672" w:hanging="283"/>
+      </w:pPr>
+      <w:rPr>
+        <w:rFonts w:ascii="Symbol" w:hAnsi="Symbol" w:cs="Symbol" w:hint="default"/>
+      </w:rPr>
+    </w:lvl>
+    <w:lvl w:ilvl="8">
+      <w:start w:val="1"/>
+      <w:numFmt w:val="bullet"/>
+      <w:lvlText w:val=""/>
+      <w:lvlJc w:val="left"/>
+      <w:pPr>
+        <w:tabs>
+          <w:tab w:val="num" w:pos="6381"/>
+        </w:tabs>
+        <w:ind w:left="6381" w:hanging="283"/>
+      </w:pPr>
+      <w:rPr>
+        <w:rFonts w:ascii="Symbol" w:hAnsi="Symbol" w:cs="Symbol" w:hint="default"/>
+      </w:rPr>
+    </w:lvl>
+  </w:abstractNum>
+  <w:abstractNum w:abstractNumId="38">
+    <w:lvl w:ilvl="0">
+      <w:start w:val="1"/>
+      <w:numFmt w:val="bullet"/>
+      <w:lvlText w:val=""/>
+      <w:lvlJc w:val="left"/>
+      <w:pPr>
+        <w:tabs>
+          <w:tab w:val="num" w:pos="709"/>
+        </w:tabs>
+        <w:ind w:left="709" w:hanging="283"/>
+      </w:pPr>
+      <w:rPr>
+        <w:rFonts w:ascii="Symbol" w:hAnsi="Symbol" w:cs="Symbol" w:hint="default"/>
+      </w:rPr>
+    </w:lvl>
+    <w:lvl w:ilvl="1">
+      <w:start w:val="1"/>
+      <w:numFmt w:val="bullet"/>
+      <w:lvlText w:val=""/>
+      <w:lvlJc w:val="left"/>
+      <w:pPr>
+        <w:tabs>
+          <w:tab w:val="num" w:pos="1418"/>
+        </w:tabs>
+        <w:ind w:left="1418" w:hanging="283"/>
+      </w:pPr>
+      <w:rPr>
+        <w:rFonts w:ascii="Symbol" w:hAnsi="Symbol" w:cs="Symbol" w:hint="default"/>
+      </w:rPr>
+    </w:lvl>
+    <w:lvl w:ilvl="2">
+      <w:start w:val="1"/>
+      <w:numFmt w:val="bullet"/>
+      <w:lvlText w:val=""/>
+      <w:lvlJc w:val="left"/>
+      <w:pPr>
+        <w:tabs>
+          <w:tab w:val="num" w:pos="2127"/>
+        </w:tabs>
+        <w:ind w:left="2127" w:hanging="283"/>
+      </w:pPr>
+      <w:rPr>
+        <w:rFonts w:ascii="Symbol" w:hAnsi="Symbol" w:cs="Symbol" w:hint="default"/>
+      </w:rPr>
+    </w:lvl>
+    <w:lvl w:ilvl="3">
+      <w:start w:val="1"/>
+      <w:numFmt w:val="bullet"/>
+      <w:lvlText w:val=""/>
+      <w:lvlJc w:val="left"/>
+      <w:pPr>
+        <w:tabs>
+          <w:tab w:val="num" w:pos="2836"/>
+        </w:tabs>
+        <w:ind w:left="2836" w:hanging="283"/>
+      </w:pPr>
+      <w:rPr>
+        <w:rFonts w:ascii="Symbol" w:hAnsi="Symbol" w:cs="Symbol" w:hint="default"/>
+      </w:rPr>
+    </w:lvl>
+    <w:lvl w:ilvl="4">
+      <w:start w:val="1"/>
+      <w:numFmt w:val="bullet"/>
+      <w:lvlText w:val=""/>
+      <w:lvlJc w:val="left"/>
+      <w:pPr>
+        <w:tabs>
+          <w:tab w:val="num" w:pos="3545"/>
+        </w:tabs>
+        <w:ind w:left="3545" w:hanging="283"/>
+      </w:pPr>
+      <w:rPr>
+        <w:rFonts w:ascii="Symbol" w:hAnsi="Symbol" w:cs="Symbol" w:hint="default"/>
+      </w:rPr>
+    </w:lvl>
+    <w:lvl w:ilvl="5">
+      <w:start w:val="1"/>
+      <w:numFmt w:val="bullet"/>
+      <w:lvlText w:val=""/>
+      <w:lvlJc w:val="left"/>
+      <w:pPr>
+        <w:tabs>
+          <w:tab w:val="num" w:pos="4254"/>
+        </w:tabs>
+        <w:ind w:left="4254" w:hanging="283"/>
+      </w:pPr>
+      <w:rPr>
+        <w:rFonts w:ascii="Symbol" w:hAnsi="Symbol" w:cs="Symbol" w:hint="default"/>
+      </w:rPr>
+    </w:lvl>
+    <w:lvl w:ilvl="6">
+      <w:start w:val="1"/>
+      <w:numFmt w:val="bullet"/>
+      <w:lvlText w:val=""/>
+      <w:lvlJc w:val="left"/>
+      <w:pPr>
+        <w:tabs>
+          <w:tab w:val="num" w:pos="4963"/>
+        </w:tabs>
+        <w:ind w:left="4963" w:hanging="283"/>
+      </w:pPr>
+      <w:rPr>
+        <w:rFonts w:ascii="Symbol" w:hAnsi="Symbol" w:cs="Symbol" w:hint="default"/>
+      </w:rPr>
+    </w:lvl>
+    <w:lvl w:ilvl="7">
+      <w:start w:val="1"/>
+      <w:numFmt w:val="bullet"/>
+      <w:lvlText w:val=""/>
+      <w:lvlJc w:val="left"/>
+      <w:pPr>
+        <w:tabs>
+          <w:tab w:val="num" w:pos="5672"/>
+        </w:tabs>
+        <w:ind w:left="5672" w:hanging="283"/>
+      </w:pPr>
+      <w:rPr>
+        <w:rFonts w:ascii="Symbol" w:hAnsi="Symbol" w:cs="Symbol" w:hint="default"/>
+      </w:rPr>
+    </w:lvl>
+    <w:lvl w:ilvl="8">
+      <w:start w:val="1"/>
+      <w:numFmt w:val="bullet"/>
+      <w:lvlText w:val=""/>
+      <w:lvlJc w:val="left"/>
+      <w:pPr>
+        <w:tabs>
+          <w:tab w:val="num" w:pos="6381"/>
+        </w:tabs>
+        <w:ind w:left="6381" w:hanging="283"/>
+      </w:pPr>
+      <w:rPr>
+        <w:rFonts w:ascii="Symbol" w:hAnsi="Symbol" w:cs="Symbol" w:hint="default"/>
+      </w:rPr>
+    </w:lvl>
+  </w:abstractNum>
+  <w:abstractNum w:abstractNumId="39">
+    <w:lvl w:ilvl="0">
+      <w:start w:val="1"/>
       <w:numFmt w:val="none"/>
       <w:suff w:val="nothing"/>
       <w:lvlText w:val=""/>
@@ -12464,6 +13399,7 @@
     </w:lvl>
     <w:lvl w:ilvl="3">
       <w:start w:val="1"/>
+      <w:pStyle w:val="Heading4"/>
       <w:numFmt w:val="none"/>
       <w:suff w:val="nothing"/>
       <w:lvlText w:val=""/>
@@ -12646,6 +13582,18 @@
   <w:num w:numId="35">
     <w:abstractNumId w:val="35"/>
   </w:num>
+  <w:num w:numId="36">
+    <w:abstractNumId w:val="36"/>
+  </w:num>
+  <w:num w:numId="37">
+    <w:abstractNumId w:val="37"/>
+  </w:num>
+  <w:num w:numId="38">
+    <w:abstractNumId w:val="38"/>
+  </w:num>
+  <w:num w:numId="39">
+    <w:abstractNumId w:val="39"/>
+  </w:num>
 </w:numbering>
 </file>
 
@@ -12673,7 +13621,7 @@
     <w:pPr>
       <w:widowControl/>
       <w:suppressAutoHyphens w:val="true"/>
-      <w:overflowPunct w:val="true"/>
+      <w:overflowPunct w:val="false"/>
       <w:bidi w:val="0"/>
       <w:spacing w:before="0" w:after="0"/>
       <w:jc w:val="left"/>
@@ -12725,6 +13673,23 @@
       <w:bCs/>
       <w:sz w:val="28"/>
       <w:szCs w:val="28"/>
+    </w:rPr>
+  </w:style>
+  <w:style w:type="paragraph" w:styleId="Heading4">
+    <w:name w:val="Heading 4"/>
+    <w:basedOn w:val="Heading"/>
+    <w:next w:val="TextBody"/>
+    <w:qFormat/>
+    <w:pPr>
+      <w:spacing w:before="120" w:after="120"/>
+      <w:outlineLvl w:val="3"/>
+    </w:pPr>
+    <w:rPr>
+      <w:rFonts w:ascii="Liberation Serif" w:hAnsi="Liberation Serif" w:eastAsia="Noto Serif CJK SC" w:cs="Noto Sans Devanagari"/>
+      <w:b/>
+      <w:bCs/>
+      <w:sz w:val="24"/>
+      <w:szCs w:val="24"/>
     </w:rPr>
   </w:style>
   <w:style w:type="character" w:styleId="DefaultParagraphFont">
@@ -12870,7 +13835,7 @@
     <w:pPr>
       <w:widowControl/>
       <w:suppressAutoHyphens w:val="true"/>
-      <w:overflowPunct w:val="true"/>
+      <w:overflowPunct w:val="false"/>
       <w:bidi w:val="0"/>
       <w:spacing w:lineRule="auto" w:line="240" w:before="0" w:after="0"/>
       <w:jc w:val="left"/>

</xml_diff>

<commit_message>
corregir links en vistas y agregar test de diagnostico
</commit_message>
<xml_diff>
--- a/Documentacion/Manual de Usuario.docx
+++ b/Documentacion/Manual de Usuario.docx
@@ -20,9 +20,7 @@
       </w:r>
       <w:bookmarkEnd w:id="0"/>
       <w:r>
-        <w:rPr>
-          <w:lang w:val="es-VE"/>
-        </w:rPr>
+        <w:rPr/>
         <w:drawing>
           <wp:inline distT="0" distB="0" distL="0" distR="0">
             <wp:extent cx="5943600" cy="7063740"/>
@@ -175,7 +173,7 @@
       <w:pPr>
         <w:pStyle w:val="Normal"/>
         <w:suppressAutoHyphens w:val="true"/>
-        <w:overflowPunct w:val="false"/>
+        <w:overflowPunct w:val="true"/>
         <w:bidi w:val="0"/>
         <w:spacing w:lineRule="auto" w:line="240" w:before="0" w:after="0"/>
         <w:jc w:val="left"/>
@@ -199,7 +197,7 @@
       <w:pPr>
         <w:pStyle w:val="Normal"/>
         <w:suppressAutoHyphens w:val="true"/>
-        <w:overflowPunct w:val="false"/>
+        <w:overflowPunct w:val="true"/>
         <w:bidi w:val="0"/>
         <w:spacing w:lineRule="auto" w:line="240" w:before="0" w:after="0"/>
         <w:jc w:val="left"/>
@@ -225,7 +223,7 @@
       <w:pPr>
         <w:pStyle w:val="Normal"/>
         <w:suppressAutoHyphens w:val="true"/>
-        <w:overflowPunct w:val="false"/>
+        <w:overflowPunct w:val="true"/>
         <w:bidi w:val="0"/>
         <w:spacing w:lineRule="auto" w:line="240" w:before="0" w:after="0"/>
         <w:ind w:left="0" w:right="0" w:firstLine="360"/>
@@ -254,7 +252,7 @@
           <w:numId w:val="1"/>
         </w:numPr>
         <w:suppressAutoHyphens w:val="true"/>
-        <w:overflowPunct w:val="false"/>
+        <w:overflowPunct w:val="true"/>
         <w:bidi w:val="0"/>
         <w:spacing w:lineRule="auto" w:line="240" w:before="0" w:after="140"/>
         <w:jc w:val="both"/>
@@ -292,7 +290,7 @@
           <w:numId w:val="1"/>
         </w:numPr>
         <w:suppressAutoHyphens w:val="true"/>
-        <w:overflowPunct w:val="false"/>
+        <w:overflowPunct w:val="true"/>
         <w:bidi w:val="0"/>
         <w:spacing w:lineRule="auto" w:line="240" w:before="0" w:after="140"/>
         <w:jc w:val="both"/>
@@ -319,7 +317,7 @@
           <w:numId w:val="1"/>
         </w:numPr>
         <w:suppressAutoHyphens w:val="true"/>
-        <w:overflowPunct w:val="false"/>
+        <w:overflowPunct w:val="true"/>
         <w:bidi w:val="0"/>
         <w:spacing w:lineRule="auto" w:line="240" w:before="0" w:after="140"/>
         <w:jc w:val="both"/>
@@ -342,7 +340,7 @@
       <w:pPr>
         <w:pStyle w:val="Normal"/>
         <w:suppressAutoHyphens w:val="true"/>
-        <w:overflowPunct w:val="false"/>
+        <w:overflowPunct w:val="true"/>
         <w:bidi w:val="0"/>
         <w:spacing w:lineRule="auto" w:line="240" w:before="0" w:after="0"/>
         <w:jc w:val="left"/>
@@ -439,7 +437,7 @@
       <w:pPr>
         <w:pStyle w:val="Normal"/>
         <w:suppressAutoHyphens w:val="true"/>
-        <w:overflowPunct w:val="false"/>
+        <w:overflowPunct w:val="true"/>
         <w:bidi w:val="0"/>
         <w:spacing w:lineRule="auto" w:line="240" w:before="0" w:after="0"/>
         <w:jc w:val="left"/>
@@ -474,7 +472,7 @@
       <w:pPr>
         <w:pStyle w:val="Normal"/>
         <w:suppressAutoHyphens w:val="true"/>
-        <w:overflowPunct w:val="false"/>
+        <w:overflowPunct w:val="true"/>
         <w:bidi w:val="0"/>
         <w:spacing w:lineRule="auto" w:line="240" w:before="0" w:after="0"/>
         <w:ind w:left="0" w:right="0" w:firstLine="360"/>
@@ -502,7 +500,7 @@
           <w:numId w:val="2"/>
         </w:numPr>
         <w:suppressAutoHyphens w:val="true"/>
-        <w:overflowPunct w:val="false"/>
+        <w:overflowPunct w:val="true"/>
         <w:bidi w:val="0"/>
         <w:spacing w:lineRule="auto" w:line="240" w:before="0" w:after="0"/>
         <w:jc w:val="both"/>
@@ -530,7 +528,7 @@
           <w:numId w:val="2"/>
         </w:numPr>
         <w:suppressAutoHyphens w:val="true"/>
-        <w:overflowPunct w:val="false"/>
+        <w:overflowPunct w:val="true"/>
         <w:bidi w:val="0"/>
         <w:spacing w:lineRule="auto" w:line="240" w:before="0" w:after="0"/>
         <w:jc w:val="both"/>
@@ -578,7 +576,7 @@
           <w:numId w:val="2"/>
         </w:numPr>
         <w:suppressAutoHyphens w:val="true"/>
-        <w:overflowPunct w:val="false"/>
+        <w:overflowPunct w:val="true"/>
         <w:bidi w:val="0"/>
         <w:spacing w:lineRule="auto" w:line="240" w:before="0" w:after="0"/>
         <w:jc w:val="both"/>
@@ -626,7 +624,7 @@
           <w:numId w:val="2"/>
         </w:numPr>
         <w:suppressAutoHyphens w:val="true"/>
-        <w:overflowPunct w:val="false"/>
+        <w:overflowPunct w:val="true"/>
         <w:bidi w:val="0"/>
         <w:spacing w:lineRule="auto" w:line="240" w:before="0" w:after="0"/>
         <w:jc w:val="both"/>
@@ -674,7 +672,7 @@
           <w:numId w:val="2"/>
         </w:numPr>
         <w:suppressAutoHyphens w:val="true"/>
-        <w:overflowPunct w:val="false"/>
+        <w:overflowPunct w:val="true"/>
         <w:bidi w:val="0"/>
         <w:spacing w:lineRule="auto" w:line="240" w:before="0" w:after="0"/>
         <w:jc w:val="both"/>
@@ -718,7 +716,7 @@
       <w:pPr>
         <w:pStyle w:val="Normal"/>
         <w:suppressAutoHyphens w:val="true"/>
-        <w:overflowPunct w:val="false"/>
+        <w:overflowPunct w:val="true"/>
         <w:bidi w:val="0"/>
         <w:spacing w:lineRule="auto" w:line="240" w:before="0" w:after="0"/>
         <w:jc w:val="both"/>
@@ -744,7 +742,7 @@
       <w:pPr>
         <w:pStyle w:val="Normal"/>
         <w:suppressAutoHyphens w:val="true"/>
-        <w:overflowPunct w:val="false"/>
+        <w:overflowPunct w:val="true"/>
         <w:bidi w:val="0"/>
         <w:spacing w:lineRule="auto" w:line="240" w:before="0" w:after="0"/>
         <w:jc w:val="both"/>
@@ -770,7 +768,7 @@
       <w:pPr>
         <w:pStyle w:val="Normal"/>
         <w:suppressAutoHyphens w:val="true"/>
-        <w:overflowPunct w:val="false"/>
+        <w:overflowPunct w:val="true"/>
         <w:bidi w:val="0"/>
         <w:spacing w:lineRule="auto" w:line="240" w:before="0" w:after="0"/>
         <w:jc w:val="both"/>
@@ -796,7 +794,7 @@
       <w:pPr>
         <w:pStyle w:val="Normal"/>
         <w:suppressAutoHyphens w:val="true"/>
-        <w:overflowPunct w:val="false"/>
+        <w:overflowPunct w:val="true"/>
         <w:bidi w:val="0"/>
         <w:spacing w:lineRule="auto" w:line="240" w:before="0" w:after="0"/>
         <w:jc w:val="left"/>
@@ -1013,7 +1011,7 @@
       <w:pPr>
         <w:pStyle w:val="Normal"/>
         <w:suppressAutoHyphens w:val="true"/>
-        <w:overflowPunct w:val="false"/>
+        <w:overflowPunct w:val="true"/>
         <w:bidi w:val="0"/>
         <w:spacing w:lineRule="auto" w:line="240" w:before="0" w:after="0"/>
         <w:jc w:val="left"/>
@@ -1046,7 +1044,7 @@
       <w:pPr>
         <w:pStyle w:val="Normal"/>
         <w:suppressAutoHyphens w:val="true"/>
-        <w:overflowPunct w:val="false"/>
+        <w:overflowPunct w:val="true"/>
         <w:bidi w:val="0"/>
         <w:spacing w:lineRule="auto" w:line="240" w:before="0" w:after="0"/>
         <w:ind w:left="0" w:right="0" w:firstLine="360"/>
@@ -1074,7 +1072,7 @@
           <w:numId w:val="3"/>
         </w:numPr>
         <w:suppressAutoHyphens w:val="true"/>
-        <w:overflowPunct w:val="false"/>
+        <w:overflowPunct w:val="true"/>
         <w:bidi w:val="0"/>
         <w:spacing w:lineRule="auto" w:line="240" w:before="0" w:after="0"/>
         <w:jc w:val="both"/>
@@ -1101,7 +1099,7 @@
           <w:numId w:val="3"/>
         </w:numPr>
         <w:suppressAutoHyphens w:val="true"/>
-        <w:overflowPunct w:val="false"/>
+        <w:overflowPunct w:val="true"/>
         <w:bidi w:val="0"/>
         <w:spacing w:lineRule="auto" w:line="240" w:before="0" w:after="0"/>
         <w:jc w:val="both"/>
@@ -1128,7 +1126,7 @@
           <w:numId w:val="3"/>
         </w:numPr>
         <w:suppressAutoHyphens w:val="true"/>
-        <w:overflowPunct w:val="false"/>
+        <w:overflowPunct w:val="true"/>
         <w:bidi w:val="0"/>
         <w:spacing w:lineRule="auto" w:line="240" w:before="0" w:after="0"/>
         <w:jc w:val="both"/>
@@ -1155,7 +1153,7 @@
           <w:numId w:val="3"/>
         </w:numPr>
         <w:suppressAutoHyphens w:val="true"/>
-        <w:overflowPunct w:val="false"/>
+        <w:overflowPunct w:val="true"/>
         <w:bidi w:val="0"/>
         <w:spacing w:lineRule="auto" w:line="240" w:before="0" w:after="0"/>
         <w:jc w:val="both"/>
@@ -1178,7 +1176,7 @@
       <w:pPr>
         <w:pStyle w:val="Normal"/>
         <w:suppressAutoHyphens w:val="true"/>
-        <w:overflowPunct w:val="false"/>
+        <w:overflowPunct w:val="true"/>
         <w:bidi w:val="0"/>
         <w:spacing w:lineRule="auto" w:line="240" w:before="0" w:after="0"/>
         <w:jc w:val="left"/>
@@ -1211,7 +1209,7 @@
       <w:pPr>
         <w:pStyle w:val="Normal"/>
         <w:suppressAutoHyphens w:val="true"/>
-        <w:overflowPunct w:val="false"/>
+        <w:overflowPunct w:val="true"/>
         <w:bidi w:val="0"/>
         <w:spacing w:lineRule="auto" w:line="240" w:before="0" w:after="0"/>
         <w:jc w:val="left"/>
@@ -1244,7 +1242,7 @@
       <w:pPr>
         <w:pStyle w:val="Normal"/>
         <w:suppressAutoHyphens w:val="true"/>
-        <w:overflowPunct w:val="false"/>
+        <w:overflowPunct w:val="true"/>
         <w:bidi w:val="0"/>
         <w:spacing w:lineRule="auto" w:line="240" w:before="0" w:after="0"/>
         <w:jc w:val="left"/>
@@ -1277,7 +1275,7 @@
       <w:pPr>
         <w:pStyle w:val="Normal"/>
         <w:suppressAutoHyphens w:val="true"/>
-        <w:overflowPunct w:val="false"/>
+        <w:overflowPunct w:val="true"/>
         <w:bidi w:val="0"/>
         <w:spacing w:lineRule="auto" w:line="240" w:before="0" w:after="0"/>
         <w:jc w:val="left"/>
@@ -1310,7 +1308,7 @@
       <w:pPr>
         <w:pStyle w:val="Normal"/>
         <w:suppressAutoHyphens w:val="true"/>
-        <w:overflowPunct w:val="false"/>
+        <w:overflowPunct w:val="true"/>
         <w:bidi w:val="0"/>
         <w:spacing w:lineRule="auto" w:line="240" w:before="0" w:after="0"/>
         <w:jc w:val="left"/>
@@ -1343,7 +1341,7 @@
       <w:pPr>
         <w:pStyle w:val="Normal"/>
         <w:suppressAutoHyphens w:val="true"/>
-        <w:overflowPunct w:val="false"/>
+        <w:overflowPunct w:val="true"/>
         <w:bidi w:val="0"/>
         <w:spacing w:lineRule="auto" w:line="240" w:before="0" w:after="0"/>
         <w:jc w:val="left"/>
@@ -1376,7 +1374,7 @@
       <w:pPr>
         <w:pStyle w:val="Normal"/>
         <w:suppressAutoHyphens w:val="true"/>
-        <w:overflowPunct w:val="false"/>
+        <w:overflowPunct w:val="true"/>
         <w:bidi w:val="0"/>
         <w:spacing w:lineRule="auto" w:line="240" w:before="0" w:after="0"/>
         <w:jc w:val="left"/>
@@ -1409,7 +1407,7 @@
       <w:pPr>
         <w:pStyle w:val="Normal"/>
         <w:suppressAutoHyphens w:val="true"/>
-        <w:overflowPunct w:val="false"/>
+        <w:overflowPunct w:val="true"/>
         <w:bidi w:val="0"/>
         <w:spacing w:lineRule="auto" w:line="240" w:before="0" w:after="0"/>
         <w:jc w:val="left"/>
@@ -1442,7 +1440,7 @@
       <w:pPr>
         <w:pStyle w:val="Normal"/>
         <w:suppressAutoHyphens w:val="true"/>
-        <w:overflowPunct w:val="false"/>
+        <w:overflowPunct w:val="true"/>
         <w:bidi w:val="0"/>
         <w:spacing w:lineRule="auto" w:line="240" w:before="0" w:after="0"/>
         <w:jc w:val="left"/>
@@ -1539,7 +1537,7 @@
       <w:pPr>
         <w:pStyle w:val="Normal"/>
         <w:suppressAutoHyphens w:val="true"/>
-        <w:overflowPunct w:val="false"/>
+        <w:overflowPunct w:val="true"/>
         <w:bidi w:val="0"/>
         <w:spacing w:lineRule="auto" w:line="240" w:before="0" w:after="0"/>
         <w:jc w:val="left"/>
@@ -1562,7 +1560,7 @@
       <w:pPr>
         <w:pStyle w:val="Normal"/>
         <w:suppressAutoHyphens w:val="true"/>
-        <w:overflowPunct w:val="false"/>
+        <w:overflowPunct w:val="true"/>
         <w:bidi w:val="0"/>
         <w:spacing w:lineRule="auto" w:line="240" w:before="0" w:after="0"/>
         <w:jc w:val="left"/>
@@ -1588,7 +1586,7 @@
       <w:pPr>
         <w:pStyle w:val="Normal"/>
         <w:suppressAutoHyphens w:val="true"/>
-        <w:overflowPunct w:val="false"/>
+        <w:overflowPunct w:val="true"/>
         <w:bidi w:val="0"/>
         <w:spacing w:lineRule="auto" w:line="240" w:before="0" w:after="0"/>
         <w:jc w:val="left"/>
@@ -1681,7 +1679,7 @@
       <w:pPr>
         <w:pStyle w:val="Normal"/>
         <w:suppressAutoHyphens w:val="true"/>
-        <w:overflowPunct w:val="false"/>
+        <w:overflowPunct w:val="true"/>
         <w:bidi w:val="0"/>
         <w:spacing w:lineRule="auto" w:line="240" w:before="0" w:after="0"/>
         <w:jc w:val="left"/>
@@ -1704,7 +1702,7 @@
       <w:pPr>
         <w:pStyle w:val="Normal"/>
         <w:suppressAutoHyphens w:val="true"/>
-        <w:overflowPunct w:val="false"/>
+        <w:overflowPunct w:val="true"/>
         <w:bidi w:val="0"/>
         <w:spacing w:lineRule="auto" w:line="240" w:before="0" w:after="0"/>
         <w:jc w:val="left"/>
@@ -1730,7 +1728,7 @@
       <w:pPr>
         <w:pStyle w:val="Normal"/>
         <w:suppressAutoHyphens w:val="true"/>
-        <w:overflowPunct w:val="false"/>
+        <w:overflowPunct w:val="true"/>
         <w:bidi w:val="0"/>
         <w:spacing w:lineRule="auto" w:line="240" w:before="0" w:after="140"/>
         <w:ind w:left="0" w:right="0" w:firstLine="708"/>
@@ -1790,7 +1788,7 @@
           <w:tab w:val="left" w:pos="0" w:leader="none"/>
         </w:tabs>
         <w:suppressAutoHyphens w:val="true"/>
-        <w:overflowPunct w:val="false"/>
+        <w:overflowPunct w:val="true"/>
         <w:bidi w:val="0"/>
         <w:spacing w:lineRule="auto" w:line="240" w:before="0" w:after="140"/>
         <w:jc w:val="both"/>
@@ -1821,7 +1819,7 @@
           <w:tab w:val="left" w:pos="0" w:leader="none"/>
         </w:tabs>
         <w:suppressAutoHyphens w:val="true"/>
-        <w:overflowPunct w:val="false"/>
+        <w:overflowPunct w:val="true"/>
         <w:bidi w:val="0"/>
         <w:spacing w:lineRule="auto" w:line="240" w:before="0" w:after="140"/>
         <w:jc w:val="both"/>
@@ -1852,7 +1850,7 @@
           <w:tab w:val="left" w:pos="0" w:leader="none"/>
         </w:tabs>
         <w:suppressAutoHyphens w:val="true"/>
-        <w:overflowPunct w:val="false"/>
+        <w:overflowPunct w:val="true"/>
         <w:bidi w:val="0"/>
         <w:spacing w:lineRule="auto" w:line="240" w:before="0" w:after="140"/>
         <w:jc w:val="both"/>
@@ -1883,7 +1881,7 @@
           <w:tab w:val="left" w:pos="0" w:leader="none"/>
         </w:tabs>
         <w:suppressAutoHyphens w:val="true"/>
-        <w:overflowPunct w:val="false"/>
+        <w:overflowPunct w:val="true"/>
         <w:bidi w:val="0"/>
         <w:spacing w:lineRule="auto" w:line="240" w:before="0" w:after="140"/>
         <w:jc w:val="both"/>
@@ -1910,7 +1908,7 @@
           <w:tab w:val="left" w:pos="0" w:leader="none"/>
         </w:tabs>
         <w:suppressAutoHyphens w:val="true"/>
-        <w:overflowPunct w:val="false"/>
+        <w:overflowPunct w:val="true"/>
         <w:bidi w:val="0"/>
         <w:spacing w:lineRule="auto" w:line="240" w:before="0" w:after="140"/>
         <w:jc w:val="both"/>
@@ -1998,7 +1996,7 @@
       <w:pPr>
         <w:pStyle w:val="Normal"/>
         <w:suppressAutoHyphens w:val="true"/>
-        <w:overflowPunct w:val="false"/>
+        <w:overflowPunct w:val="true"/>
         <w:bidi w:val="0"/>
         <w:spacing w:lineRule="auto" w:line="240" w:before="0" w:after="0"/>
         <w:jc w:val="left"/>
@@ -2022,7 +2020,7 @@
       <w:pPr>
         <w:pStyle w:val="Normal"/>
         <w:suppressAutoHyphens w:val="true"/>
-        <w:overflowPunct w:val="false"/>
+        <w:overflowPunct w:val="true"/>
         <w:bidi w:val="0"/>
         <w:spacing w:lineRule="auto" w:line="240" w:before="0" w:after="0"/>
         <w:jc w:val="left"/>
@@ -2050,7 +2048,7 @@
       <w:pPr>
         <w:pStyle w:val="Normal"/>
         <w:suppressAutoHyphens w:val="true"/>
-        <w:overflowPunct w:val="false"/>
+        <w:overflowPunct w:val="true"/>
         <w:bidi w:val="0"/>
         <w:spacing w:lineRule="auto" w:line="240" w:before="0" w:after="140"/>
         <w:ind w:left="0" w:right="0" w:firstLine="708"/>
@@ -2149,7 +2147,7 @@
       <w:pPr>
         <w:pStyle w:val="Normal"/>
         <w:suppressAutoHyphens w:val="true"/>
-        <w:overflowPunct w:val="false"/>
+        <w:overflowPunct w:val="true"/>
         <w:bidi w:val="0"/>
         <w:spacing w:lineRule="auto" w:line="240" w:before="0" w:after="0"/>
         <w:jc w:val="left"/>
@@ -2173,7 +2171,7 @@
       <w:pPr>
         <w:pStyle w:val="Normal"/>
         <w:suppressAutoHyphens w:val="true"/>
-        <w:overflowPunct w:val="false"/>
+        <w:overflowPunct w:val="true"/>
         <w:bidi w:val="0"/>
         <w:spacing w:lineRule="auto" w:line="240" w:before="0" w:after="140"/>
         <w:ind w:left="0" w:right="0" w:firstLine="426"/>
@@ -2206,7 +2204,7 @@
           <w:tab w:val="left" w:pos="0" w:leader="none"/>
         </w:tabs>
         <w:suppressAutoHyphens w:val="true"/>
-        <w:overflowPunct w:val="false"/>
+        <w:overflowPunct w:val="true"/>
         <w:bidi w:val="0"/>
         <w:spacing w:lineRule="auto" w:line="240" w:before="0" w:after="140"/>
         <w:jc w:val="left"/>
@@ -2237,7 +2235,7 @@
           <w:tab w:val="left" w:pos="0" w:leader="none"/>
         </w:tabs>
         <w:suppressAutoHyphens w:val="true"/>
-        <w:overflowPunct w:val="false"/>
+        <w:overflowPunct w:val="true"/>
         <w:bidi w:val="0"/>
         <w:spacing w:lineRule="auto" w:line="240" w:before="0" w:after="140"/>
         <w:jc w:val="left"/>
@@ -2268,7 +2266,7 @@
           <w:tab w:val="left" w:pos="0" w:leader="none"/>
         </w:tabs>
         <w:suppressAutoHyphens w:val="true"/>
-        <w:overflowPunct w:val="false"/>
+        <w:overflowPunct w:val="true"/>
         <w:bidi w:val="0"/>
         <w:spacing w:lineRule="auto" w:line="240" w:before="0" w:after="140"/>
         <w:jc w:val="left"/>
@@ -2299,7 +2297,7 @@
           <w:tab w:val="left" w:pos="0" w:leader="none"/>
         </w:tabs>
         <w:suppressAutoHyphens w:val="true"/>
-        <w:overflowPunct w:val="false"/>
+        <w:overflowPunct w:val="true"/>
         <w:bidi w:val="0"/>
         <w:spacing w:lineRule="auto" w:line="240" w:before="0" w:after="140"/>
         <w:jc w:val="left"/>
@@ -2322,7 +2320,7 @@
       <w:pPr>
         <w:pStyle w:val="Normal"/>
         <w:suppressAutoHyphens w:val="true"/>
-        <w:overflowPunct w:val="false"/>
+        <w:overflowPunct w:val="true"/>
         <w:bidi w:val="0"/>
         <w:spacing w:lineRule="auto" w:line="240" w:before="0" w:after="0"/>
         <w:jc w:val="left"/>
@@ -2348,7 +2346,7 @@
       <w:pPr>
         <w:pStyle w:val="Normal"/>
         <w:suppressAutoHyphens w:val="true"/>
-        <w:overflowPunct w:val="false"/>
+        <w:overflowPunct w:val="true"/>
         <w:bidi w:val="0"/>
         <w:spacing w:lineRule="auto" w:line="240" w:before="240" w:after="0"/>
         <w:jc w:val="left"/>
@@ -2411,7 +2409,7 @@
       <w:pPr>
         <w:pStyle w:val="Normal"/>
         <w:suppressAutoHyphens w:val="true"/>
-        <w:overflowPunct w:val="false"/>
+        <w:overflowPunct w:val="true"/>
         <w:bidi w:val="0"/>
         <w:spacing w:lineRule="auto" w:line="240" w:before="240" w:after="0"/>
         <w:jc w:val="left"/>
@@ -2443,7 +2441,7 @@
       <w:pPr>
         <w:pStyle w:val="Normal"/>
         <w:suppressAutoHyphens w:val="true"/>
-        <w:overflowPunct w:val="false"/>
+        <w:overflowPunct w:val="true"/>
         <w:bidi w:val="0"/>
         <w:spacing w:lineRule="auto" w:line="240" w:before="0" w:after="0"/>
         <w:jc w:val="left"/>
@@ -2467,7 +2465,7 @@
       <w:pPr>
         <w:pStyle w:val="Normal"/>
         <w:suppressAutoHyphens w:val="true"/>
-        <w:overflowPunct w:val="false"/>
+        <w:overflowPunct w:val="true"/>
         <w:bidi w:val="0"/>
         <w:spacing w:lineRule="auto" w:line="240" w:before="0" w:after="0"/>
         <w:jc w:val="left"/>
@@ -2493,7 +2491,7 @@
       <w:pPr>
         <w:pStyle w:val="Normal"/>
         <w:suppressAutoHyphens w:val="true"/>
-        <w:overflowPunct w:val="false"/>
+        <w:overflowPunct w:val="true"/>
         <w:bidi w:val="0"/>
         <w:spacing w:lineRule="auto" w:line="240" w:before="0" w:after="140"/>
         <w:ind w:left="0" w:right="0" w:firstLine="360"/>
@@ -2522,7 +2520,7 @@
           <w:numId w:val="6"/>
         </w:numPr>
         <w:suppressAutoHyphens w:val="true"/>
-        <w:overflowPunct w:val="false"/>
+        <w:overflowPunct w:val="true"/>
         <w:bidi w:val="0"/>
         <w:spacing w:lineRule="auto" w:line="240" w:before="0" w:after="140"/>
         <w:jc w:val="both"/>
@@ -2549,7 +2547,7 @@
           <w:numId w:val="6"/>
         </w:numPr>
         <w:suppressAutoHyphens w:val="true"/>
-        <w:overflowPunct w:val="false"/>
+        <w:overflowPunct w:val="true"/>
         <w:bidi w:val="0"/>
         <w:spacing w:lineRule="auto" w:line="240" w:before="0" w:after="140"/>
         <w:jc w:val="both"/>
@@ -2576,7 +2574,7 @@
           <w:numId w:val="6"/>
         </w:numPr>
         <w:suppressAutoHyphens w:val="true"/>
-        <w:overflowPunct w:val="false"/>
+        <w:overflowPunct w:val="true"/>
         <w:bidi w:val="0"/>
         <w:spacing w:lineRule="auto" w:line="240" w:before="0" w:after="140"/>
         <w:jc w:val="both"/>
@@ -2603,7 +2601,7 @@
           <w:numId w:val="6"/>
         </w:numPr>
         <w:suppressAutoHyphens w:val="true"/>
-        <w:overflowPunct w:val="false"/>
+        <w:overflowPunct w:val="true"/>
         <w:bidi w:val="0"/>
         <w:spacing w:lineRule="auto" w:line="240" w:before="0" w:after="140"/>
         <w:jc w:val="both"/>
@@ -2630,7 +2628,7 @@
           <w:numId w:val="6"/>
         </w:numPr>
         <w:suppressAutoHyphens w:val="true"/>
-        <w:overflowPunct w:val="false"/>
+        <w:overflowPunct w:val="true"/>
         <w:bidi w:val="0"/>
         <w:spacing w:lineRule="auto" w:line="240" w:before="0" w:after="140"/>
         <w:jc w:val="both"/>
@@ -2653,7 +2651,7 @@
       <w:pPr>
         <w:pStyle w:val="Normal"/>
         <w:suppressAutoHyphens w:val="true"/>
-        <w:overflowPunct w:val="false"/>
+        <w:overflowPunct w:val="true"/>
         <w:bidi w:val="0"/>
         <w:spacing w:lineRule="auto" w:line="240" w:before="0" w:after="140"/>
         <w:jc w:val="both"/>
@@ -6465,11 +6463,15 @@
         <w:ind w:left="0" w:hanging="0"/>
         <w:jc w:val="left"/>
         <w:rPr>
-          <w:lang w:val="es-VE"/>
-        </w:rPr>
-      </w:pPr>
-      <w:r>
-        <w:rPr>
+          <w:b/>
+          <w:sz w:val="32"/>
+          <w:szCs w:val="32"/>
+          <w:lang w:val="es-VE"/>
+        </w:rPr>
+      </w:pPr>
+      <w:r>
+        <w:rPr>
+          <w:rFonts w:ascii="Liberation Serif" w:hAnsi="Liberation Serif"/>
           <w:b/>
           <w:bCs/>
           <w:position w:val="0"/>
@@ -6479,51 +6481,97 @@
           <w:vertAlign w:val="baseline"/>
           <w:lang w:val="es-VE" w:eastAsia="zxx" w:bidi="zxx"/>
         </w:rPr>
-        <w:t>Porque si tengo instalado LibreOffice sigue sin generar PDFs, solo archivos Word .docx?</w:t>
-      </w:r>
-    </w:p>
-    <w:p>
-      <w:pPr>
-        <w:pStyle w:val="TextBody"/>
-        <w:numPr>
-          <w:ilvl w:val="0"/>
-          <w:numId w:val="0"/>
-        </w:numPr>
-        <w:tabs>
-          <w:tab w:val="left" w:pos="709" w:leader="none"/>
-        </w:tabs>
-        <w:bidi w:val="0"/>
-        <w:spacing w:lineRule="auto" w:line="240"/>
-        <w:ind w:left="0" w:hanging="0"/>
-        <w:jc w:val="left"/>
-        <w:rPr>
-          <w:lang w:val="es-VE"/>
-        </w:rPr>
-      </w:pPr>
-      <w:r>
-        <w:rPr>
+        <w:t>¿Por qué el sistema genera archivos Word (.docx) en lugar de PDFs si tengo instalado LibreOffice?</w:t>
+      </w:r>
+    </w:p>
+    <w:p>
+      <w:pPr>
+        <w:pStyle w:val="TextBody"/>
+        <w:rPr>
+          <w:lang w:val="es-VE"/>
+        </w:rPr>
+      </w:pPr>
+      <w:r>
+        <w:rPr>
+          <w:lang w:val="es-VE"/>
+        </w:rPr>
+        <w:t xml:space="preserve">Esto sucede debido a un fallo en la integración con LibreOffice. Para obtener más información sobre el error, diríjase al menú </w:t>
+      </w:r>
+      <w:r>
+        <w:rPr>
+          <w:b/>
+          <w:lang w:val="es-VE"/>
+        </w:rPr>
+        <w:t>Administración</w:t>
+      </w:r>
+      <w:r>
+        <w:rPr>
+          <w:lang w:val="es-VE"/>
+        </w:rPr>
+        <w:t xml:space="preserve"> y seleccione </w:t>
+      </w:r>
+      <w:r>
+        <w:rPr>
+          <w:lang w:val="es-VE"/>
+        </w:rPr>
+        <w:t>el bot</w:t>
+      </w:r>
+      <w:r>
+        <w:rPr>
+          <w:rFonts w:eastAsia="Noto Serif CJK SC" w:cs="Noto Sans Devanagari"/>
+          <w:color w:val="auto"/>
+          <w:kern w:val="2"/>
           <w:sz w:val="24"/>
           <w:szCs w:val="24"/>
-          <w:lang w:val="es-VE" w:eastAsia="zxx" w:bidi="zxx"/>
-        </w:rPr>
-        <w:t>Esto es por</w:t>
-      </w:r>
-      <w:r>
-        <w:rPr>
-          <w:sz w:val="24"/>
-          <w:szCs w:val="24"/>
-          <w:lang w:val="es-VE" w:eastAsia="zxx" w:bidi="zxx"/>
-        </w:rPr>
-        <w:t xml:space="preserve">que ocurrio algun fallo relacionado con LibreOffice, asegurese que el usuario que corra el servicio de apache sea </w:t>
-      </w:r>
-      <w:r>
-        <w:rPr>
-          <w:rFonts w:ascii="Liberation Mono" w:hAnsi="Liberation Mono"/>
-          <w:sz w:val="24"/>
-          <w:szCs w:val="24"/>
-          <w:lang w:val="es-VE" w:eastAsia="zxx" w:bidi="zxx"/>
-        </w:rPr>
-        <w:t>nt authority\system</w:t>
+          <w:lang w:val="es-VE" w:eastAsia="zh-CN" w:bidi="hi-IN"/>
+        </w:rPr>
+        <w:t>ón</w:t>
+      </w:r>
+      <w:r>
+        <w:rPr>
+          <w:lang w:val="es-VE"/>
+        </w:rPr>
+        <w:t xml:space="preserve"> </w:t>
+      </w:r>
+      <w:r>
+        <w:rPr>
+          <w:b/>
+          <w:lang w:val="es-VE"/>
+        </w:rPr>
+        <w:t>Mostrar Test de Diagnóstico</w:t>
+      </w:r>
+      <w:r>
+        <w:rPr>
+          <w:lang w:val="es-VE"/>
+        </w:rPr>
+        <w:t>.</w:t>
+      </w:r>
+    </w:p>
+    <w:p>
+      <w:pPr>
+        <w:pStyle w:val="TextBody"/>
+        <w:rPr>
+          <w:lang w:val="es-VE"/>
+        </w:rPr>
+      </w:pPr>
+      <w:r>
+        <w:rPr>
+          <w:lang w:val="es-VE"/>
+        </w:rPr>
+        <w:t xml:space="preserve">Verifique que el servicio de Apache se esté ejecutando bajo la cuenta </w:t>
+      </w:r>
+      <w:r>
+        <w:rPr>
+          <w:b/>
+          <w:lang w:val="es-VE"/>
+        </w:rPr>
+        <w:t>NT AUTHORITY\SYSTEM</w:t>
+      </w:r>
+      <w:r>
+        <w:rPr>
+          <w:lang w:val="es-VE"/>
+        </w:rPr>
+        <w:t xml:space="preserve"> y confirme que el test no arroje ninguna advertencia o error en este apartado.</w:t>
       </w:r>
     </w:p>
     <w:p>
@@ -6557,6 +6605,16 @@
           <w:szCs w:val="32"/>
           <w:lang w:val="es-VE" w:eastAsia="zxx" w:bidi="zxx"/>
         </w:rPr>
+        <w:t>¿</w:t>
+      </w:r>
+      <w:r>
+        <w:rPr>
+          <w:b/>
+          <w:bCs/>
+          <w:sz w:val="32"/>
+          <w:szCs w:val="32"/>
+          <w:lang w:val="es-VE" w:eastAsia="zxx" w:bidi="zxx"/>
+        </w:rPr>
         <w:t>Porque el sistema no genera ningun archivo .docx ni pdf?</w:t>
       </w:r>
     </w:p>
@@ -6591,7 +6649,17 @@
           <w:szCs w:val="24"/>
           <w:lang w:val="es-VE" w:eastAsia="zxx" w:bidi="zxx"/>
         </w:rPr>
-        <w:t>lo más probable es que se trate de una de estas tres cosas:</w:t>
+        <w:t>L</w:t>
+      </w:r>
+      <w:r>
+        <w:rPr>
+          <w:b w:val="false"/>
+          <w:bCs w:val="false"/>
+          <w:sz w:val="24"/>
+          <w:szCs w:val="24"/>
+          <w:lang w:val="es-VE" w:eastAsia="zxx" w:bidi="zxx"/>
+        </w:rPr>
+        <w:t>o más probable es que se trate de una de estas tres cosas:</w:t>
       </w:r>
     </w:p>
     <w:p>
@@ -7031,7 +7099,7 @@
       <w:pPr>
         <w:pStyle w:val="Heading2"/>
         <w:suppressAutoHyphens w:val="true"/>
-        <w:overflowPunct w:val="false"/>
+        <w:overflowPunct w:val="true"/>
         <w:bidi w:val="0"/>
         <w:spacing w:lineRule="auto" w:line="240" w:before="0" w:after="140"/>
         <w:ind w:left="0" w:hanging="0"/>
@@ -7593,13 +7661,7 @@
         <w:rPr>
           <w:lang w:val="es-VE" w:eastAsia="zxx" w:bidi="zxx"/>
         </w:rPr>
-        <w:t xml:space="preserve"> estan las plantillas .docx, </w:t>
-      </w:r>
-      <w:r>
-        <w:rPr>
-          <w:lang w:val="es-VE" w:eastAsia="zxx" w:bidi="zxx"/>
-        </w:rPr>
-        <w:t xml:space="preserve">Windows 11 a veces le pone un atributo de </w:t>
+        <w:t xml:space="preserve"> estan las plantillas .docx, Windows 11 a veces le pone un atributo de </w:t>
       </w:r>
       <w:r>
         <w:rPr>
@@ -8067,7 +8129,7 @@
       <w:pPr>
         <w:pStyle w:val="TextBody"/>
         <w:suppressAutoHyphens w:val="true"/>
-        <w:overflowPunct w:val="false"/>
+        <w:overflowPunct w:val="true"/>
         <w:bidi w:val="0"/>
         <w:spacing w:lineRule="auto" w:line="240" w:before="0" w:after="140"/>
         <w:jc w:val="both"/>
@@ -8098,7 +8160,7 @@
       <w:pPr>
         <w:pStyle w:val="TextBody"/>
         <w:suppressAutoHyphens w:val="true"/>
-        <w:overflowPunct w:val="false"/>
+        <w:overflowPunct w:val="true"/>
         <w:bidi w:val="0"/>
         <w:spacing w:lineRule="auto" w:line="240" w:before="0" w:after="140"/>
         <w:jc w:val="both"/>
@@ -8328,7 +8390,7 @@
       <w:pPr>
         <w:pStyle w:val="TextBody"/>
         <w:suppressAutoHyphens w:val="true"/>
-        <w:overflowPunct w:val="false"/>
+        <w:overflowPunct w:val="true"/>
         <w:bidi w:val="0"/>
         <w:spacing w:lineRule="auto" w:line="240" w:before="0" w:after="140"/>
         <w:jc w:val="both"/>
@@ -8337,9 +8399,7 @@
         </w:rPr>
       </w:pPr>
       <w:r>
-        <w:rPr>
-          <w:lang w:val="es-VE"/>
-        </w:rPr>
+        <w:rPr/>
       </w:r>
     </w:p>
     <w:sectPr>
@@ -13399,7 +13459,6 @@
     </w:lvl>
     <w:lvl w:ilvl="3">
       <w:start w:val="1"/>
-      <w:pStyle w:val="Heading4"/>
       <w:numFmt w:val="none"/>
       <w:suff w:val="nothing"/>
       <w:lvlText w:val=""/>
@@ -13621,7 +13680,7 @@
     <w:pPr>
       <w:widowControl/>
       <w:suppressAutoHyphens w:val="true"/>
-      <w:overflowPunct w:val="false"/>
+      <w:overflowPunct w:val="true"/>
       <w:bidi w:val="0"/>
       <w:spacing w:before="0" w:after="0"/>
       <w:jc w:val="left"/>
@@ -13835,7 +13894,7 @@
     <w:pPr>
       <w:widowControl/>
       <w:suppressAutoHyphens w:val="true"/>
-      <w:overflowPunct w:val="false"/>
+      <w:overflowPunct w:val="true"/>
       <w:bidi w:val="0"/>
       <w:spacing w:lineRule="auto" w:line="240" w:before="0" w:after="0"/>
       <w:jc w:val="left"/>

</xml_diff>

<commit_message>
actualizar manual de uusario
</commit_message>
<xml_diff>
--- a/Documentacion/Manual de Usuario.docx
+++ b/Documentacion/Manual de Usuario.docx
@@ -173,7 +173,7 @@
       <w:pPr>
         <w:pStyle w:val="Normal"/>
         <w:suppressAutoHyphens w:val="true"/>
-        <w:overflowPunct w:val="true"/>
+        <w:overflowPunct w:val="false"/>
         <w:bidi w:val="0"/>
         <w:spacing w:lineRule="auto" w:line="240" w:before="0" w:after="0"/>
         <w:jc w:val="left"/>
@@ -197,7 +197,7 @@
       <w:pPr>
         <w:pStyle w:val="Normal"/>
         <w:suppressAutoHyphens w:val="true"/>
-        <w:overflowPunct w:val="true"/>
+        <w:overflowPunct w:val="false"/>
         <w:bidi w:val="0"/>
         <w:spacing w:lineRule="auto" w:line="240" w:before="0" w:after="0"/>
         <w:jc w:val="left"/>
@@ -223,7 +223,7 @@
       <w:pPr>
         <w:pStyle w:val="Normal"/>
         <w:suppressAutoHyphens w:val="true"/>
-        <w:overflowPunct w:val="true"/>
+        <w:overflowPunct w:val="false"/>
         <w:bidi w:val="0"/>
         <w:spacing w:lineRule="auto" w:line="240" w:before="0" w:after="0"/>
         <w:ind w:left="0" w:right="0" w:firstLine="360"/>
@@ -252,7 +252,7 @@
           <w:numId w:val="1"/>
         </w:numPr>
         <w:suppressAutoHyphens w:val="true"/>
-        <w:overflowPunct w:val="true"/>
+        <w:overflowPunct w:val="false"/>
         <w:bidi w:val="0"/>
         <w:spacing w:lineRule="auto" w:line="240" w:before="0" w:after="140"/>
         <w:jc w:val="both"/>
@@ -290,7 +290,7 @@
           <w:numId w:val="1"/>
         </w:numPr>
         <w:suppressAutoHyphens w:val="true"/>
-        <w:overflowPunct w:val="true"/>
+        <w:overflowPunct w:val="false"/>
         <w:bidi w:val="0"/>
         <w:spacing w:lineRule="auto" w:line="240" w:before="0" w:after="140"/>
         <w:jc w:val="both"/>
@@ -317,7 +317,7 @@
           <w:numId w:val="1"/>
         </w:numPr>
         <w:suppressAutoHyphens w:val="true"/>
-        <w:overflowPunct w:val="true"/>
+        <w:overflowPunct w:val="false"/>
         <w:bidi w:val="0"/>
         <w:spacing w:lineRule="auto" w:line="240" w:before="0" w:after="140"/>
         <w:jc w:val="both"/>
@@ -340,7 +340,7 @@
       <w:pPr>
         <w:pStyle w:val="Normal"/>
         <w:suppressAutoHyphens w:val="true"/>
-        <w:overflowPunct w:val="true"/>
+        <w:overflowPunct w:val="false"/>
         <w:bidi w:val="0"/>
         <w:spacing w:lineRule="auto" w:line="240" w:before="0" w:after="0"/>
         <w:jc w:val="left"/>
@@ -437,7 +437,7 @@
       <w:pPr>
         <w:pStyle w:val="Normal"/>
         <w:suppressAutoHyphens w:val="true"/>
-        <w:overflowPunct w:val="true"/>
+        <w:overflowPunct w:val="false"/>
         <w:bidi w:val="0"/>
         <w:spacing w:lineRule="auto" w:line="240" w:before="0" w:after="0"/>
         <w:jc w:val="left"/>
@@ -472,7 +472,7 @@
       <w:pPr>
         <w:pStyle w:val="Normal"/>
         <w:suppressAutoHyphens w:val="true"/>
-        <w:overflowPunct w:val="true"/>
+        <w:overflowPunct w:val="false"/>
         <w:bidi w:val="0"/>
         <w:spacing w:lineRule="auto" w:line="240" w:before="0" w:after="0"/>
         <w:ind w:left="0" w:right="0" w:firstLine="360"/>
@@ -500,7 +500,7 @@
           <w:numId w:val="2"/>
         </w:numPr>
         <w:suppressAutoHyphens w:val="true"/>
-        <w:overflowPunct w:val="true"/>
+        <w:overflowPunct w:val="false"/>
         <w:bidi w:val="0"/>
         <w:spacing w:lineRule="auto" w:line="240" w:before="0" w:after="0"/>
         <w:jc w:val="both"/>
@@ -528,7 +528,7 @@
           <w:numId w:val="2"/>
         </w:numPr>
         <w:suppressAutoHyphens w:val="true"/>
-        <w:overflowPunct w:val="true"/>
+        <w:overflowPunct w:val="false"/>
         <w:bidi w:val="0"/>
         <w:spacing w:lineRule="auto" w:line="240" w:before="0" w:after="0"/>
         <w:jc w:val="both"/>
@@ -576,7 +576,7 @@
           <w:numId w:val="2"/>
         </w:numPr>
         <w:suppressAutoHyphens w:val="true"/>
-        <w:overflowPunct w:val="true"/>
+        <w:overflowPunct w:val="false"/>
         <w:bidi w:val="0"/>
         <w:spacing w:lineRule="auto" w:line="240" w:before="0" w:after="0"/>
         <w:jc w:val="both"/>
@@ -624,7 +624,7 @@
           <w:numId w:val="2"/>
         </w:numPr>
         <w:suppressAutoHyphens w:val="true"/>
-        <w:overflowPunct w:val="true"/>
+        <w:overflowPunct w:val="false"/>
         <w:bidi w:val="0"/>
         <w:spacing w:lineRule="auto" w:line="240" w:before="0" w:after="0"/>
         <w:jc w:val="both"/>
@@ -672,7 +672,7 @@
           <w:numId w:val="2"/>
         </w:numPr>
         <w:suppressAutoHyphens w:val="true"/>
-        <w:overflowPunct w:val="true"/>
+        <w:overflowPunct w:val="false"/>
         <w:bidi w:val="0"/>
         <w:spacing w:lineRule="auto" w:line="240" w:before="0" w:after="0"/>
         <w:jc w:val="both"/>
@@ -716,7 +716,7 @@
       <w:pPr>
         <w:pStyle w:val="Normal"/>
         <w:suppressAutoHyphens w:val="true"/>
-        <w:overflowPunct w:val="true"/>
+        <w:overflowPunct w:val="false"/>
         <w:bidi w:val="0"/>
         <w:spacing w:lineRule="auto" w:line="240" w:before="0" w:after="0"/>
         <w:jc w:val="both"/>
@@ -742,7 +742,7 @@
       <w:pPr>
         <w:pStyle w:val="Normal"/>
         <w:suppressAutoHyphens w:val="true"/>
-        <w:overflowPunct w:val="true"/>
+        <w:overflowPunct w:val="false"/>
         <w:bidi w:val="0"/>
         <w:spacing w:lineRule="auto" w:line="240" w:before="0" w:after="0"/>
         <w:jc w:val="both"/>
@@ -768,7 +768,7 @@
       <w:pPr>
         <w:pStyle w:val="Normal"/>
         <w:suppressAutoHyphens w:val="true"/>
-        <w:overflowPunct w:val="true"/>
+        <w:overflowPunct w:val="false"/>
         <w:bidi w:val="0"/>
         <w:spacing w:lineRule="auto" w:line="240" w:before="0" w:after="0"/>
         <w:jc w:val="both"/>
@@ -794,7 +794,7 @@
       <w:pPr>
         <w:pStyle w:val="Normal"/>
         <w:suppressAutoHyphens w:val="true"/>
-        <w:overflowPunct w:val="true"/>
+        <w:overflowPunct w:val="false"/>
         <w:bidi w:val="0"/>
         <w:spacing w:lineRule="auto" w:line="240" w:before="0" w:after="0"/>
         <w:jc w:val="left"/>
@@ -1011,7 +1011,7 @@
       <w:pPr>
         <w:pStyle w:val="Normal"/>
         <w:suppressAutoHyphens w:val="true"/>
-        <w:overflowPunct w:val="true"/>
+        <w:overflowPunct w:val="false"/>
         <w:bidi w:val="0"/>
         <w:spacing w:lineRule="auto" w:line="240" w:before="0" w:after="0"/>
         <w:jc w:val="left"/>
@@ -1044,7 +1044,7 @@
       <w:pPr>
         <w:pStyle w:val="Normal"/>
         <w:suppressAutoHyphens w:val="true"/>
-        <w:overflowPunct w:val="true"/>
+        <w:overflowPunct w:val="false"/>
         <w:bidi w:val="0"/>
         <w:spacing w:lineRule="auto" w:line="240" w:before="0" w:after="0"/>
         <w:ind w:left="0" w:right="0" w:firstLine="360"/>
@@ -1072,7 +1072,7 @@
           <w:numId w:val="3"/>
         </w:numPr>
         <w:suppressAutoHyphens w:val="true"/>
-        <w:overflowPunct w:val="true"/>
+        <w:overflowPunct w:val="false"/>
         <w:bidi w:val="0"/>
         <w:spacing w:lineRule="auto" w:line="240" w:before="0" w:after="0"/>
         <w:jc w:val="both"/>
@@ -1099,7 +1099,7 @@
           <w:numId w:val="3"/>
         </w:numPr>
         <w:suppressAutoHyphens w:val="true"/>
-        <w:overflowPunct w:val="true"/>
+        <w:overflowPunct w:val="false"/>
         <w:bidi w:val="0"/>
         <w:spacing w:lineRule="auto" w:line="240" w:before="0" w:after="0"/>
         <w:jc w:val="both"/>
@@ -1126,7 +1126,7 @@
           <w:numId w:val="3"/>
         </w:numPr>
         <w:suppressAutoHyphens w:val="true"/>
-        <w:overflowPunct w:val="true"/>
+        <w:overflowPunct w:val="false"/>
         <w:bidi w:val="0"/>
         <w:spacing w:lineRule="auto" w:line="240" w:before="0" w:after="0"/>
         <w:jc w:val="both"/>
@@ -1153,7 +1153,7 @@
           <w:numId w:val="3"/>
         </w:numPr>
         <w:suppressAutoHyphens w:val="true"/>
-        <w:overflowPunct w:val="true"/>
+        <w:overflowPunct w:val="false"/>
         <w:bidi w:val="0"/>
         <w:spacing w:lineRule="auto" w:line="240" w:before="0" w:after="0"/>
         <w:jc w:val="both"/>
@@ -1176,7 +1176,7 @@
       <w:pPr>
         <w:pStyle w:val="Normal"/>
         <w:suppressAutoHyphens w:val="true"/>
-        <w:overflowPunct w:val="true"/>
+        <w:overflowPunct w:val="false"/>
         <w:bidi w:val="0"/>
         <w:spacing w:lineRule="auto" w:line="240" w:before="0" w:after="0"/>
         <w:jc w:val="left"/>
@@ -1209,7 +1209,7 @@
       <w:pPr>
         <w:pStyle w:val="Normal"/>
         <w:suppressAutoHyphens w:val="true"/>
-        <w:overflowPunct w:val="true"/>
+        <w:overflowPunct w:val="false"/>
         <w:bidi w:val="0"/>
         <w:spacing w:lineRule="auto" w:line="240" w:before="0" w:after="0"/>
         <w:jc w:val="left"/>
@@ -1242,7 +1242,7 @@
       <w:pPr>
         <w:pStyle w:val="Normal"/>
         <w:suppressAutoHyphens w:val="true"/>
-        <w:overflowPunct w:val="true"/>
+        <w:overflowPunct w:val="false"/>
         <w:bidi w:val="0"/>
         <w:spacing w:lineRule="auto" w:line="240" w:before="0" w:after="0"/>
         <w:jc w:val="left"/>
@@ -1275,7 +1275,7 @@
       <w:pPr>
         <w:pStyle w:val="Normal"/>
         <w:suppressAutoHyphens w:val="true"/>
-        <w:overflowPunct w:val="true"/>
+        <w:overflowPunct w:val="false"/>
         <w:bidi w:val="0"/>
         <w:spacing w:lineRule="auto" w:line="240" w:before="0" w:after="0"/>
         <w:jc w:val="left"/>
@@ -1308,7 +1308,7 @@
       <w:pPr>
         <w:pStyle w:val="Normal"/>
         <w:suppressAutoHyphens w:val="true"/>
-        <w:overflowPunct w:val="true"/>
+        <w:overflowPunct w:val="false"/>
         <w:bidi w:val="0"/>
         <w:spacing w:lineRule="auto" w:line="240" w:before="0" w:after="0"/>
         <w:jc w:val="left"/>
@@ -1341,7 +1341,7 @@
       <w:pPr>
         <w:pStyle w:val="Normal"/>
         <w:suppressAutoHyphens w:val="true"/>
-        <w:overflowPunct w:val="true"/>
+        <w:overflowPunct w:val="false"/>
         <w:bidi w:val="0"/>
         <w:spacing w:lineRule="auto" w:line="240" w:before="0" w:after="0"/>
         <w:jc w:val="left"/>
@@ -1374,7 +1374,7 @@
       <w:pPr>
         <w:pStyle w:val="Normal"/>
         <w:suppressAutoHyphens w:val="true"/>
-        <w:overflowPunct w:val="true"/>
+        <w:overflowPunct w:val="false"/>
         <w:bidi w:val="0"/>
         <w:spacing w:lineRule="auto" w:line="240" w:before="0" w:after="0"/>
         <w:jc w:val="left"/>
@@ -1407,7 +1407,7 @@
       <w:pPr>
         <w:pStyle w:val="Normal"/>
         <w:suppressAutoHyphens w:val="true"/>
-        <w:overflowPunct w:val="true"/>
+        <w:overflowPunct w:val="false"/>
         <w:bidi w:val="0"/>
         <w:spacing w:lineRule="auto" w:line="240" w:before="0" w:after="0"/>
         <w:jc w:val="left"/>
@@ -1440,7 +1440,7 @@
       <w:pPr>
         <w:pStyle w:val="Normal"/>
         <w:suppressAutoHyphens w:val="true"/>
-        <w:overflowPunct w:val="true"/>
+        <w:overflowPunct w:val="false"/>
         <w:bidi w:val="0"/>
         <w:spacing w:lineRule="auto" w:line="240" w:before="0" w:after="0"/>
         <w:jc w:val="left"/>
@@ -1537,7 +1537,7 @@
       <w:pPr>
         <w:pStyle w:val="Normal"/>
         <w:suppressAutoHyphens w:val="true"/>
-        <w:overflowPunct w:val="true"/>
+        <w:overflowPunct w:val="false"/>
         <w:bidi w:val="0"/>
         <w:spacing w:lineRule="auto" w:line="240" w:before="0" w:after="0"/>
         <w:jc w:val="left"/>
@@ -1560,7 +1560,7 @@
       <w:pPr>
         <w:pStyle w:val="Normal"/>
         <w:suppressAutoHyphens w:val="true"/>
-        <w:overflowPunct w:val="true"/>
+        <w:overflowPunct w:val="false"/>
         <w:bidi w:val="0"/>
         <w:spacing w:lineRule="auto" w:line="240" w:before="0" w:after="0"/>
         <w:jc w:val="left"/>
@@ -1586,7 +1586,7 @@
       <w:pPr>
         <w:pStyle w:val="Normal"/>
         <w:suppressAutoHyphens w:val="true"/>
-        <w:overflowPunct w:val="true"/>
+        <w:overflowPunct w:val="false"/>
         <w:bidi w:val="0"/>
         <w:spacing w:lineRule="auto" w:line="240" w:before="0" w:after="0"/>
         <w:jc w:val="left"/>
@@ -1679,7 +1679,7 @@
       <w:pPr>
         <w:pStyle w:val="Normal"/>
         <w:suppressAutoHyphens w:val="true"/>
-        <w:overflowPunct w:val="true"/>
+        <w:overflowPunct w:val="false"/>
         <w:bidi w:val="0"/>
         <w:spacing w:lineRule="auto" w:line="240" w:before="0" w:after="0"/>
         <w:jc w:val="left"/>
@@ -1702,7 +1702,7 @@
       <w:pPr>
         <w:pStyle w:val="Normal"/>
         <w:suppressAutoHyphens w:val="true"/>
-        <w:overflowPunct w:val="true"/>
+        <w:overflowPunct w:val="false"/>
         <w:bidi w:val="0"/>
         <w:spacing w:lineRule="auto" w:line="240" w:before="0" w:after="0"/>
         <w:jc w:val="left"/>
@@ -1728,7 +1728,7 @@
       <w:pPr>
         <w:pStyle w:val="Normal"/>
         <w:suppressAutoHyphens w:val="true"/>
-        <w:overflowPunct w:val="true"/>
+        <w:overflowPunct w:val="false"/>
         <w:bidi w:val="0"/>
         <w:spacing w:lineRule="auto" w:line="240" w:before="0" w:after="140"/>
         <w:ind w:left="0" w:right="0" w:firstLine="708"/>
@@ -1788,7 +1788,7 @@
           <w:tab w:val="left" w:pos="0" w:leader="none"/>
         </w:tabs>
         <w:suppressAutoHyphens w:val="true"/>
-        <w:overflowPunct w:val="true"/>
+        <w:overflowPunct w:val="false"/>
         <w:bidi w:val="0"/>
         <w:spacing w:lineRule="auto" w:line="240" w:before="0" w:after="140"/>
         <w:jc w:val="both"/>
@@ -1819,7 +1819,7 @@
           <w:tab w:val="left" w:pos="0" w:leader="none"/>
         </w:tabs>
         <w:suppressAutoHyphens w:val="true"/>
-        <w:overflowPunct w:val="true"/>
+        <w:overflowPunct w:val="false"/>
         <w:bidi w:val="0"/>
         <w:spacing w:lineRule="auto" w:line="240" w:before="0" w:after="140"/>
         <w:jc w:val="both"/>
@@ -1850,7 +1850,7 @@
           <w:tab w:val="left" w:pos="0" w:leader="none"/>
         </w:tabs>
         <w:suppressAutoHyphens w:val="true"/>
-        <w:overflowPunct w:val="true"/>
+        <w:overflowPunct w:val="false"/>
         <w:bidi w:val="0"/>
         <w:spacing w:lineRule="auto" w:line="240" w:before="0" w:after="140"/>
         <w:jc w:val="both"/>
@@ -1881,7 +1881,7 @@
           <w:tab w:val="left" w:pos="0" w:leader="none"/>
         </w:tabs>
         <w:suppressAutoHyphens w:val="true"/>
-        <w:overflowPunct w:val="true"/>
+        <w:overflowPunct w:val="false"/>
         <w:bidi w:val="0"/>
         <w:spacing w:lineRule="auto" w:line="240" w:before="0" w:after="140"/>
         <w:jc w:val="both"/>
@@ -1908,7 +1908,7 @@
           <w:tab w:val="left" w:pos="0" w:leader="none"/>
         </w:tabs>
         <w:suppressAutoHyphens w:val="true"/>
-        <w:overflowPunct w:val="true"/>
+        <w:overflowPunct w:val="false"/>
         <w:bidi w:val="0"/>
         <w:spacing w:lineRule="auto" w:line="240" w:before="0" w:after="140"/>
         <w:jc w:val="both"/>
@@ -1996,7 +1996,7 @@
       <w:pPr>
         <w:pStyle w:val="Normal"/>
         <w:suppressAutoHyphens w:val="true"/>
-        <w:overflowPunct w:val="true"/>
+        <w:overflowPunct w:val="false"/>
         <w:bidi w:val="0"/>
         <w:spacing w:lineRule="auto" w:line="240" w:before="0" w:after="0"/>
         <w:jc w:val="left"/>
@@ -2020,7 +2020,7 @@
       <w:pPr>
         <w:pStyle w:val="Normal"/>
         <w:suppressAutoHyphens w:val="true"/>
-        <w:overflowPunct w:val="true"/>
+        <w:overflowPunct w:val="false"/>
         <w:bidi w:val="0"/>
         <w:spacing w:lineRule="auto" w:line="240" w:before="0" w:after="0"/>
         <w:jc w:val="left"/>
@@ -2048,7 +2048,7 @@
       <w:pPr>
         <w:pStyle w:val="Normal"/>
         <w:suppressAutoHyphens w:val="true"/>
-        <w:overflowPunct w:val="true"/>
+        <w:overflowPunct w:val="false"/>
         <w:bidi w:val="0"/>
         <w:spacing w:lineRule="auto" w:line="240" w:before="0" w:after="140"/>
         <w:ind w:left="0" w:right="0" w:firstLine="708"/>
@@ -2147,7 +2147,7 @@
       <w:pPr>
         <w:pStyle w:val="Normal"/>
         <w:suppressAutoHyphens w:val="true"/>
-        <w:overflowPunct w:val="true"/>
+        <w:overflowPunct w:val="false"/>
         <w:bidi w:val="0"/>
         <w:spacing w:lineRule="auto" w:line="240" w:before="0" w:after="0"/>
         <w:jc w:val="left"/>
@@ -2171,7 +2171,7 @@
       <w:pPr>
         <w:pStyle w:val="Normal"/>
         <w:suppressAutoHyphens w:val="true"/>
-        <w:overflowPunct w:val="true"/>
+        <w:overflowPunct w:val="false"/>
         <w:bidi w:val="0"/>
         <w:spacing w:lineRule="auto" w:line="240" w:before="0" w:after="140"/>
         <w:ind w:left="0" w:right="0" w:firstLine="426"/>
@@ -2204,7 +2204,7 @@
           <w:tab w:val="left" w:pos="0" w:leader="none"/>
         </w:tabs>
         <w:suppressAutoHyphens w:val="true"/>
-        <w:overflowPunct w:val="true"/>
+        <w:overflowPunct w:val="false"/>
         <w:bidi w:val="0"/>
         <w:spacing w:lineRule="auto" w:line="240" w:before="0" w:after="140"/>
         <w:jc w:val="left"/>
@@ -2235,7 +2235,7 @@
           <w:tab w:val="left" w:pos="0" w:leader="none"/>
         </w:tabs>
         <w:suppressAutoHyphens w:val="true"/>
-        <w:overflowPunct w:val="true"/>
+        <w:overflowPunct w:val="false"/>
         <w:bidi w:val="0"/>
         <w:spacing w:lineRule="auto" w:line="240" w:before="0" w:after="140"/>
         <w:jc w:val="left"/>
@@ -2266,7 +2266,7 @@
           <w:tab w:val="left" w:pos="0" w:leader="none"/>
         </w:tabs>
         <w:suppressAutoHyphens w:val="true"/>
-        <w:overflowPunct w:val="true"/>
+        <w:overflowPunct w:val="false"/>
         <w:bidi w:val="0"/>
         <w:spacing w:lineRule="auto" w:line="240" w:before="0" w:after="140"/>
         <w:jc w:val="left"/>
@@ -2297,7 +2297,7 @@
           <w:tab w:val="left" w:pos="0" w:leader="none"/>
         </w:tabs>
         <w:suppressAutoHyphens w:val="true"/>
-        <w:overflowPunct w:val="true"/>
+        <w:overflowPunct w:val="false"/>
         <w:bidi w:val="0"/>
         <w:spacing w:lineRule="auto" w:line="240" w:before="0" w:after="140"/>
         <w:jc w:val="left"/>
@@ -2320,7 +2320,7 @@
       <w:pPr>
         <w:pStyle w:val="Normal"/>
         <w:suppressAutoHyphens w:val="true"/>
-        <w:overflowPunct w:val="true"/>
+        <w:overflowPunct w:val="false"/>
         <w:bidi w:val="0"/>
         <w:spacing w:lineRule="auto" w:line="240" w:before="0" w:after="0"/>
         <w:jc w:val="left"/>
@@ -2346,7 +2346,7 @@
       <w:pPr>
         <w:pStyle w:val="Normal"/>
         <w:suppressAutoHyphens w:val="true"/>
-        <w:overflowPunct w:val="true"/>
+        <w:overflowPunct w:val="false"/>
         <w:bidi w:val="0"/>
         <w:spacing w:lineRule="auto" w:line="240" w:before="240" w:after="0"/>
         <w:jc w:val="left"/>
@@ -2409,7 +2409,7 @@
       <w:pPr>
         <w:pStyle w:val="Normal"/>
         <w:suppressAutoHyphens w:val="true"/>
-        <w:overflowPunct w:val="true"/>
+        <w:overflowPunct w:val="false"/>
         <w:bidi w:val="0"/>
         <w:spacing w:lineRule="auto" w:line="240" w:before="240" w:after="0"/>
         <w:jc w:val="left"/>
@@ -2441,7 +2441,7 @@
       <w:pPr>
         <w:pStyle w:val="Normal"/>
         <w:suppressAutoHyphens w:val="true"/>
-        <w:overflowPunct w:val="true"/>
+        <w:overflowPunct w:val="false"/>
         <w:bidi w:val="0"/>
         <w:spacing w:lineRule="auto" w:line="240" w:before="0" w:after="0"/>
         <w:jc w:val="left"/>
@@ -2465,7 +2465,7 @@
       <w:pPr>
         <w:pStyle w:val="Normal"/>
         <w:suppressAutoHyphens w:val="true"/>
-        <w:overflowPunct w:val="true"/>
+        <w:overflowPunct w:val="false"/>
         <w:bidi w:val="0"/>
         <w:spacing w:lineRule="auto" w:line="240" w:before="0" w:after="0"/>
         <w:jc w:val="left"/>
@@ -2491,7 +2491,7 @@
       <w:pPr>
         <w:pStyle w:val="Normal"/>
         <w:suppressAutoHyphens w:val="true"/>
-        <w:overflowPunct w:val="true"/>
+        <w:overflowPunct w:val="false"/>
         <w:bidi w:val="0"/>
         <w:spacing w:lineRule="auto" w:line="240" w:before="0" w:after="140"/>
         <w:ind w:left="0" w:right="0" w:firstLine="360"/>
@@ -2520,7 +2520,7 @@
           <w:numId w:val="6"/>
         </w:numPr>
         <w:suppressAutoHyphens w:val="true"/>
-        <w:overflowPunct w:val="true"/>
+        <w:overflowPunct w:val="false"/>
         <w:bidi w:val="0"/>
         <w:spacing w:lineRule="auto" w:line="240" w:before="0" w:after="140"/>
         <w:jc w:val="both"/>
@@ -2547,7 +2547,7 @@
           <w:numId w:val="6"/>
         </w:numPr>
         <w:suppressAutoHyphens w:val="true"/>
-        <w:overflowPunct w:val="true"/>
+        <w:overflowPunct w:val="false"/>
         <w:bidi w:val="0"/>
         <w:spacing w:lineRule="auto" w:line="240" w:before="0" w:after="140"/>
         <w:jc w:val="both"/>
@@ -2574,7 +2574,7 @@
           <w:numId w:val="6"/>
         </w:numPr>
         <w:suppressAutoHyphens w:val="true"/>
-        <w:overflowPunct w:val="true"/>
+        <w:overflowPunct w:val="false"/>
         <w:bidi w:val="0"/>
         <w:spacing w:lineRule="auto" w:line="240" w:before="0" w:after="140"/>
         <w:jc w:val="both"/>
@@ -2601,7 +2601,7 @@
           <w:numId w:val="6"/>
         </w:numPr>
         <w:suppressAutoHyphens w:val="true"/>
-        <w:overflowPunct w:val="true"/>
+        <w:overflowPunct w:val="false"/>
         <w:bidi w:val="0"/>
         <w:spacing w:lineRule="auto" w:line="240" w:before="0" w:after="140"/>
         <w:jc w:val="both"/>
@@ -2628,7 +2628,7 @@
           <w:numId w:val="6"/>
         </w:numPr>
         <w:suppressAutoHyphens w:val="true"/>
-        <w:overflowPunct w:val="true"/>
+        <w:overflowPunct w:val="false"/>
         <w:bidi w:val="0"/>
         <w:spacing w:lineRule="auto" w:line="240" w:before="0" w:after="140"/>
         <w:jc w:val="both"/>
@@ -2650,8 +2650,77 @@
     <w:p>
       <w:pPr>
         <w:pStyle w:val="Normal"/>
+        <w:numPr>
+          <w:ilvl w:val="0"/>
+          <w:numId w:val="6"/>
+        </w:numPr>
         <w:suppressAutoHyphens w:val="true"/>
-        <w:overflowPunct w:val="true"/>
+        <w:overflowPunct w:val="false"/>
+        <w:bidi w:val="0"/>
+        <w:spacing w:lineRule="auto" w:line="240" w:before="0" w:after="140"/>
+        <w:jc w:val="both"/>
+        <w:rPr>
+          <w:lang w:val="es-VE"/>
+        </w:rPr>
+      </w:pPr>
+      <w:r>
+        <w:rPr>
+          <w:rFonts w:eastAsia="Noto Serif CJK SC" w:cs="Times New Roman" w:ascii="Times New Roman" w:hAnsi="Times New Roman"/>
+          <w:kern w:val="2"/>
+          <w:sz w:val="24"/>
+          <w:szCs w:val="24"/>
+          <w:lang w:val="es-VE" w:eastAsia="zxx" w:bidi="zxx"/>
+        </w:rPr>
+        <w:t>Para mostrar la pantalla de diagonostico, haz clic en Mostrar Test de Dian</w:t>
+      </w:r>
+      <w:r>
+        <w:rPr>
+          <w:rFonts w:eastAsia="Noto Serif CJK SC" w:cs="Times New Roman" w:ascii="Times New Roman" w:hAnsi="Times New Roman"/>
+          <w:color w:val="auto"/>
+          <w:kern w:val="2"/>
+          <w:sz w:val="24"/>
+          <w:szCs w:val="24"/>
+          <w:lang w:val="es-VE" w:eastAsia="zxx" w:bidi="zxx"/>
+        </w:rPr>
+        <w:t>ó</w:t>
+      </w:r>
+      <w:r>
+        <w:rPr>
+          <w:rFonts w:eastAsia="Noto Serif CJK SC" w:cs="Times New Roman" w:ascii="Times New Roman" w:hAnsi="Times New Roman"/>
+          <w:kern w:val="2"/>
+          <w:sz w:val="24"/>
+          <w:szCs w:val="24"/>
+          <w:lang w:val="es-VE" w:eastAsia="zxx" w:bidi="zxx"/>
+        </w:rPr>
+        <w:t>stico, no deber</w:t>
+      </w:r>
+      <w:r>
+        <w:rPr>
+          <w:rFonts w:eastAsia="Noto Serif CJK SC" w:cs="Times New Roman" w:ascii="Times New Roman" w:hAnsi="Times New Roman"/>
+          <w:color w:val="auto"/>
+          <w:kern w:val="2"/>
+          <w:sz w:val="24"/>
+          <w:szCs w:val="24"/>
+          <w:lang w:val="es-VE" w:eastAsia="zxx" w:bidi="zxx"/>
+        </w:rPr>
+        <w:t>í</w:t>
+      </w:r>
+      <w:r>
+        <w:rPr>
+          <w:rFonts w:eastAsia="Noto Serif CJK SC" w:cs="Times New Roman" w:ascii="Times New Roman" w:hAnsi="Times New Roman"/>
+          <w:kern w:val="2"/>
+          <w:sz w:val="24"/>
+          <w:szCs w:val="24"/>
+          <w:lang w:val="es-VE" w:eastAsia="zxx" w:bidi="zxx"/>
+        </w:rPr>
+        <w:t>a arrogar ninguna advertencia, de lo contrario deben corregirse.</w:t>
+      </w:r>
+    </w:p>
+    <w:p>
+      <w:pPr>
+        <w:pStyle w:val="Normal"/>
+        <w:suppressAutoHyphens w:val="true"/>
+        <w:overflowPunct w:val="false"/>
         <w:bidi w:val="0"/>
         <w:spacing w:lineRule="auto" w:line="240" w:before="0" w:after="140"/>
         <w:jc w:val="both"/>
@@ -6464,6 +6533,7 @@
         <w:jc w:val="left"/>
         <w:rPr>
           <w:b/>
+          <w:b/>
           <w:sz w:val="32"/>
           <w:szCs w:val="32"/>
           <w:lang w:val="es-VE"/>
@@ -6471,7 +6541,6 @@
       </w:pPr>
       <w:r>
         <w:rPr>
-          <w:rFonts w:ascii="Liberation Serif" w:hAnsi="Liberation Serif"/>
           <w:b/>
           <w:bCs/>
           <w:position w:val="0"/>
@@ -6508,13 +6577,7 @@
         <w:rPr>
           <w:lang w:val="es-VE"/>
         </w:rPr>
-        <w:t xml:space="preserve"> y seleccione </w:t>
-      </w:r>
-      <w:r>
-        <w:rPr>
-          <w:lang w:val="es-VE"/>
-        </w:rPr>
-        <w:t>el bot</w:t>
+        <w:t xml:space="preserve"> y seleccione el bot</w:t>
       </w:r>
       <w:r>
         <w:rPr>
@@ -6605,17 +6668,7 @@
           <w:szCs w:val="32"/>
           <w:lang w:val="es-VE" w:eastAsia="zxx" w:bidi="zxx"/>
         </w:rPr>
-        <w:t>¿</w:t>
-      </w:r>
-      <w:r>
-        <w:rPr>
-          <w:b/>
-          <w:bCs/>
-          <w:sz w:val="32"/>
-          <w:szCs w:val="32"/>
-          <w:lang w:val="es-VE" w:eastAsia="zxx" w:bidi="zxx"/>
-        </w:rPr>
-        <w:t>Porque el sistema no genera ningun archivo .docx ni pdf?</w:t>
+        <w:t>¿Porque el sistema no genera ningun archivo .docx ni pdf?</w:t>
       </w:r>
     </w:p>
     <w:p>
@@ -6649,17 +6702,7 @@
           <w:szCs w:val="24"/>
           <w:lang w:val="es-VE" w:eastAsia="zxx" w:bidi="zxx"/>
         </w:rPr>
-        <w:t>L</w:t>
-      </w:r>
-      <w:r>
-        <w:rPr>
-          <w:b w:val="false"/>
-          <w:bCs w:val="false"/>
-          <w:sz w:val="24"/>
-          <w:szCs w:val="24"/>
-          <w:lang w:val="es-VE" w:eastAsia="zxx" w:bidi="zxx"/>
-        </w:rPr>
-        <w:t>o más probable es que se trate de una de estas tres cosas:</w:t>
+        <w:t>Lo más probable es que se trate de una de estas tres cosas:</w:t>
       </w:r>
     </w:p>
     <w:p>
@@ -7099,7 +7142,7 @@
       <w:pPr>
         <w:pStyle w:val="Heading2"/>
         <w:suppressAutoHyphens w:val="true"/>
-        <w:overflowPunct w:val="true"/>
+        <w:overflowPunct w:val="false"/>
         <w:bidi w:val="0"/>
         <w:spacing w:lineRule="auto" w:line="240" w:before="0" w:after="140"/>
         <w:ind w:left="0" w:hanging="0"/>
@@ -8129,7 +8172,7 @@
       <w:pPr>
         <w:pStyle w:val="TextBody"/>
         <w:suppressAutoHyphens w:val="true"/>
-        <w:overflowPunct w:val="true"/>
+        <w:overflowPunct w:val="false"/>
         <w:bidi w:val="0"/>
         <w:spacing w:lineRule="auto" w:line="240" w:before="0" w:after="140"/>
         <w:jc w:val="both"/>
@@ -8160,7 +8203,7 @@
       <w:pPr>
         <w:pStyle w:val="TextBody"/>
         <w:suppressAutoHyphens w:val="true"/>
-        <w:overflowPunct w:val="true"/>
+        <w:overflowPunct w:val="false"/>
         <w:bidi w:val="0"/>
         <w:spacing w:lineRule="auto" w:line="240" w:before="0" w:after="140"/>
         <w:jc w:val="both"/>
@@ -8390,7 +8433,7 @@
       <w:pPr>
         <w:pStyle w:val="TextBody"/>
         <w:suppressAutoHyphens w:val="true"/>
-        <w:overflowPunct w:val="true"/>
+        <w:overflowPunct w:val="false"/>
         <w:bidi w:val="0"/>
         <w:spacing w:lineRule="auto" w:line="240" w:before="0" w:after="140"/>
         <w:jc w:val="both"/>
@@ -13680,7 +13723,7 @@
     <w:pPr>
       <w:widowControl/>
       <w:suppressAutoHyphens w:val="true"/>
-      <w:overflowPunct w:val="true"/>
+      <w:overflowPunct w:val="false"/>
       <w:bidi w:val="0"/>
       <w:spacing w:before="0" w:after="0"/>
       <w:jc w:val="left"/>
@@ -13894,7 +13937,7 @@
     <w:pPr>
       <w:widowControl/>
       <w:suppressAutoHyphens w:val="true"/>
-      <w:overflowPunct w:val="true"/>
+      <w:overflowPunct w:val="false"/>
       <w:bidi w:val="0"/>
       <w:spacing w:lineRule="auto" w:line="240" w:before="0" w:after="0"/>
       <w:jc w:val="left"/>

</xml_diff>

<commit_message>
agregar Como editar las constancias generadas en el manual de usario
</commit_message>
<xml_diff>
--- a/Documentacion/Manual de Usuario.docx
+++ b/Documentacion/Manual de Usuario.docx
@@ -64,9 +64,7 @@
       <w:pPr>
         <w:pStyle w:val="Graficos"/>
         <w:spacing w:lineRule="auto" w:line="240"/>
-        <w:rPr>
-          <w:lang w:val="es-VE"/>
-        </w:rPr>
+        <w:rPr/>
       </w:pPr>
       <w:bookmarkStart w:id="1" w:name="_Toc210586743"/>
       <w:r>
@@ -83,9 +81,7 @@
         <w:bidi w:val="0"/>
         <w:spacing w:lineRule="auto" w:line="240"/>
         <w:jc w:val="left"/>
-        <w:rPr>
-          <w:lang w:val="es-VE"/>
-        </w:rPr>
+        <w:rPr/>
       </w:pPr>
       <w:r>
         <w:rPr>
@@ -101,9 +97,7 @@
       <w:pPr>
         <w:pStyle w:val="Graficos"/>
         <w:spacing w:lineRule="auto" w:line="240"/>
-        <w:rPr>
-          <w:lang w:val="es-VE"/>
-        </w:rPr>
+        <w:rPr/>
       </w:pPr>
       <w:bookmarkStart w:id="2" w:name="_Toc210586744"/>
       <w:bookmarkStart w:id="3" w:name="_Toc210586848"/>
@@ -173,13 +167,11 @@
       <w:pPr>
         <w:pStyle w:val="Normal"/>
         <w:suppressAutoHyphens w:val="true"/>
-        <w:overflowPunct w:val="true"/>
+        <w:overflowPunct w:val="false"/>
         <w:bidi w:val="0"/>
         <w:spacing w:lineRule="auto" w:line="240" w:before="0" w:after="0"/>
         <w:jc w:val="left"/>
-        <w:rPr>
-          <w:lang w:val="es-VE"/>
-        </w:rPr>
+        <w:rPr/>
       </w:pPr>
       <w:r>
         <w:rPr>
@@ -197,7 +189,7 @@
       <w:pPr>
         <w:pStyle w:val="Normal"/>
         <w:suppressAutoHyphens w:val="true"/>
-        <w:overflowPunct w:val="true"/>
+        <w:overflowPunct w:val="false"/>
         <w:bidi w:val="0"/>
         <w:spacing w:lineRule="auto" w:line="240" w:before="0" w:after="0"/>
         <w:jc w:val="left"/>
@@ -223,14 +215,12 @@
       <w:pPr>
         <w:pStyle w:val="Normal"/>
         <w:suppressAutoHyphens w:val="true"/>
-        <w:overflowPunct w:val="true"/>
+        <w:overflowPunct w:val="false"/>
         <w:bidi w:val="0"/>
         <w:spacing w:lineRule="auto" w:line="240" w:before="0" w:after="0"/>
         <w:ind w:left="0" w:right="0" w:firstLine="360"/>
         <w:jc w:val="both"/>
-        <w:rPr>
-          <w:lang w:val="es-VE"/>
-        </w:rPr>
+        <w:rPr/>
       </w:pPr>
       <w:r>
         <w:rPr>
@@ -252,13 +242,11 @@
           <w:numId w:val="1"/>
         </w:numPr>
         <w:suppressAutoHyphens w:val="true"/>
-        <w:overflowPunct w:val="true"/>
+        <w:overflowPunct w:val="false"/>
         <w:bidi w:val="0"/>
         <w:spacing w:lineRule="auto" w:line="240" w:before="0" w:after="140"/>
         <w:jc w:val="both"/>
-        <w:rPr>
-          <w:lang w:val="es-VE"/>
-        </w:rPr>
+        <w:rPr/>
       </w:pPr>
       <w:r>
         <w:rPr>
@@ -290,13 +278,11 @@
           <w:numId w:val="1"/>
         </w:numPr>
         <w:suppressAutoHyphens w:val="true"/>
-        <w:overflowPunct w:val="true"/>
+        <w:overflowPunct w:val="false"/>
         <w:bidi w:val="0"/>
         <w:spacing w:lineRule="auto" w:line="240" w:before="0" w:after="140"/>
         <w:jc w:val="both"/>
-        <w:rPr>
-          <w:lang w:val="es-VE"/>
-        </w:rPr>
+        <w:rPr/>
       </w:pPr>
       <w:r>
         <w:rPr>
@@ -317,13 +303,11 @@
           <w:numId w:val="1"/>
         </w:numPr>
         <w:suppressAutoHyphens w:val="true"/>
-        <w:overflowPunct w:val="true"/>
+        <w:overflowPunct w:val="false"/>
         <w:bidi w:val="0"/>
         <w:spacing w:lineRule="auto" w:line="240" w:before="0" w:after="140"/>
         <w:jc w:val="both"/>
-        <w:rPr>
-          <w:lang w:val="es-VE"/>
-        </w:rPr>
+        <w:rPr/>
       </w:pPr>
       <w:r>
         <w:rPr>
@@ -340,7 +324,7 @@
       <w:pPr>
         <w:pStyle w:val="Normal"/>
         <w:suppressAutoHyphens w:val="true"/>
-        <w:overflowPunct w:val="true"/>
+        <w:overflowPunct w:val="false"/>
         <w:bidi w:val="0"/>
         <w:spacing w:lineRule="auto" w:line="240" w:before="0" w:after="0"/>
         <w:jc w:val="left"/>
@@ -373,9 +357,7 @@
       <w:pPr>
         <w:pStyle w:val="Graficos"/>
         <w:spacing w:lineRule="auto" w:line="240"/>
-        <w:rPr>
-          <w:lang w:val="es-VE"/>
-        </w:rPr>
+        <w:rPr/>
       </w:pPr>
       <w:bookmarkStart w:id="4" w:name="_Toc210586745"/>
       <w:bookmarkEnd w:id="4"/>
@@ -437,13 +419,11 @@
       <w:pPr>
         <w:pStyle w:val="Normal"/>
         <w:suppressAutoHyphens w:val="true"/>
-        <w:overflowPunct w:val="true"/>
+        <w:overflowPunct w:val="false"/>
         <w:bidi w:val="0"/>
         <w:spacing w:lineRule="auto" w:line="240" w:before="0" w:after="0"/>
         <w:jc w:val="left"/>
-        <w:rPr>
-          <w:lang w:val="es-VE"/>
-        </w:rPr>
+        <w:rPr/>
       </w:pPr>
       <w:r>
         <w:rPr>
@@ -472,14 +452,12 @@
       <w:pPr>
         <w:pStyle w:val="Normal"/>
         <w:suppressAutoHyphens w:val="true"/>
-        <w:overflowPunct w:val="true"/>
+        <w:overflowPunct w:val="false"/>
         <w:bidi w:val="0"/>
         <w:spacing w:lineRule="auto" w:line="240" w:before="0" w:after="0"/>
         <w:ind w:left="0" w:right="0" w:firstLine="360"/>
         <w:jc w:val="both"/>
-        <w:rPr>
-          <w:lang w:val="es-VE"/>
-        </w:rPr>
+        <w:rPr/>
       </w:pPr>
       <w:r>
         <w:rPr>
@@ -500,13 +478,11 @@
           <w:numId w:val="2"/>
         </w:numPr>
         <w:suppressAutoHyphens w:val="true"/>
-        <w:overflowPunct w:val="true"/>
+        <w:overflowPunct w:val="false"/>
         <w:bidi w:val="0"/>
         <w:spacing w:lineRule="auto" w:line="240" w:before="0" w:after="0"/>
         <w:jc w:val="both"/>
-        <w:rPr>
-          <w:lang w:val="es-VE"/>
-        </w:rPr>
+        <w:rPr/>
       </w:pPr>
       <w:r>
         <w:rPr>
@@ -528,13 +504,11 @@
           <w:numId w:val="2"/>
         </w:numPr>
         <w:suppressAutoHyphens w:val="true"/>
-        <w:overflowPunct w:val="true"/>
+        <w:overflowPunct w:val="false"/>
         <w:bidi w:val="0"/>
         <w:spacing w:lineRule="auto" w:line="240" w:before="0" w:after="0"/>
         <w:jc w:val="both"/>
-        <w:rPr>
-          <w:lang w:val="es-VE"/>
-        </w:rPr>
+        <w:rPr/>
       </w:pPr>
       <w:r>
         <w:rPr>
@@ -576,13 +550,11 @@
           <w:numId w:val="2"/>
         </w:numPr>
         <w:suppressAutoHyphens w:val="true"/>
-        <w:overflowPunct w:val="true"/>
+        <w:overflowPunct w:val="false"/>
         <w:bidi w:val="0"/>
         <w:spacing w:lineRule="auto" w:line="240" w:before="0" w:after="0"/>
         <w:jc w:val="both"/>
-        <w:rPr>
-          <w:lang w:val="es-VE"/>
-        </w:rPr>
+        <w:rPr/>
       </w:pPr>
       <w:r>
         <w:rPr>
@@ -624,13 +596,11 @@
           <w:numId w:val="2"/>
         </w:numPr>
         <w:suppressAutoHyphens w:val="true"/>
-        <w:overflowPunct w:val="true"/>
+        <w:overflowPunct w:val="false"/>
         <w:bidi w:val="0"/>
         <w:spacing w:lineRule="auto" w:line="240" w:before="0" w:after="0"/>
         <w:jc w:val="both"/>
-        <w:rPr>
-          <w:lang w:val="es-VE"/>
-        </w:rPr>
+        <w:rPr/>
       </w:pPr>
       <w:r>
         <w:rPr>
@@ -672,13 +642,11 @@
           <w:numId w:val="2"/>
         </w:numPr>
         <w:suppressAutoHyphens w:val="true"/>
-        <w:overflowPunct w:val="true"/>
+        <w:overflowPunct w:val="false"/>
         <w:bidi w:val="0"/>
         <w:spacing w:lineRule="auto" w:line="240" w:before="0" w:after="0"/>
         <w:jc w:val="both"/>
-        <w:rPr>
-          <w:lang w:val="es-VE"/>
-        </w:rPr>
+        <w:rPr/>
       </w:pPr>
       <w:r>
         <w:rPr>
@@ -716,7 +684,7 @@
       <w:pPr>
         <w:pStyle w:val="Normal"/>
         <w:suppressAutoHyphens w:val="true"/>
-        <w:overflowPunct w:val="true"/>
+        <w:overflowPunct w:val="false"/>
         <w:bidi w:val="0"/>
         <w:spacing w:lineRule="auto" w:line="240" w:before="0" w:after="0"/>
         <w:jc w:val="both"/>
@@ -742,7 +710,7 @@
       <w:pPr>
         <w:pStyle w:val="Normal"/>
         <w:suppressAutoHyphens w:val="true"/>
-        <w:overflowPunct w:val="true"/>
+        <w:overflowPunct w:val="false"/>
         <w:bidi w:val="0"/>
         <w:spacing w:lineRule="auto" w:line="240" w:before="0" w:after="0"/>
         <w:jc w:val="both"/>
@@ -768,7 +736,7 @@
       <w:pPr>
         <w:pStyle w:val="Normal"/>
         <w:suppressAutoHyphens w:val="true"/>
-        <w:overflowPunct w:val="true"/>
+        <w:overflowPunct w:val="false"/>
         <w:bidi w:val="0"/>
         <w:spacing w:lineRule="auto" w:line="240" w:before="0" w:after="0"/>
         <w:jc w:val="both"/>
@@ -794,13 +762,11 @@
       <w:pPr>
         <w:pStyle w:val="Normal"/>
         <w:suppressAutoHyphens w:val="true"/>
-        <w:overflowPunct w:val="true"/>
+        <w:overflowPunct w:val="false"/>
         <w:bidi w:val="0"/>
         <w:spacing w:lineRule="auto" w:line="240" w:before="0" w:after="0"/>
         <w:jc w:val="left"/>
-        <w:rPr>
-          <w:lang w:val="es-VE"/>
-        </w:rPr>
+        <w:rPr/>
       </w:pPr>
       <w:r>
         <w:rPr>
@@ -820,9 +786,7 @@
       <w:pPr>
         <w:pStyle w:val="Graficos"/>
         <w:spacing w:lineRule="auto" w:line="240"/>
-        <w:rPr>
-          <w:lang w:val="es-VE"/>
-        </w:rPr>
+        <w:rPr/>
       </w:pPr>
       <w:bookmarkStart w:id="5" w:name="_Toc210586746"/>
       <w:r>
@@ -894,9 +858,7 @@
         <w:spacing w:lineRule="auto" w:line="240"/>
         <w:ind w:left="0" w:right="4" w:hanging="0"/>
         <w:jc w:val="both"/>
-        <w:rPr>
-          <w:lang w:val="es-VE"/>
-        </w:rPr>
+        <w:rPr/>
       </w:pPr>
       <w:r>
         <w:rPr>
@@ -916,9 +878,7 @@
         <w:spacing w:lineRule="auto" w:line="240"/>
         <w:ind w:left="0" w:right="4" w:firstLine="708"/>
         <w:jc w:val="both"/>
-        <w:rPr>
-          <w:lang w:val="es-VE"/>
-        </w:rPr>
+        <w:rPr/>
       </w:pPr>
       <w:r>
         <w:rPr>
@@ -947,9 +907,7 @@
       <w:pPr>
         <w:pStyle w:val="Graficos"/>
         <w:spacing w:lineRule="auto" w:line="240"/>
-        <w:rPr>
-          <w:lang w:val="es-VE"/>
-        </w:rPr>
+        <w:rPr/>
       </w:pPr>
       <w:bookmarkStart w:id="6" w:name="_Toc210586747"/>
       <w:bookmarkEnd w:id="6"/>
@@ -1011,13 +969,11 @@
       <w:pPr>
         <w:pStyle w:val="Normal"/>
         <w:suppressAutoHyphens w:val="true"/>
-        <w:overflowPunct w:val="true"/>
+        <w:overflowPunct w:val="false"/>
         <w:bidi w:val="0"/>
         <w:spacing w:lineRule="auto" w:line="240" w:before="0" w:after="0"/>
         <w:jc w:val="left"/>
-        <w:rPr>
-          <w:lang w:val="es-VE"/>
-        </w:rPr>
+        <w:rPr/>
       </w:pPr>
       <w:r>
         <w:rPr>
@@ -1044,14 +1000,12 @@
       <w:pPr>
         <w:pStyle w:val="Normal"/>
         <w:suppressAutoHyphens w:val="true"/>
-        <w:overflowPunct w:val="true"/>
+        <w:overflowPunct w:val="false"/>
         <w:bidi w:val="0"/>
         <w:spacing w:lineRule="auto" w:line="240" w:before="0" w:after="0"/>
         <w:ind w:left="0" w:right="0" w:firstLine="360"/>
         <w:jc w:val="both"/>
-        <w:rPr>
-          <w:lang w:val="es-VE"/>
-        </w:rPr>
+        <w:rPr/>
       </w:pPr>
       <w:r>
         <w:rPr>
@@ -1072,13 +1026,11 @@
           <w:numId w:val="3"/>
         </w:numPr>
         <w:suppressAutoHyphens w:val="true"/>
-        <w:overflowPunct w:val="true"/>
+        <w:overflowPunct w:val="false"/>
         <w:bidi w:val="0"/>
         <w:spacing w:lineRule="auto" w:line="240" w:before="0" w:after="0"/>
         <w:jc w:val="both"/>
-        <w:rPr>
-          <w:lang w:val="es-VE"/>
-        </w:rPr>
+        <w:rPr/>
       </w:pPr>
       <w:r>
         <w:rPr>
@@ -1099,13 +1051,11 @@
           <w:numId w:val="3"/>
         </w:numPr>
         <w:suppressAutoHyphens w:val="true"/>
-        <w:overflowPunct w:val="true"/>
+        <w:overflowPunct w:val="false"/>
         <w:bidi w:val="0"/>
         <w:spacing w:lineRule="auto" w:line="240" w:before="0" w:after="0"/>
         <w:jc w:val="both"/>
-        <w:rPr>
-          <w:lang w:val="es-VE"/>
-        </w:rPr>
+        <w:rPr/>
       </w:pPr>
       <w:r>
         <w:rPr>
@@ -1126,13 +1076,11 @@
           <w:numId w:val="3"/>
         </w:numPr>
         <w:suppressAutoHyphens w:val="true"/>
-        <w:overflowPunct w:val="true"/>
+        <w:overflowPunct w:val="false"/>
         <w:bidi w:val="0"/>
         <w:spacing w:lineRule="auto" w:line="240" w:before="0" w:after="0"/>
         <w:jc w:val="both"/>
-        <w:rPr>
-          <w:lang w:val="es-VE"/>
-        </w:rPr>
+        <w:rPr/>
       </w:pPr>
       <w:r>
         <w:rPr>
@@ -1153,13 +1101,11 @@
           <w:numId w:val="3"/>
         </w:numPr>
         <w:suppressAutoHyphens w:val="true"/>
-        <w:overflowPunct w:val="true"/>
+        <w:overflowPunct w:val="false"/>
         <w:bidi w:val="0"/>
         <w:spacing w:lineRule="auto" w:line="240" w:before="0" w:after="0"/>
         <w:jc w:val="both"/>
-        <w:rPr>
-          <w:lang w:val="es-VE"/>
-        </w:rPr>
+        <w:rPr/>
       </w:pPr>
       <w:r>
         <w:rPr>
@@ -1176,7 +1122,7 @@
       <w:pPr>
         <w:pStyle w:val="Normal"/>
         <w:suppressAutoHyphens w:val="true"/>
-        <w:overflowPunct w:val="true"/>
+        <w:overflowPunct w:val="false"/>
         <w:bidi w:val="0"/>
         <w:spacing w:lineRule="auto" w:line="240" w:before="0" w:after="0"/>
         <w:jc w:val="left"/>
@@ -1209,7 +1155,7 @@
       <w:pPr>
         <w:pStyle w:val="Normal"/>
         <w:suppressAutoHyphens w:val="true"/>
-        <w:overflowPunct w:val="true"/>
+        <w:overflowPunct w:val="false"/>
         <w:bidi w:val="0"/>
         <w:spacing w:lineRule="auto" w:line="240" w:before="0" w:after="0"/>
         <w:jc w:val="left"/>
@@ -1242,7 +1188,7 @@
       <w:pPr>
         <w:pStyle w:val="Normal"/>
         <w:suppressAutoHyphens w:val="true"/>
-        <w:overflowPunct w:val="true"/>
+        <w:overflowPunct w:val="false"/>
         <w:bidi w:val="0"/>
         <w:spacing w:lineRule="auto" w:line="240" w:before="0" w:after="0"/>
         <w:jc w:val="left"/>
@@ -1275,7 +1221,7 @@
       <w:pPr>
         <w:pStyle w:val="Normal"/>
         <w:suppressAutoHyphens w:val="true"/>
-        <w:overflowPunct w:val="true"/>
+        <w:overflowPunct w:val="false"/>
         <w:bidi w:val="0"/>
         <w:spacing w:lineRule="auto" w:line="240" w:before="0" w:after="0"/>
         <w:jc w:val="left"/>
@@ -1308,7 +1254,7 @@
       <w:pPr>
         <w:pStyle w:val="Normal"/>
         <w:suppressAutoHyphens w:val="true"/>
-        <w:overflowPunct w:val="true"/>
+        <w:overflowPunct w:val="false"/>
         <w:bidi w:val="0"/>
         <w:spacing w:lineRule="auto" w:line="240" w:before="0" w:after="0"/>
         <w:jc w:val="left"/>
@@ -1341,7 +1287,7 @@
       <w:pPr>
         <w:pStyle w:val="Normal"/>
         <w:suppressAutoHyphens w:val="true"/>
-        <w:overflowPunct w:val="true"/>
+        <w:overflowPunct w:val="false"/>
         <w:bidi w:val="0"/>
         <w:spacing w:lineRule="auto" w:line="240" w:before="0" w:after="0"/>
         <w:jc w:val="left"/>
@@ -1374,7 +1320,7 @@
       <w:pPr>
         <w:pStyle w:val="Normal"/>
         <w:suppressAutoHyphens w:val="true"/>
-        <w:overflowPunct w:val="true"/>
+        <w:overflowPunct w:val="false"/>
         <w:bidi w:val="0"/>
         <w:spacing w:lineRule="auto" w:line="240" w:before="0" w:after="0"/>
         <w:jc w:val="left"/>
@@ -1407,7 +1353,7 @@
       <w:pPr>
         <w:pStyle w:val="Normal"/>
         <w:suppressAutoHyphens w:val="true"/>
-        <w:overflowPunct w:val="true"/>
+        <w:overflowPunct w:val="false"/>
         <w:bidi w:val="0"/>
         <w:spacing w:lineRule="auto" w:line="240" w:before="0" w:after="0"/>
         <w:jc w:val="left"/>
@@ -1440,7 +1386,7 @@
       <w:pPr>
         <w:pStyle w:val="Normal"/>
         <w:suppressAutoHyphens w:val="true"/>
-        <w:overflowPunct w:val="true"/>
+        <w:overflowPunct w:val="false"/>
         <w:bidi w:val="0"/>
         <w:spacing w:lineRule="auto" w:line="240" w:before="0" w:after="0"/>
         <w:jc w:val="left"/>
@@ -1473,9 +1419,7 @@
       <w:pPr>
         <w:pStyle w:val="Graficos"/>
         <w:spacing w:lineRule="auto" w:line="240"/>
-        <w:rPr>
-          <w:lang w:val="es-VE"/>
-        </w:rPr>
+        <w:rPr/>
       </w:pPr>
       <w:bookmarkStart w:id="7" w:name="_Toc210586748"/>
       <w:bookmarkEnd w:id="7"/>
@@ -1537,13 +1481,11 @@
       <w:pPr>
         <w:pStyle w:val="Normal"/>
         <w:suppressAutoHyphens w:val="true"/>
-        <w:overflowPunct w:val="true"/>
+        <w:overflowPunct w:val="false"/>
         <w:bidi w:val="0"/>
         <w:spacing w:lineRule="auto" w:line="240" w:before="0" w:after="0"/>
         <w:jc w:val="left"/>
-        <w:rPr>
-          <w:lang w:val="es-VE"/>
-        </w:rPr>
+        <w:rPr/>
       </w:pPr>
       <w:r>
         <w:rPr>
@@ -1560,7 +1502,7 @@
       <w:pPr>
         <w:pStyle w:val="Normal"/>
         <w:suppressAutoHyphens w:val="true"/>
-        <w:overflowPunct w:val="true"/>
+        <w:overflowPunct w:val="false"/>
         <w:bidi w:val="0"/>
         <w:spacing w:lineRule="auto" w:line="240" w:before="0" w:after="0"/>
         <w:jc w:val="left"/>
@@ -1586,7 +1528,7 @@
       <w:pPr>
         <w:pStyle w:val="Normal"/>
         <w:suppressAutoHyphens w:val="true"/>
-        <w:overflowPunct w:val="true"/>
+        <w:overflowPunct w:val="false"/>
         <w:bidi w:val="0"/>
         <w:spacing w:lineRule="auto" w:line="240" w:before="0" w:after="0"/>
         <w:jc w:val="left"/>
@@ -1662,9 +1604,7 @@
       <w:pPr>
         <w:pStyle w:val="Graficos"/>
         <w:spacing w:lineRule="auto" w:line="240"/>
-        <w:rPr>
-          <w:lang w:val="es-VE"/>
-        </w:rPr>
+        <w:rPr/>
       </w:pPr>
       <w:bookmarkStart w:id="8" w:name="_Toc210586749"/>
       <w:r>
@@ -1679,13 +1619,11 @@
       <w:pPr>
         <w:pStyle w:val="Normal"/>
         <w:suppressAutoHyphens w:val="true"/>
-        <w:overflowPunct w:val="true"/>
+        <w:overflowPunct w:val="false"/>
         <w:bidi w:val="0"/>
         <w:spacing w:lineRule="auto" w:line="240" w:before="0" w:after="0"/>
         <w:jc w:val="left"/>
-        <w:rPr>
-          <w:lang w:val="es-VE"/>
-        </w:rPr>
+        <w:rPr/>
       </w:pPr>
       <w:r>
         <w:rPr>
@@ -1702,7 +1640,7 @@
       <w:pPr>
         <w:pStyle w:val="Normal"/>
         <w:suppressAutoHyphens w:val="true"/>
-        <w:overflowPunct w:val="true"/>
+        <w:overflowPunct w:val="false"/>
         <w:bidi w:val="0"/>
         <w:spacing w:lineRule="auto" w:line="240" w:before="0" w:after="0"/>
         <w:jc w:val="left"/>
@@ -1728,14 +1666,12 @@
       <w:pPr>
         <w:pStyle w:val="Normal"/>
         <w:suppressAutoHyphens w:val="true"/>
-        <w:overflowPunct w:val="true"/>
+        <w:overflowPunct w:val="false"/>
         <w:bidi w:val="0"/>
         <w:spacing w:lineRule="auto" w:line="240" w:before="0" w:after="140"/>
         <w:ind w:left="0" w:right="0" w:firstLine="708"/>
         <w:jc w:val="both"/>
-        <w:rPr>
-          <w:lang w:val="es-VE"/>
-        </w:rPr>
+        <w:rPr/>
       </w:pPr>
       <w:r>
         <w:rPr>
@@ -1755,9 +1691,7 @@
         <w:bidi w:val="0"/>
         <w:spacing w:lineRule="auto" w:line="240"/>
         <w:jc w:val="left"/>
-        <w:rPr>
-          <w:lang w:val="es-VE"/>
-        </w:rPr>
+        <w:rPr/>
       </w:pPr>
       <w:r>
         <w:rPr>
@@ -1788,13 +1722,11 @@
           <w:tab w:val="left" w:pos="0" w:leader="none"/>
         </w:tabs>
         <w:suppressAutoHyphens w:val="true"/>
-        <w:overflowPunct w:val="true"/>
+        <w:overflowPunct w:val="false"/>
         <w:bidi w:val="0"/>
         <w:spacing w:lineRule="auto" w:line="240" w:before="0" w:after="140"/>
         <w:jc w:val="both"/>
-        <w:rPr>
-          <w:lang w:val="es-VE"/>
-        </w:rPr>
+        <w:rPr/>
       </w:pPr>
       <w:r>
         <w:rPr>
@@ -1819,13 +1751,11 @@
           <w:tab w:val="left" w:pos="0" w:leader="none"/>
         </w:tabs>
         <w:suppressAutoHyphens w:val="true"/>
-        <w:overflowPunct w:val="true"/>
+        <w:overflowPunct w:val="false"/>
         <w:bidi w:val="0"/>
         <w:spacing w:lineRule="auto" w:line="240" w:before="0" w:after="140"/>
         <w:jc w:val="both"/>
-        <w:rPr>
-          <w:lang w:val="es-VE"/>
-        </w:rPr>
+        <w:rPr/>
       </w:pPr>
       <w:r>
         <w:rPr>
@@ -1850,13 +1780,11 @@
           <w:tab w:val="left" w:pos="0" w:leader="none"/>
         </w:tabs>
         <w:suppressAutoHyphens w:val="true"/>
-        <w:overflowPunct w:val="true"/>
+        <w:overflowPunct w:val="false"/>
         <w:bidi w:val="0"/>
         <w:spacing w:lineRule="auto" w:line="240" w:before="0" w:after="140"/>
         <w:jc w:val="both"/>
-        <w:rPr>
-          <w:lang w:val="es-VE"/>
-        </w:rPr>
+        <w:rPr/>
       </w:pPr>
       <w:r>
         <w:rPr>
@@ -1881,13 +1809,11 @@
           <w:tab w:val="left" w:pos="0" w:leader="none"/>
         </w:tabs>
         <w:suppressAutoHyphens w:val="true"/>
-        <w:overflowPunct w:val="true"/>
+        <w:overflowPunct w:val="false"/>
         <w:bidi w:val="0"/>
         <w:spacing w:lineRule="auto" w:line="240" w:before="0" w:after="140"/>
         <w:jc w:val="both"/>
-        <w:rPr>
-          <w:lang w:val="es-VE"/>
-        </w:rPr>
+        <w:rPr/>
       </w:pPr>
       <w:r>
         <w:rPr>
@@ -1908,7 +1834,7 @@
           <w:tab w:val="left" w:pos="0" w:leader="none"/>
         </w:tabs>
         <w:suppressAutoHyphens w:val="true"/>
-        <w:overflowPunct w:val="true"/>
+        <w:overflowPunct w:val="false"/>
         <w:bidi w:val="0"/>
         <w:spacing w:lineRule="auto" w:line="240" w:before="0" w:after="140"/>
         <w:jc w:val="both"/>
@@ -1979,9 +1905,7 @@
       <w:pPr>
         <w:pStyle w:val="Graficos"/>
         <w:spacing w:lineRule="auto" w:line="240"/>
-        <w:rPr>
-          <w:lang w:val="es-VE"/>
-        </w:rPr>
+        <w:rPr/>
       </w:pPr>
       <w:bookmarkStart w:id="9" w:name="_Toc210586750"/>
       <w:r>
@@ -1996,13 +1920,11 @@
       <w:pPr>
         <w:pStyle w:val="Normal"/>
         <w:suppressAutoHyphens w:val="true"/>
-        <w:overflowPunct w:val="true"/>
+        <w:overflowPunct w:val="false"/>
         <w:bidi w:val="0"/>
         <w:spacing w:lineRule="auto" w:line="240" w:before="0" w:after="0"/>
         <w:jc w:val="left"/>
-        <w:rPr>
-          <w:lang w:val="es-VE"/>
-        </w:rPr>
+        <w:rPr/>
       </w:pPr>
       <w:r>
         <w:rPr>
@@ -2020,7 +1942,7 @@
       <w:pPr>
         <w:pStyle w:val="Normal"/>
         <w:suppressAutoHyphens w:val="true"/>
-        <w:overflowPunct w:val="true"/>
+        <w:overflowPunct w:val="false"/>
         <w:bidi w:val="0"/>
         <w:spacing w:lineRule="auto" w:line="240" w:before="0" w:after="0"/>
         <w:jc w:val="left"/>
@@ -2048,14 +1970,12 @@
       <w:pPr>
         <w:pStyle w:val="Normal"/>
         <w:suppressAutoHyphens w:val="true"/>
-        <w:overflowPunct w:val="true"/>
+        <w:overflowPunct w:val="false"/>
         <w:bidi w:val="0"/>
         <w:spacing w:lineRule="auto" w:line="240" w:before="0" w:after="140"/>
         <w:ind w:left="0" w:right="0" w:firstLine="708"/>
         <w:jc w:val="both"/>
-        <w:rPr>
-          <w:lang w:val="es-VE"/>
-        </w:rPr>
+        <w:rPr/>
       </w:pPr>
       <w:r>
         <w:rPr>
@@ -2083,9 +2003,7 @@
       <w:pPr>
         <w:pStyle w:val="Graficos"/>
         <w:spacing w:lineRule="auto" w:line="240"/>
-        <w:rPr>
-          <w:lang w:val="es-VE"/>
-        </w:rPr>
+        <w:rPr/>
       </w:pPr>
       <w:bookmarkStart w:id="10" w:name="_Toc210586751"/>
       <w:bookmarkEnd w:id="10"/>
@@ -2147,13 +2065,11 @@
       <w:pPr>
         <w:pStyle w:val="Normal"/>
         <w:suppressAutoHyphens w:val="true"/>
-        <w:overflowPunct w:val="true"/>
+        <w:overflowPunct w:val="false"/>
         <w:bidi w:val="0"/>
         <w:spacing w:lineRule="auto" w:line="240" w:before="0" w:after="0"/>
         <w:jc w:val="left"/>
-        <w:rPr>
-          <w:lang w:val="es-VE"/>
-        </w:rPr>
+        <w:rPr/>
       </w:pPr>
       <w:r>
         <w:rPr>
@@ -2171,14 +2087,12 @@
       <w:pPr>
         <w:pStyle w:val="Normal"/>
         <w:suppressAutoHyphens w:val="true"/>
-        <w:overflowPunct w:val="true"/>
+        <w:overflowPunct w:val="false"/>
         <w:bidi w:val="0"/>
         <w:spacing w:lineRule="auto" w:line="240" w:before="0" w:after="140"/>
         <w:ind w:left="0" w:right="0" w:firstLine="426"/>
         <w:jc w:val="left"/>
-        <w:rPr>
-          <w:lang w:val="es-VE"/>
-        </w:rPr>
+        <w:rPr/>
       </w:pPr>
       <w:r>
         <w:rPr>
@@ -2204,13 +2118,11 @@
           <w:tab w:val="left" w:pos="0" w:leader="none"/>
         </w:tabs>
         <w:suppressAutoHyphens w:val="true"/>
-        <w:overflowPunct w:val="true"/>
+        <w:overflowPunct w:val="false"/>
         <w:bidi w:val="0"/>
         <w:spacing w:lineRule="auto" w:line="240" w:before="0" w:after="140"/>
         <w:jc w:val="left"/>
-        <w:rPr>
-          <w:lang w:val="es-VE"/>
-        </w:rPr>
+        <w:rPr/>
       </w:pPr>
       <w:r>
         <w:rPr>
@@ -2235,13 +2147,11 @@
           <w:tab w:val="left" w:pos="0" w:leader="none"/>
         </w:tabs>
         <w:suppressAutoHyphens w:val="true"/>
-        <w:overflowPunct w:val="true"/>
+        <w:overflowPunct w:val="false"/>
         <w:bidi w:val="0"/>
         <w:spacing w:lineRule="auto" w:line="240" w:before="0" w:after="140"/>
         <w:jc w:val="left"/>
-        <w:rPr>
-          <w:lang w:val="es-VE"/>
-        </w:rPr>
+        <w:rPr/>
       </w:pPr>
       <w:r>
         <w:rPr>
@@ -2266,13 +2176,11 @@
           <w:tab w:val="left" w:pos="0" w:leader="none"/>
         </w:tabs>
         <w:suppressAutoHyphens w:val="true"/>
-        <w:overflowPunct w:val="true"/>
+        <w:overflowPunct w:val="false"/>
         <w:bidi w:val="0"/>
         <w:spacing w:lineRule="auto" w:line="240" w:before="0" w:after="140"/>
         <w:jc w:val="left"/>
-        <w:rPr>
-          <w:lang w:val="es-VE"/>
-        </w:rPr>
+        <w:rPr/>
       </w:pPr>
       <w:r>
         <w:rPr>
@@ -2297,13 +2205,11 @@
           <w:tab w:val="left" w:pos="0" w:leader="none"/>
         </w:tabs>
         <w:suppressAutoHyphens w:val="true"/>
-        <w:overflowPunct w:val="true"/>
+        <w:overflowPunct w:val="false"/>
         <w:bidi w:val="0"/>
         <w:spacing w:lineRule="auto" w:line="240" w:before="0" w:after="140"/>
         <w:jc w:val="left"/>
-        <w:rPr>
-          <w:lang w:val="es-VE"/>
-        </w:rPr>
+        <w:rPr/>
       </w:pPr>
       <w:r>
         <w:rPr>
@@ -2320,7 +2226,7 @@
       <w:pPr>
         <w:pStyle w:val="Normal"/>
         <w:suppressAutoHyphens w:val="true"/>
-        <w:overflowPunct w:val="true"/>
+        <w:overflowPunct w:val="false"/>
         <w:bidi w:val="0"/>
         <w:spacing w:lineRule="auto" w:line="240" w:before="0" w:after="0"/>
         <w:jc w:val="left"/>
@@ -2346,7 +2252,7 @@
       <w:pPr>
         <w:pStyle w:val="Normal"/>
         <w:suppressAutoHyphens w:val="true"/>
-        <w:overflowPunct w:val="true"/>
+        <w:overflowPunct w:val="false"/>
         <w:bidi w:val="0"/>
         <w:spacing w:lineRule="auto" w:line="240" w:before="240" w:after="0"/>
         <w:jc w:val="left"/>
@@ -2409,7 +2315,7 @@
       <w:pPr>
         <w:pStyle w:val="Normal"/>
         <w:suppressAutoHyphens w:val="true"/>
-        <w:overflowPunct w:val="true"/>
+        <w:overflowPunct w:val="false"/>
         <w:bidi w:val="0"/>
         <w:spacing w:lineRule="auto" w:line="240" w:before="240" w:after="0"/>
         <w:jc w:val="left"/>
@@ -2441,13 +2347,11 @@
       <w:pPr>
         <w:pStyle w:val="Normal"/>
         <w:suppressAutoHyphens w:val="true"/>
-        <w:overflowPunct w:val="true"/>
+        <w:overflowPunct w:val="false"/>
         <w:bidi w:val="0"/>
         <w:spacing w:lineRule="auto" w:line="240" w:before="0" w:after="0"/>
         <w:jc w:val="left"/>
-        <w:rPr>
-          <w:lang w:val="es-VE"/>
-        </w:rPr>
+        <w:rPr/>
       </w:pPr>
       <w:r>
         <w:rPr>
@@ -2465,7 +2369,7 @@
       <w:pPr>
         <w:pStyle w:val="Normal"/>
         <w:suppressAutoHyphens w:val="true"/>
-        <w:overflowPunct w:val="true"/>
+        <w:overflowPunct w:val="false"/>
         <w:bidi w:val="0"/>
         <w:spacing w:lineRule="auto" w:line="240" w:before="0" w:after="0"/>
         <w:jc w:val="left"/>
@@ -2491,14 +2395,12 @@
       <w:pPr>
         <w:pStyle w:val="Normal"/>
         <w:suppressAutoHyphens w:val="true"/>
-        <w:overflowPunct w:val="true"/>
+        <w:overflowPunct w:val="false"/>
         <w:bidi w:val="0"/>
         <w:spacing w:lineRule="auto" w:line="240" w:before="0" w:after="140"/>
         <w:ind w:left="0" w:right="0" w:firstLine="360"/>
         <w:jc w:val="both"/>
-        <w:rPr>
-          <w:lang w:val="es-VE"/>
-        </w:rPr>
+        <w:rPr/>
       </w:pPr>
       <w:r>
         <w:rPr>
@@ -2520,13 +2422,11 @@
           <w:numId w:val="6"/>
         </w:numPr>
         <w:suppressAutoHyphens w:val="true"/>
-        <w:overflowPunct w:val="true"/>
+        <w:overflowPunct w:val="false"/>
         <w:bidi w:val="0"/>
         <w:spacing w:lineRule="auto" w:line="240" w:before="0" w:after="140"/>
         <w:jc w:val="both"/>
-        <w:rPr>
-          <w:lang w:val="es-VE"/>
-        </w:rPr>
+        <w:rPr/>
       </w:pPr>
       <w:r>
         <w:rPr>
@@ -2547,13 +2447,11 @@
           <w:numId w:val="6"/>
         </w:numPr>
         <w:suppressAutoHyphens w:val="true"/>
-        <w:overflowPunct w:val="true"/>
+        <w:overflowPunct w:val="false"/>
         <w:bidi w:val="0"/>
         <w:spacing w:lineRule="auto" w:line="240" w:before="0" w:after="140"/>
         <w:jc w:val="both"/>
-        <w:rPr>
-          <w:lang w:val="es-VE"/>
-        </w:rPr>
+        <w:rPr/>
       </w:pPr>
       <w:r>
         <w:rPr>
@@ -2574,13 +2472,11 @@
           <w:numId w:val="6"/>
         </w:numPr>
         <w:suppressAutoHyphens w:val="true"/>
-        <w:overflowPunct w:val="true"/>
+        <w:overflowPunct w:val="false"/>
         <w:bidi w:val="0"/>
         <w:spacing w:lineRule="auto" w:line="240" w:before="0" w:after="140"/>
         <w:jc w:val="both"/>
-        <w:rPr>
-          <w:lang w:val="es-VE"/>
-        </w:rPr>
+        <w:rPr/>
       </w:pPr>
       <w:r>
         <w:rPr>
@@ -2601,13 +2497,11 @@
           <w:numId w:val="6"/>
         </w:numPr>
         <w:suppressAutoHyphens w:val="true"/>
-        <w:overflowPunct w:val="true"/>
+        <w:overflowPunct w:val="false"/>
         <w:bidi w:val="0"/>
         <w:spacing w:lineRule="auto" w:line="240" w:before="0" w:after="140"/>
         <w:jc w:val="both"/>
-        <w:rPr>
-          <w:lang w:val="es-VE"/>
-        </w:rPr>
+        <w:rPr/>
       </w:pPr>
       <w:r>
         <w:rPr>
@@ -2628,13 +2522,11 @@
           <w:numId w:val="6"/>
         </w:numPr>
         <w:suppressAutoHyphens w:val="true"/>
-        <w:overflowPunct w:val="true"/>
+        <w:overflowPunct w:val="false"/>
         <w:bidi w:val="0"/>
         <w:spacing w:lineRule="auto" w:line="240" w:before="0" w:after="140"/>
         <w:jc w:val="both"/>
-        <w:rPr>
-          <w:lang w:val="es-VE"/>
-        </w:rPr>
+        <w:rPr/>
       </w:pPr>
       <w:r>
         <w:rPr>
@@ -2655,13 +2547,11 @@
           <w:numId w:val="6"/>
         </w:numPr>
         <w:suppressAutoHyphens w:val="true"/>
-        <w:overflowPunct w:val="true"/>
+        <w:overflowPunct w:val="false"/>
         <w:bidi w:val="0"/>
         <w:spacing w:lineRule="auto" w:line="240" w:before="0" w:after="140"/>
         <w:jc w:val="both"/>
-        <w:rPr>
-          <w:lang w:val="es-VE"/>
-        </w:rPr>
+        <w:rPr/>
       </w:pPr>
       <w:r>
         <w:rPr>
@@ -2723,9 +2613,7 @@
         <w:spacing w:lineRule="auto" w:line="240"/>
         <w:ind w:left="0" w:hanging="0"/>
         <w:jc w:val="left"/>
-        <w:rPr>
-          <w:lang w:val="es-VE"/>
-        </w:rPr>
+        <w:rPr/>
       </w:pPr>
       <w:r>
         <w:rPr>
@@ -2855,9 +2743,7 @@
         <w:bidi w:val="0"/>
         <w:spacing w:lineRule="auto" w:line="240"/>
         <w:jc w:val="left"/>
-        <w:rPr>
-          <w:lang w:val="es-VE"/>
-        </w:rPr>
+        <w:rPr/>
       </w:pPr>
       <w:r>
         <w:rPr>
@@ -2872,9 +2758,7 @@
         <w:bidi w:val="0"/>
         <w:spacing w:lineRule="auto" w:line="240"/>
         <w:jc w:val="left"/>
-        <w:rPr>
-          <w:lang w:val="es-VE"/>
-        </w:rPr>
+        <w:rPr/>
       </w:pPr>
       <w:r>
         <w:rPr>
@@ -2951,9 +2835,7 @@
         <w:spacing w:lineRule="auto" w:line="240"/>
         <w:ind w:left="709" w:hanging="283"/>
         <w:jc w:val="left"/>
-        <w:rPr>
-          <w:lang w:val="es-VE"/>
-        </w:rPr>
+        <w:rPr/>
       </w:pPr>
       <w:r>
         <w:rPr>
@@ -2984,9 +2866,7 @@
         <w:bidi w:val="0"/>
         <w:spacing w:lineRule="auto" w:line="240"/>
         <w:jc w:val="left"/>
-        <w:rPr>
-          <w:lang w:val="es-VE"/>
-        </w:rPr>
+        <w:rPr/>
       </w:pPr>
       <w:r>
         <w:rPr>
@@ -3045,9 +2925,7 @@
         <w:spacing w:lineRule="auto" w:line="240"/>
         <w:ind w:left="709" w:hanging="283"/>
         <w:jc w:val="left"/>
-        <w:rPr>
-          <w:lang w:val="es-VE"/>
-        </w:rPr>
+        <w:rPr/>
       </w:pPr>
       <w:r>
         <w:rPr>
@@ -3070,9 +2948,7 @@
         <w:spacing w:lineRule="auto" w:line="240"/>
         <w:ind w:left="709" w:hanging="0"/>
         <w:jc w:val="left"/>
-        <w:rPr>
-          <w:lang w:val="es-VE"/>
-        </w:rPr>
+        <w:rPr/>
       </w:pPr>
       <w:r>
         <w:rPr>
@@ -3084,37 +2960,7 @@
         <w:rPr>
           <w:lang w:val="es-VE" w:eastAsia="zxx" w:bidi="zxx"/>
         </w:rPr>
-        <w:t xml:space="preserve">Tip: </w:t>
-      </w:r>
-      <w:r>
-        <w:rPr>
-          <w:lang w:val="es-VE" w:eastAsia="zxx" w:bidi="zxx"/>
-        </w:rPr>
-        <w:t xml:space="preserve">puede usar control + </w:t>
-      </w:r>
-      <w:r>
-        <w:rPr>
-          <w:lang w:val="es-VE" w:eastAsia="zxx" w:bidi="zxx"/>
-        </w:rPr>
-        <w:t>F</w:t>
-      </w:r>
-      <w:r>
-        <w:rPr>
-          <w:lang w:val="es-VE" w:eastAsia="zxx" w:bidi="zxx"/>
-        </w:rPr>
-        <w:t xml:space="preserve"> y escribir la fecha </w:t>
-      </w:r>
-      <w:r>
-        <w:rPr>
-          <w:lang w:val="es-VE" w:eastAsia="zxx" w:bidi="zxx"/>
-        </w:rPr>
-        <w:t>en formato YYYY-MM-DD, por ejemplo si se quiere editar la misa del 5 de marzo del 2026, escribir 2026-03-05, a</w:t>
-      </w:r>
-      <w:r>
-        <w:rPr>
-          <w:lang w:val="es-VE" w:eastAsia="zxx" w:bidi="zxx"/>
-        </w:rPr>
-        <w:t>segúrese de incluir los ceros en días o meses menores a 10.</w:t>
+        <w:t>Tip: puede usar control + F y escribir la fecha en formato YYYY-MM-DD, por ejemplo si se quiere editar la misa del 5 de marzo del 2026, escribir 2026-03-05, asegúrese de incluir los ceros en días o meses menores a 10.</w:t>
       </w:r>
     </w:p>
     <w:p>
@@ -3283,9 +3129,7 @@
         <w:bidi w:val="0"/>
         <w:spacing w:lineRule="auto" w:line="240"/>
         <w:jc w:val="left"/>
-        <w:rPr>
-          <w:lang w:val="es-VE"/>
-        </w:rPr>
+        <w:rPr/>
       </w:pPr>
       <w:r>
         <w:rPr>
@@ -3386,9 +3230,7 @@
         <w:spacing w:lineRule="auto" w:line="240"/>
         <w:ind w:left="709" w:hanging="283"/>
         <w:jc w:val="left"/>
-        <w:rPr>
-          <w:lang w:val="es-VE"/>
-        </w:rPr>
+        <w:rPr/>
       </w:pPr>
       <w:r>
         <w:rPr>
@@ -3410,9 +3252,7 @@
         <w:spacing w:lineRule="auto" w:line="240"/>
         <w:ind w:left="0" w:hanging="0"/>
         <w:jc w:val="left"/>
-        <w:rPr>
-          <w:lang w:val="es-VE"/>
-        </w:rPr>
+        <w:rPr/>
       </w:pPr>
       <w:r>
         <w:rPr>
@@ -3488,9 +3328,7 @@
         <w:bidi w:val="0"/>
         <w:spacing w:lineRule="auto" w:line="240"/>
         <w:jc w:val="left"/>
-        <w:rPr>
-          <w:lang w:val="es-VE"/>
-        </w:rPr>
+        <w:rPr/>
       </w:pPr>
       <w:r>
         <w:rPr>
@@ -3621,9 +3459,7 @@
         <w:spacing w:lineRule="auto" w:line="240"/>
         <w:ind w:left="709" w:hanging="283"/>
         <w:jc w:val="left"/>
-        <w:rPr>
-          <w:lang w:val="es-VE"/>
-        </w:rPr>
+        <w:rPr/>
       </w:pPr>
       <w:r>
         <w:rPr>
@@ -3647,9 +3483,7 @@
         <w:spacing w:lineRule="auto" w:line="240"/>
         <w:ind w:left="1418" w:hanging="283"/>
         <w:jc w:val="left"/>
-        <w:rPr>
-          <w:lang w:val="es-VE"/>
-        </w:rPr>
+        <w:rPr/>
       </w:pPr>
       <w:r>
         <w:rPr>
@@ -3673,9 +3507,7 @@
         <w:spacing w:lineRule="auto" w:line="240"/>
         <w:ind w:left="1418" w:hanging="283"/>
         <w:jc w:val="left"/>
-        <w:rPr>
-          <w:lang w:val="es-VE"/>
-        </w:rPr>
+        <w:rPr/>
       </w:pPr>
       <w:r>
         <w:rPr>
@@ -3699,9 +3531,7 @@
         <w:spacing w:lineRule="auto" w:line="240"/>
         <w:ind w:left="1418" w:hanging="283"/>
         <w:jc w:val="left"/>
-        <w:rPr>
-          <w:lang w:val="es-VE"/>
-        </w:rPr>
+        <w:rPr/>
       </w:pPr>
       <w:r>
         <w:rPr>
@@ -3725,9 +3555,7 @@
         <w:spacing w:lineRule="auto" w:line="240"/>
         <w:ind w:left="1418" w:hanging="283"/>
         <w:jc w:val="left"/>
-        <w:rPr>
-          <w:lang w:val="es-VE"/>
-        </w:rPr>
+        <w:rPr/>
       </w:pPr>
       <w:r>
         <w:rPr>
@@ -3751,9 +3579,7 @@
         <w:spacing w:lineRule="auto" w:line="240"/>
         <w:ind w:left="1418" w:hanging="283"/>
         <w:jc w:val="left"/>
-        <w:rPr>
-          <w:lang w:val="es-VE"/>
-        </w:rPr>
+        <w:rPr/>
       </w:pPr>
       <w:r>
         <w:rPr>
@@ -3768,9 +3594,7 @@
         <w:bidi w:val="0"/>
         <w:spacing w:lineRule="auto" w:line="240"/>
         <w:jc w:val="left"/>
-        <w:rPr>
-          <w:lang w:val="es-VE"/>
-        </w:rPr>
+        <w:rPr/>
       </w:pPr>
       <w:r>
         <w:rPr>
@@ -3785,9 +3609,7 @@
         <w:bidi w:val="0"/>
         <w:spacing w:lineRule="auto" w:line="240"/>
         <w:jc w:val="left"/>
-        <w:rPr>
-          <w:lang w:val="es-VE"/>
-        </w:rPr>
+        <w:rPr/>
       </w:pPr>
       <w:r>
         <w:rPr>
@@ -3846,9 +3668,7 @@
         <w:spacing w:lineRule="auto" w:line="240"/>
         <w:ind w:left="709" w:hanging="283"/>
         <w:jc w:val="left"/>
-        <w:rPr>
-          <w:lang w:val="es-VE"/>
-        </w:rPr>
+        <w:rPr/>
       </w:pPr>
       <w:r>
         <w:rPr>
@@ -3915,9 +3735,7 @@
         <w:bidi w:val="0"/>
         <w:spacing w:lineRule="auto" w:line="240"/>
         <w:jc w:val="left"/>
-        <w:rPr>
-          <w:lang w:val="es-VE"/>
-        </w:rPr>
+        <w:rPr/>
       </w:pPr>
       <w:r>
         <w:rPr>
@@ -4162,9 +3980,7 @@
         <w:spacing w:lineRule="auto" w:line="240"/>
         <w:ind w:left="1418" w:hanging="283"/>
         <w:jc w:val="left"/>
-        <w:rPr>
-          <w:lang w:val="es-VE"/>
-        </w:rPr>
+        <w:rPr/>
       </w:pPr>
       <w:r>
         <w:rPr>
@@ -4188,9 +4004,7 @@
         <w:spacing w:lineRule="auto" w:line="240"/>
         <w:ind w:left="1418" w:hanging="283"/>
         <w:jc w:val="left"/>
-        <w:rPr>
-          <w:lang w:val="es-VE"/>
-        </w:rPr>
+        <w:rPr/>
       </w:pPr>
       <w:r>
         <w:rPr>
@@ -4205,15 +4019,13 @@
         <w:bidi w:val="0"/>
         <w:spacing w:lineRule="auto" w:line="240"/>
         <w:jc w:val="left"/>
-        <w:rPr>
-          <w:lang w:val="es-VE"/>
-        </w:rPr>
-      </w:pPr>
-      <w:r>
-        <w:rPr>
-          <w:lang w:val="es-VE" w:eastAsia="zxx" w:bidi="zxx"/>
-        </w:rPr>
-        <w:t>Recomendaciones importantes</w:t>
+        <w:rPr/>
+      </w:pPr>
+      <w:r>
+        <w:rPr>
+          <w:lang w:val="es-VE" w:eastAsia="zxx" w:bidi="zxx"/>
+        </w:rPr>
+        <w:t>Recomendaciones</w:t>
       </w:r>
     </w:p>
     <w:p>
@@ -4314,9 +4126,7 @@
         <w:spacing w:lineRule="auto" w:line="240"/>
         <w:ind w:left="709" w:hanging="283"/>
         <w:jc w:val="left"/>
-        <w:rPr>
-          <w:lang w:val="es-VE"/>
-        </w:rPr>
+        <w:rPr/>
       </w:pPr>
       <w:r>
         <w:rPr>
@@ -4355,20 +4165,328 @@
     <w:p>
       <w:pPr>
         <w:pStyle w:val="Heading2"/>
+        <w:numPr>
+          <w:ilvl w:val="0"/>
+          <w:numId w:val="0"/>
+        </w:numPr>
         <w:bidi w:val="0"/>
         <w:spacing w:lineRule="auto" w:line="240"/>
         <w:ind w:left="0" w:hanging="0"/>
         <w:jc w:val="left"/>
         <w:rPr>
-          <w:lang w:val="es-VE"/>
-        </w:rPr>
-      </w:pPr>
-      <w:r>
-        <w:rPr>
+          <w:b/>
+          <w:b/>
+          <w:bCs/>
           <w:sz w:val="32"/>
           <w:szCs w:val="32"/>
           <w:lang w:val="es-VE" w:eastAsia="zxx" w:bidi="zxx"/>
         </w:rPr>
+      </w:pPr>
+      <w:r>
+        <w:rPr>
+          <w:rFonts w:eastAsia="Noto Serif CJK SC" w:cs="Noto Sans Devanagari" w:ascii="Liberation Serif" w:hAnsi="Liberation Serif"/>
+          <w:b/>
+          <w:bCs/>
+          <w:color w:val="auto"/>
+          <w:kern w:val="2"/>
+          <w:sz w:val="32"/>
+          <w:szCs w:val="32"/>
+          <w:lang w:val="es-VE" w:eastAsia="zxx" w:bidi="zxx"/>
+        </w:rPr>
+        <w:t>Cómo editar las constancias generadas</w:t>
+      </w:r>
+    </w:p>
+    <w:p>
+      <w:pPr>
+        <w:pStyle w:val="TextBody"/>
+        <w:spacing w:lineRule="auto" w:line="240"/>
+        <w:rPr>
+          <w:lang w:val="es-VE"/>
+        </w:rPr>
+      </w:pPr>
+      <w:r>
+        <w:rPr>
+          <w:lang w:val="es-VE"/>
+        </w:rPr>
+        <w:t>Si necesitas realizar cambios manuales en el documento, puedes descargar una versión editable siguiendo estos pasos:</w:t>
+      </w:r>
+    </w:p>
+    <w:p>
+      <w:pPr>
+        <w:pStyle w:val="TextBody"/>
+        <w:numPr>
+          <w:ilvl w:val="0"/>
+          <w:numId w:val="39"/>
+        </w:numPr>
+        <w:tabs>
+          <w:tab w:val="clear" w:pos="709"/>
+          <w:tab w:val="left" w:pos="0" w:leader="none"/>
+        </w:tabs>
+        <w:spacing w:lineRule="auto" w:line="240"/>
+        <w:ind w:left="709" w:hanging="283"/>
+        <w:rPr>
+          <w:lang w:val="es-VE"/>
+        </w:rPr>
+      </w:pPr>
+      <w:r>
+        <w:rPr>
+          <w:b/>
+          <w:lang w:val="es-VE"/>
+        </w:rPr>
+        <w:t>Genera el documento:</w:t>
+      </w:r>
+      <w:r>
+        <w:rPr>
+          <w:lang w:val="es-VE"/>
+        </w:rPr>
+        <w:t xml:space="preserve"> Abre la constancia de forma habitual en tu navegador.</w:t>
+      </w:r>
+    </w:p>
+    <w:p>
+      <w:pPr>
+        <w:pStyle w:val="TextBody"/>
+        <w:numPr>
+          <w:ilvl w:val="0"/>
+          <w:numId w:val="39"/>
+        </w:numPr>
+        <w:tabs>
+          <w:tab w:val="clear" w:pos="709"/>
+          <w:tab w:val="left" w:pos="0" w:leader="none"/>
+        </w:tabs>
+        <w:spacing w:lineRule="auto" w:line="240"/>
+        <w:ind w:left="709" w:hanging="283"/>
+        <w:rPr/>
+      </w:pPr>
+      <w:r>
+        <w:rPr>
+          <w:b/>
+          <w:lang w:val="es-VE"/>
+        </w:rPr>
+        <w:t>Modifica la URL:</w:t>
+      </w:r>
+      <w:r>
+        <w:rPr>
+          <w:lang w:val="es-VE"/>
+        </w:rPr>
+        <w:t xml:space="preserve"> En la barra de direcciones de tu navegador (donde aparece el link </w:t>
+      </w:r>
+      <w:r>
+        <w:rPr>
+          <w:rStyle w:val="SourceText"/>
+          <w:lang w:val="es-VE"/>
+        </w:rPr>
+        <w:t>.../documentos/intenciones_generado.pdf</w:t>
+      </w:r>
+      <w:r>
+        <w:rPr>
+          <w:lang w:val="es-VE"/>
+        </w:rPr>
+        <w:t>), selecciona la parte final del texto.</w:t>
+      </w:r>
+    </w:p>
+    <w:p>
+      <w:pPr>
+        <w:pStyle w:val="TextBody"/>
+        <w:numPr>
+          <w:ilvl w:val="0"/>
+          <w:numId w:val="39"/>
+        </w:numPr>
+        <w:tabs>
+          <w:tab w:val="clear" w:pos="709"/>
+          <w:tab w:val="left" w:pos="0" w:leader="none"/>
+        </w:tabs>
+        <w:spacing w:lineRule="auto" w:line="240"/>
+        <w:ind w:left="709" w:hanging="283"/>
+        <w:rPr/>
+      </w:pPr>
+      <w:r>
+        <w:rPr>
+          <w:b/>
+          <w:lang w:val="es-VE"/>
+        </w:rPr>
+        <w:t>Cambia la extensión:</w:t>
+      </w:r>
+      <w:r>
+        <w:rPr>
+          <w:lang w:val="es-VE"/>
+        </w:rPr>
+        <w:t xml:space="preserve"> Reemplaza el texto </w:t>
+      </w:r>
+      <w:r>
+        <w:rPr>
+          <w:rStyle w:val="SourceText"/>
+          <w:lang w:val="es-VE"/>
+        </w:rPr>
+        <w:t>.pdf</w:t>
+      </w:r>
+      <w:r>
+        <w:rPr>
+          <w:lang w:val="es-VE"/>
+        </w:rPr>
+        <w:t xml:space="preserve"> por </w:t>
+      </w:r>
+      <w:r>
+        <w:rPr>
+          <w:rStyle w:val="SourceText"/>
+          <w:lang w:val="es-VE"/>
+        </w:rPr>
+        <w:t>.docx</w:t>
+      </w:r>
+      <w:r>
+        <w:rPr>
+          <w:lang w:val="es-VE"/>
+        </w:rPr>
+        <w:t>.</w:t>
+      </w:r>
+    </w:p>
+    <w:p>
+      <w:pPr>
+        <w:pStyle w:val="TextBody"/>
+        <w:numPr>
+          <w:ilvl w:val="0"/>
+          <w:numId w:val="39"/>
+        </w:numPr>
+        <w:tabs>
+          <w:tab w:val="clear" w:pos="709"/>
+          <w:tab w:val="left" w:pos="0" w:leader="none"/>
+        </w:tabs>
+        <w:spacing w:lineRule="auto" w:line="240"/>
+        <w:ind w:left="709" w:hanging="283"/>
+        <w:rPr>
+          <w:lang w:val="es-VE"/>
+        </w:rPr>
+      </w:pPr>
+      <w:r>
+        <w:rPr>
+          <w:b/>
+          <w:lang w:val="es-VE"/>
+        </w:rPr>
+        <w:t>Descarga:</w:t>
+      </w:r>
+      <w:r>
+        <w:rPr>
+          <w:lang w:val="es-VE"/>
+        </w:rPr>
+        <w:t xml:space="preserve"> Presiona la tecla </w:t>
+      </w:r>
+      <w:r>
+        <w:rPr>
+          <w:b/>
+          <w:lang w:val="es-VE"/>
+        </w:rPr>
+        <w:t>Enter</w:t>
+      </w:r>
+      <w:r>
+        <w:rPr>
+          <w:lang w:val="es-VE"/>
+        </w:rPr>
+        <w:t>. El sistema descargará automáticamente el archivo en formato Word para que puedas editarlo.</w:t>
+      </w:r>
+    </w:p>
+    <w:p>
+      <w:pPr>
+        <w:pStyle w:val="Quotations"/>
+        <w:spacing w:lineRule="auto" w:line="240"/>
+        <w:rPr>
+          <w:b/>
+          <w:lang w:val="es-VE"/>
+        </w:rPr>
+      </w:pPr>
+      <w:r>
+        <w:rPr>
+          <w:b/>
+          <w:lang w:val="es-VE"/>
+        </w:rPr>
+        <w:t>Ejemplo:</w:t>
+      </w:r>
+    </w:p>
+    <w:p>
+      <w:pPr>
+        <w:pStyle w:val="Quotations"/>
+        <w:numPr>
+          <w:ilvl w:val="0"/>
+          <w:numId w:val="40"/>
+        </w:numPr>
+        <w:tabs>
+          <w:tab w:val="clear" w:pos="709"/>
+          <w:tab w:val="left" w:pos="0" w:leader="none"/>
+        </w:tabs>
+        <w:spacing w:lineRule="auto" w:line="240"/>
+        <w:ind w:left="1276" w:right="567" w:hanging="283"/>
+        <w:rPr/>
+      </w:pPr>
+      <w:r>
+        <w:rPr>
+          <w:b/>
+          <w:lang w:val="es-VE"/>
+        </w:rPr>
+        <w:t>Original:</w:t>
+      </w:r>
+      <w:r>
+        <w:rPr>
+          <w:lang w:val="es-VE"/>
+        </w:rPr>
+        <w:t xml:space="preserve"> </w:t>
+      </w:r>
+      <w:r>
+        <w:rPr>
+          <w:rStyle w:val="SourceText"/>
+          <w:lang w:val="es-VE"/>
+        </w:rPr>
+        <w:t>.../intenciones_generado.pdf</w:t>
+      </w:r>
+    </w:p>
+    <w:p>
+      <w:pPr>
+        <w:pStyle w:val="Quotations"/>
+        <w:numPr>
+          <w:ilvl w:val="0"/>
+          <w:numId w:val="40"/>
+        </w:numPr>
+        <w:tabs>
+          <w:tab w:val="clear" w:pos="709"/>
+          <w:tab w:val="left" w:pos="0" w:leader="none"/>
+        </w:tabs>
+        <w:spacing w:lineRule="auto" w:line="240"/>
+        <w:ind w:left="1276" w:right="567" w:hanging="283"/>
+        <w:rPr/>
+      </w:pPr>
+      <w:r>
+        <w:rPr>
+          <w:b/>
+          <w:lang w:val="es-VE"/>
+        </w:rPr>
+        <w:t>Modificado:</w:t>
+      </w:r>
+      <w:r>
+        <w:rPr>
+          <w:lang w:val="es-VE"/>
+        </w:rPr>
+        <w:t xml:space="preserve"> </w:t>
+      </w:r>
+      <w:r>
+        <w:rPr>
+          <w:rStyle w:val="SourceText"/>
+          <w:lang w:val="es-VE"/>
+        </w:rPr>
+        <w:t>.../intenciones_generado.docx</w:t>
+      </w:r>
+    </w:p>
+    <w:p>
+      <w:pPr>
+        <w:pStyle w:val="Heading2"/>
+        <w:bidi w:val="0"/>
+        <w:spacing w:lineRule="auto" w:line="240"/>
+        <w:ind w:left="0" w:hanging="0"/>
+        <w:jc w:val="left"/>
+        <w:rPr/>
+      </w:pPr>
+      <w:r>
+        <w:rPr>
+          <w:sz w:val="32"/>
+          <w:szCs w:val="32"/>
+          <w:lang w:val="es-VE" w:eastAsia="zxx" w:bidi="zxx"/>
+        </w:rPr>
         <w:t>¿Cómo actualizar las plantillas para las constancias?</w:t>
       </w:r>
     </w:p>
@@ -4378,9 +4496,7 @@
         <w:bidi w:val="0"/>
         <w:spacing w:lineRule="auto" w:line="240"/>
         <w:jc w:val="left"/>
-        <w:rPr>
-          <w:lang w:val="es-VE"/>
-        </w:rPr>
+        <w:rPr/>
       </w:pPr>
       <w:r>
         <w:rPr>
@@ -4411,9 +4527,7 @@
         <w:bidi w:val="0"/>
         <w:spacing w:lineRule="auto" w:line="240"/>
         <w:jc w:val="left"/>
-        <w:rPr>
-          <w:lang w:val="es-VE"/>
-        </w:rPr>
+        <w:rPr/>
       </w:pPr>
       <w:r>
         <w:rPr>
@@ -4428,9 +4542,7 @@
         <w:bidi w:val="0"/>
         <w:spacing w:lineRule="auto" w:line="240"/>
         <w:jc w:val="left"/>
-        <w:rPr>
-          <w:lang w:val="es-VE"/>
-        </w:rPr>
+        <w:rPr/>
       </w:pPr>
       <w:r>
         <w:rPr>
@@ -4529,9 +4641,7 @@
         <w:bidi w:val="0"/>
         <w:spacing w:lineRule="auto" w:line="240"/>
         <w:jc w:val="left"/>
-        <w:rPr>
-          <w:lang w:val="es-VE"/>
-        </w:rPr>
+        <w:rPr/>
       </w:pPr>
       <w:r>
         <w:rPr>
@@ -4546,9 +4656,7 @@
         <w:bidi w:val="0"/>
         <w:spacing w:lineRule="auto" w:line="240"/>
         <w:jc w:val="left"/>
-        <w:rPr>
-          <w:lang w:val="es-VE"/>
-        </w:rPr>
+        <w:rPr/>
       </w:pPr>
       <w:r>
         <w:rPr>
@@ -4571,9 +4679,7 @@
         <w:spacing w:lineRule="auto" w:line="240"/>
         <w:ind w:left="709" w:hanging="283"/>
         <w:jc w:val="left"/>
-        <w:rPr>
-          <w:lang w:val="es-VE"/>
-        </w:rPr>
+        <w:rPr/>
       </w:pPr>
       <w:r>
         <w:rPr>
@@ -4596,9 +4702,7 @@
         <w:spacing w:lineRule="auto" w:line="240"/>
         <w:ind w:left="709" w:hanging="283"/>
         <w:jc w:val="left"/>
-        <w:rPr>
-          <w:lang w:val="es-VE"/>
-        </w:rPr>
+        <w:rPr/>
       </w:pPr>
       <w:r>
         <w:rPr>
@@ -4645,9 +4749,7 @@
         <w:bidi w:val="0"/>
         <w:spacing w:lineRule="auto" w:line="240"/>
         <w:jc w:val="left"/>
-        <w:rPr>
-          <w:lang w:val="es-VE"/>
-        </w:rPr>
+        <w:rPr/>
       </w:pPr>
       <w:r>
         <w:rPr>
@@ -4701,9 +4803,7 @@
         <w:spacing w:lineRule="auto" w:line="240"/>
         <w:ind w:left="709" w:hanging="283"/>
         <w:jc w:val="left"/>
-        <w:rPr>
-          <w:lang w:val="es-VE"/>
-        </w:rPr>
+        <w:rPr/>
       </w:pPr>
       <w:r>
         <w:rPr>
@@ -4719,9 +4819,7 @@
         <w:spacing w:lineRule="auto" w:line="240"/>
         <w:ind w:left="0" w:hanging="0"/>
         <w:jc w:val="left"/>
-        <w:rPr>
-          <w:lang w:val="es-VE"/>
-        </w:rPr>
+        <w:rPr/>
       </w:pPr>
       <w:r>
         <w:rPr>
@@ -4738,9 +4836,7 @@
         <w:bidi w:val="0"/>
         <w:spacing w:lineRule="auto" w:line="240"/>
         <w:jc w:val="left"/>
-        <w:rPr>
-          <w:lang w:val="es-VE"/>
-        </w:rPr>
+        <w:rPr/>
       </w:pPr>
       <w:r>
         <w:rPr>
@@ -4771,9 +4867,7 @@
         <w:bidi w:val="0"/>
         <w:spacing w:lineRule="auto" w:line="240"/>
         <w:jc w:val="left"/>
-        <w:rPr>
-          <w:lang w:val="es-VE"/>
-        </w:rPr>
+        <w:rPr/>
       </w:pPr>
       <w:r>
         <w:rPr>
@@ -4788,9 +4882,7 @@
         <w:bidi w:val="0"/>
         <w:spacing w:lineRule="auto" w:line="240"/>
         <w:jc w:val="left"/>
-        <w:rPr>
-          <w:lang w:val="es-VE"/>
-        </w:rPr>
+        <w:rPr/>
       </w:pPr>
       <w:r>
         <w:rPr>
@@ -4945,9 +5037,7 @@
         <w:bidi w:val="0"/>
         <w:spacing w:lineRule="auto" w:line="240"/>
         <w:jc w:val="left"/>
-        <w:rPr>
-          <w:lang w:val="es-VE"/>
-        </w:rPr>
+        <w:rPr/>
       </w:pPr>
       <w:r>
         <w:rPr>
@@ -5000,9 +5090,7 @@
         <w:spacing w:lineRule="auto" w:line="240"/>
         <w:ind w:left="709" w:hanging="283"/>
         <w:jc w:val="left"/>
-        <w:rPr>
-          <w:lang w:val="es-VE"/>
-        </w:rPr>
+        <w:rPr/>
       </w:pPr>
       <w:r>
         <w:rPr>
@@ -5090,9 +5178,7 @@
         <w:bidi w:val="0"/>
         <w:spacing w:lineRule="auto" w:line="240"/>
         <w:jc w:val="left"/>
-        <w:rPr>
-          <w:lang w:val="es-VE"/>
-        </w:rPr>
+        <w:rPr/>
       </w:pPr>
       <w:r>
         <w:rPr>
@@ -5107,9 +5193,7 @@
         <w:bidi w:val="0"/>
         <w:spacing w:lineRule="auto" w:line="240"/>
         <w:jc w:val="left"/>
-        <w:rPr>
-          <w:lang w:val="es-VE"/>
-        </w:rPr>
+        <w:rPr/>
       </w:pPr>
       <w:r>
         <w:rPr>
@@ -5240,9 +5324,7 @@
         <w:bidi w:val="0"/>
         <w:spacing w:lineRule="auto" w:line="240"/>
         <w:jc w:val="left"/>
-        <w:rPr>
-          <w:lang w:val="es-VE"/>
-        </w:rPr>
+        <w:rPr/>
       </w:pPr>
       <w:r>
         <w:rPr>
@@ -5257,9 +5339,7 @@
         <w:bidi w:val="0"/>
         <w:spacing w:lineRule="auto" w:line="240"/>
         <w:jc w:val="left"/>
-        <w:rPr>
-          <w:lang w:val="es-VE"/>
-        </w:rPr>
+        <w:rPr/>
       </w:pPr>
       <w:r>
         <w:rPr>
@@ -5298,9 +5378,7 @@
         <w:bidi w:val="0"/>
         <w:spacing w:lineRule="auto" w:line="240"/>
         <w:jc w:val="left"/>
-        <w:rPr>
-          <w:lang w:val="es-VE"/>
-        </w:rPr>
+        <w:rPr/>
       </w:pPr>
       <w:r>
         <w:rPr>
@@ -5339,9 +5417,7 @@
         <w:bidi w:val="0"/>
         <w:spacing w:lineRule="auto" w:line="240"/>
         <w:jc w:val="left"/>
-        <w:rPr>
-          <w:lang w:val="es-VE"/>
-        </w:rPr>
+        <w:rPr/>
       </w:pPr>
       <w:r>
         <w:rPr>
@@ -5372,9 +5448,7 @@
         <w:bidi w:val="0"/>
         <w:spacing w:lineRule="auto" w:line="240"/>
         <w:jc w:val="left"/>
-        <w:rPr>
-          <w:lang w:val="es-VE"/>
-        </w:rPr>
+        <w:rPr/>
       </w:pPr>
       <w:r>
         <w:rPr>
@@ -5433,9 +5507,7 @@
         <w:spacing w:lineRule="auto" w:line="240"/>
         <w:ind w:left="709" w:hanging="283"/>
         <w:jc w:val="left"/>
-        <w:rPr>
-          <w:lang w:val="es-VE"/>
-        </w:rPr>
+        <w:rPr/>
       </w:pPr>
       <w:r>
         <w:rPr>
@@ -5451,9 +5523,7 @@
         <w:spacing w:lineRule="auto" w:line="240"/>
         <w:ind w:left="0" w:hanging="0"/>
         <w:jc w:val="left"/>
-        <w:rPr>
-          <w:lang w:val="es-VE"/>
-        </w:rPr>
+        <w:rPr/>
       </w:pPr>
       <w:r>
         <w:rPr>
@@ -5470,9 +5540,7 @@
         <w:bidi w:val="0"/>
         <w:spacing w:lineRule="auto" w:line="240"/>
         <w:jc w:val="left"/>
-        <w:rPr>
-          <w:lang w:val="es-VE"/>
-        </w:rPr>
+        <w:rPr/>
       </w:pPr>
       <w:r>
         <w:rPr>
@@ -5572,9 +5640,7 @@
         <w:spacing w:lineRule="auto" w:line="240"/>
         <w:ind w:left="709" w:hanging="283"/>
         <w:jc w:val="left"/>
-        <w:rPr>
-          <w:lang w:val="es-VE"/>
-        </w:rPr>
+        <w:rPr/>
       </w:pPr>
       <w:r>
         <w:rPr>
@@ -5647,9 +5713,7 @@
         <w:bidi w:val="0"/>
         <w:spacing w:lineRule="auto" w:line="240"/>
         <w:jc w:val="left"/>
-        <w:rPr>
-          <w:lang w:val="es-VE"/>
-        </w:rPr>
+        <w:rPr/>
       </w:pPr>
       <w:r>
         <w:rPr>
@@ -5756,9 +5820,7 @@
         <w:bidi w:val="0"/>
         <w:spacing w:lineRule="auto" w:line="240"/>
         <w:jc w:val="left"/>
-        <w:rPr>
-          <w:lang w:val="es-VE"/>
-        </w:rPr>
+        <w:rPr/>
       </w:pPr>
       <w:r>
         <w:rPr>
@@ -5782,9 +5844,7 @@
         <w:spacing w:lineRule="auto" w:line="240"/>
         <w:ind w:left="709" w:hanging="283"/>
         <w:jc w:val="left"/>
-        <w:rPr>
-          <w:lang w:val="es-VE"/>
-        </w:rPr>
+        <w:rPr/>
       </w:pPr>
       <w:r>
         <w:rPr>
@@ -5814,9 +5874,7 @@
         <w:spacing w:lineRule="auto" w:line="240"/>
         <w:ind w:left="709" w:hanging="283"/>
         <w:jc w:val="left"/>
-        <w:rPr>
-          <w:lang w:val="es-VE"/>
-        </w:rPr>
+        <w:rPr/>
       </w:pPr>
       <w:r>
         <w:rPr>
@@ -5854,9 +5912,7 @@
         <w:bidi w:val="0"/>
         <w:spacing w:lineRule="auto" w:line="240"/>
         <w:jc w:val="left"/>
-        <w:rPr>
-          <w:lang w:val="es-VE"/>
-        </w:rPr>
+        <w:rPr/>
       </w:pPr>
       <w:r>
         <w:rPr>
@@ -5871,9 +5927,7 @@
         <w:bidi w:val="0"/>
         <w:spacing w:lineRule="auto" w:line="240"/>
         <w:jc w:val="left"/>
-        <w:rPr>
-          <w:lang w:val="es-VE"/>
-        </w:rPr>
+        <w:rPr/>
       </w:pPr>
       <w:r>
         <w:rPr>
@@ -6184,9 +6238,7 @@
         <w:bidi w:val="0"/>
         <w:spacing w:lineRule="auto" w:line="240"/>
         <w:jc w:val="left"/>
-        <w:rPr>
-          <w:lang w:val="es-VE"/>
-        </w:rPr>
+        <w:rPr/>
       </w:pPr>
       <w:r>
         <w:rPr>
@@ -6297,9 +6349,7 @@
         <w:spacing w:lineRule="auto" w:line="240"/>
         <w:ind w:left="0" w:hanging="0"/>
         <w:jc w:val="left"/>
-        <w:rPr>
-          <w:lang w:val="es-VE"/>
-        </w:rPr>
+        <w:rPr/>
       </w:pPr>
       <w:r>
         <w:rPr>
@@ -6326,9 +6376,7 @@
         <w:spacing w:lineRule="auto" w:line="240"/>
         <w:ind w:left="0" w:hanging="0"/>
         <w:jc w:val="left"/>
-        <w:rPr>
-          <w:lang w:val="es-VE"/>
-        </w:rPr>
+        <w:rPr/>
       </w:pPr>
       <w:r>
         <w:rPr>
@@ -6352,10 +6400,9 @@
           <w:tab w:val="clear" w:pos="709"/>
           <w:tab w:val="left" w:pos="0" w:leader="none"/>
         </w:tabs>
+        <w:spacing w:lineRule="auto" w:line="240"/>
         <w:ind w:left="709" w:hanging="283"/>
-        <w:rPr>
-          <w:lang w:val="es-VE"/>
-        </w:rPr>
+        <w:rPr/>
       </w:pPr>
       <w:r>
         <w:rPr>
@@ -6375,6 +6422,7 @@
           <w:tab w:val="clear" w:pos="709"/>
           <w:tab w:val="left" w:pos="0" w:leader="none"/>
         </w:tabs>
+        <w:spacing w:lineRule="auto" w:line="240"/>
         <w:ind w:left="709" w:hanging="283"/>
         <w:rPr/>
       </w:pPr>
@@ -6422,10 +6470,9 @@
           <w:tab w:val="clear" w:pos="709"/>
           <w:tab w:val="left" w:pos="0" w:leader="none"/>
         </w:tabs>
+        <w:spacing w:lineRule="auto" w:line="240"/>
         <w:ind w:left="709" w:hanging="283"/>
-        <w:rPr>
-          <w:lang w:val="es-VE"/>
-        </w:rPr>
+        <w:rPr/>
       </w:pPr>
       <w:r>
         <w:rPr>
@@ -6461,9 +6508,7 @@
         <w:spacing w:lineRule="auto" w:line="240"/>
         <w:ind w:left="0" w:hanging="0"/>
         <w:jc w:val="left"/>
-        <w:rPr>
-          <w:lang w:val="es-VE"/>
-        </w:rPr>
+        <w:rPr/>
       </w:pPr>
       <w:r>
         <w:rPr>
@@ -6479,6 +6524,7 @@
     <w:p>
       <w:pPr>
         <w:pStyle w:val="TextBody"/>
+        <w:spacing w:lineRule="auto" w:line="240"/>
         <w:rPr/>
       </w:pPr>
       <w:r>
@@ -6521,9 +6567,8 @@
           <w:ilvl w:val="0"/>
           <w:numId w:val="34"/>
         </w:numPr>
-        <w:rPr>
-          <w:lang w:val="es-VE"/>
-        </w:rPr>
+        <w:spacing w:lineRule="auto" w:line="240"/>
+        <w:rPr/>
       </w:pPr>
       <w:r>
         <w:rPr>
@@ -6566,13 +6611,7 @@
         <w:spacing w:lineRule="auto" w:line="240"/>
         <w:ind w:left="0" w:hanging="0"/>
         <w:jc w:val="left"/>
-        <w:rPr>
-          <w:b/>
-          <w:b/>
-          <w:sz w:val="32"/>
-          <w:szCs w:val="32"/>
-          <w:lang w:val="es-VE"/>
-        </w:rPr>
+        <w:rPr/>
       </w:pPr>
       <w:r>
         <w:rPr>
@@ -6591,9 +6630,8 @@
     <w:p>
       <w:pPr>
         <w:pStyle w:val="TextBody"/>
-        <w:rPr>
-          <w:lang w:val="es-VE"/>
-        </w:rPr>
+        <w:spacing w:lineRule="auto" w:line="240"/>
+        <w:rPr/>
       </w:pPr>
       <w:r>
         <w:rPr>
@@ -6648,9 +6686,8 @@
     <w:p>
       <w:pPr>
         <w:pStyle w:val="TextBody"/>
-        <w:rPr>
-          <w:lang w:val="es-VE"/>
-        </w:rPr>
+        <w:spacing w:lineRule="auto" w:line="240"/>
+        <w:rPr/>
       </w:pPr>
       <w:r>
         <w:rPr>
@@ -6686,21 +6723,14 @@
         <w:spacing w:lineRule="auto" w:line="240"/>
         <w:ind w:left="0" w:hanging="0"/>
         <w:jc w:val="left"/>
-        <w:rPr>
-          <w:b/>
+        <w:rPr/>
+      </w:pPr>
+      <w:r>
+        <w:rPr>
           <w:b/>
           <w:bCs/>
           <w:sz w:val="32"/>
           <w:szCs w:val="32"/>
-          <w:lang w:val="es-VE"/>
-        </w:rPr>
-      </w:pPr>
-      <w:r>
-        <w:rPr>
-          <w:b/>
-          <w:bCs/>
-          <w:sz w:val="32"/>
-          <w:szCs w:val="32"/>
           <w:lang w:val="es-VE" w:eastAsia="zxx" w:bidi="zxx"/>
         </w:rPr>
         <w:t>¿Porque el sistema no genera ningun archivo .docx ni pdf?</w:t>
@@ -6720,21 +6750,14 @@
         <w:spacing w:lineRule="auto" w:line="240"/>
         <w:ind w:left="0" w:hanging="0"/>
         <w:jc w:val="left"/>
-        <w:rPr>
-          <w:b w:val="false"/>
+        <w:rPr/>
+      </w:pPr>
+      <w:r>
+        <w:rPr>
           <w:b w:val="false"/>
           <w:bCs w:val="false"/>
           <w:sz w:val="24"/>
           <w:szCs w:val="24"/>
-          <w:lang w:val="es-VE"/>
-        </w:rPr>
-      </w:pPr>
-      <w:r>
-        <w:rPr>
-          <w:b w:val="false"/>
-          <w:bCs w:val="false"/>
-          <w:sz w:val="24"/>
-          <w:szCs w:val="24"/>
           <w:lang w:val="es-VE" w:eastAsia="zxx" w:bidi="zxx"/>
         </w:rPr>
         <w:t>Lo más probable es que se trate de una de estas tres cosas:</w:t>
@@ -6743,6 +6766,7 @@
     <w:p>
       <w:pPr>
         <w:pStyle w:val="Heading4"/>
+        <w:spacing w:lineRule="auto" w:line="240"/>
         <w:rPr/>
       </w:pPr>
       <w:r>
@@ -6768,6 +6792,7 @@
     <w:p>
       <w:pPr>
         <w:pStyle w:val="TextBody"/>
+        <w:spacing w:lineRule="auto" w:line="240"/>
         <w:rPr/>
       </w:pPr>
       <w:r>
@@ -6821,6 +6846,7 @@
           <w:tab w:val="clear" w:pos="709"/>
           <w:tab w:val="left" w:pos="0" w:leader="none"/>
         </w:tabs>
+        <w:spacing w:lineRule="auto" w:line="240"/>
         <w:ind w:left="709" w:hanging="283"/>
         <w:rPr/>
       </w:pPr>
@@ -6875,6 +6901,7 @@
           <w:tab w:val="clear" w:pos="709"/>
           <w:tab w:val="left" w:pos="0" w:leader="none"/>
         </w:tabs>
+        <w:spacing w:lineRule="auto" w:line="240"/>
         <w:ind w:left="709" w:hanging="283"/>
         <w:rPr/>
       </w:pPr>
@@ -6916,6 +6943,7 @@
           <w:tab w:val="clear" w:pos="709"/>
           <w:tab w:val="left" w:pos="0" w:leader="none"/>
         </w:tabs>
+        <w:spacing w:lineRule="auto" w:line="240"/>
         <w:ind w:left="709" w:hanging="283"/>
         <w:rPr/>
       </w:pPr>
@@ -6975,20 +7003,20 @@
     <w:p>
       <w:pPr>
         <w:pStyle w:val="Heading4"/>
+        <w:spacing w:lineRule="auto" w:line="240"/>
+        <w:rPr/>
+      </w:pPr>
+      <w:r>
         <w:rPr>
           <w:lang w:val="es-VE"/>
         </w:rPr>
-      </w:pPr>
-      <w:r>
-        <w:rPr>
-          <w:lang w:val="es-VE"/>
-        </w:rPr>
         <w:t>B. Permisos en la carpeta Temporal</w:t>
       </w:r>
     </w:p>
     <w:p>
       <w:pPr>
         <w:pStyle w:val="TextBody"/>
+        <w:spacing w:lineRule="auto" w:line="240"/>
         <w:rPr/>
       </w:pPr>
       <w:r>
@@ -7016,6 +7044,7 @@
           <w:tab w:val="clear" w:pos="709"/>
           <w:tab w:val="left" w:pos="0" w:leader="none"/>
         </w:tabs>
+        <w:spacing w:lineRule="auto" w:line="240"/>
         <w:ind w:left="709" w:hanging="283"/>
         <w:rPr/>
       </w:pPr>
@@ -7050,6 +7079,7 @@
           <w:tab w:val="clear" w:pos="709"/>
           <w:tab w:val="left" w:pos="0" w:leader="none"/>
         </w:tabs>
+        <w:spacing w:lineRule="auto" w:line="240"/>
         <w:ind w:left="709" w:hanging="283"/>
         <w:rPr/>
       </w:pPr>
@@ -7083,20 +7113,20 @@
     <w:p>
       <w:pPr>
         <w:pStyle w:val="Heading4"/>
+        <w:spacing w:lineRule="auto" w:line="240"/>
+        <w:rPr/>
+      </w:pPr>
+      <w:r>
         <w:rPr>
           <w:lang w:val="es-VE"/>
         </w:rPr>
-      </w:pPr>
-      <w:r>
-        <w:rPr>
-          <w:lang w:val="es-VE"/>
-        </w:rPr>
         <w:t>C. El "Modo Bloqueado" de archivos descargados</w:t>
       </w:r>
     </w:p>
     <w:p>
       <w:pPr>
         <w:pStyle w:val="TextBody"/>
+        <w:spacing w:lineRule="auto" w:line="240"/>
         <w:rPr/>
       </w:pPr>
       <w:r>
@@ -7143,6 +7173,7 @@
           <w:tab w:val="clear" w:pos="709"/>
           <w:tab w:val="left" w:pos="0" w:leader="none"/>
         </w:tabs>
+        <w:spacing w:lineRule="auto" w:line="240"/>
         <w:ind w:left="709" w:hanging="283"/>
         <w:rPr/>
       </w:pPr>
@@ -7177,14 +7208,12 @@
       <w:pPr>
         <w:pStyle w:val="Heading2"/>
         <w:suppressAutoHyphens w:val="true"/>
-        <w:overflowPunct w:val="true"/>
+        <w:overflowPunct w:val="false"/>
         <w:bidi w:val="0"/>
         <w:spacing w:lineRule="auto" w:line="240" w:before="0" w:after="140"/>
         <w:ind w:left="0" w:hanging="0"/>
         <w:jc w:val="both"/>
-        <w:rPr>
-          <w:lang w:val="es-VE"/>
-        </w:rPr>
+        <w:rPr/>
       </w:pPr>
       <w:r>
         <w:rPr>
@@ -7203,9 +7232,7 @@
         <w:bidi w:val="0"/>
         <w:spacing w:lineRule="auto" w:line="240"/>
         <w:jc w:val="left"/>
-        <w:rPr>
-          <w:lang w:val="es-VE"/>
-        </w:rPr>
+        <w:rPr/>
       </w:pPr>
       <w:r>
         <w:rPr>
@@ -7236,9 +7263,7 @@
         <w:bidi w:val="0"/>
         <w:spacing w:lineRule="auto" w:line="240"/>
         <w:jc w:val="left"/>
-        <w:rPr>
-          <w:lang w:val="es-VE"/>
-        </w:rPr>
+        <w:rPr/>
       </w:pPr>
       <w:r>
         <w:rPr>
@@ -7400,9 +7425,7 @@
         <w:bidi w:val="0"/>
         <w:spacing w:lineRule="auto" w:line="240"/>
         <w:jc w:val="left"/>
-        <w:rPr>
-          <w:lang w:val="es-VE"/>
-        </w:rPr>
+        <w:rPr/>
       </w:pPr>
       <w:r>
         <w:rPr>
@@ -7598,9 +7621,7 @@
         <w:bidi w:val="0"/>
         <w:spacing w:lineRule="auto" w:line="240"/>
         <w:jc w:val="left"/>
-        <w:rPr>
-          <w:lang w:val="es-VE"/>
-        </w:rPr>
+        <w:rPr/>
       </w:pPr>
       <w:r>
         <w:rPr>
@@ -7718,9 +7739,7 @@
         <w:spacing w:lineRule="auto" w:line="240"/>
         <w:ind w:left="709" w:hanging="283"/>
         <w:jc w:val="left"/>
-        <w:rPr>
-          <w:lang w:val="es-VE"/>
-        </w:rPr>
+        <w:rPr/>
       </w:pPr>
       <w:r>
         <w:rPr>
@@ -7766,6 +7785,7 @@
           <w:tab w:val="clear" w:pos="709"/>
           <w:tab w:val="left" w:pos="0" w:leader="none"/>
         </w:tabs>
+        <w:spacing w:lineRule="auto" w:line="240"/>
         <w:ind w:left="1069" w:hanging="283"/>
         <w:rPr/>
       </w:pPr>
@@ -7818,9 +7838,7 @@
         <w:bidi w:val="0"/>
         <w:spacing w:lineRule="auto" w:line="240"/>
         <w:jc w:val="left"/>
-        <w:rPr>
-          <w:lang w:val="es-VE"/>
-        </w:rPr>
+        <w:rPr/>
       </w:pPr>
       <w:r>
         <w:rPr>
@@ -8007,9 +8025,7 @@
         <w:bidi w:val="0"/>
         <w:spacing w:lineRule="auto" w:line="240"/>
         <w:jc w:val="left"/>
-        <w:rPr>
-          <w:lang w:val="es-VE"/>
-        </w:rPr>
+        <w:rPr/>
       </w:pPr>
       <w:r>
         <w:rPr>
@@ -8207,13 +8223,11 @@
       <w:pPr>
         <w:pStyle w:val="TextBody"/>
         <w:suppressAutoHyphens w:val="true"/>
-        <w:overflowPunct w:val="true"/>
+        <w:overflowPunct w:val="false"/>
         <w:bidi w:val="0"/>
         <w:spacing w:lineRule="auto" w:line="240" w:before="0" w:after="140"/>
         <w:jc w:val="both"/>
-        <w:rPr>
-          <w:lang w:val="es-VE"/>
-        </w:rPr>
+        <w:rPr/>
       </w:pPr>
       <w:r>
         <w:rPr>
@@ -8238,13 +8252,11 @@
       <w:pPr>
         <w:pStyle w:val="TextBody"/>
         <w:suppressAutoHyphens w:val="true"/>
-        <w:overflowPunct w:val="true"/>
+        <w:overflowPunct w:val="false"/>
         <w:bidi w:val="0"/>
         <w:spacing w:lineRule="auto" w:line="240" w:before="0" w:after="140"/>
         <w:jc w:val="both"/>
-        <w:rPr>
-          <w:lang w:val="es-VE"/>
-        </w:rPr>
+        <w:rPr/>
       </w:pPr>
       <w:r>
         <w:rPr>
@@ -8264,10 +8276,9 @@
           <w:tab w:val="clear" w:pos="709"/>
           <w:tab w:val="left" w:pos="0" w:leader="none"/>
         </w:tabs>
+        <w:spacing w:lineRule="auto" w:line="240"/>
         <w:ind w:left="709" w:hanging="283"/>
-        <w:rPr>
-          <w:lang w:val="es-VE"/>
-        </w:rPr>
+        <w:rPr/>
       </w:pPr>
       <w:r>
         <w:rPr>
@@ -8320,10 +8331,9 @@
           <w:tab w:val="clear" w:pos="709"/>
           <w:tab w:val="left" w:pos="0" w:leader="none"/>
         </w:tabs>
+        <w:spacing w:lineRule="auto" w:line="240"/>
         <w:ind w:left="709" w:hanging="283"/>
-        <w:rPr>
-          <w:lang w:val="es-VE"/>
-        </w:rPr>
+        <w:rPr/>
       </w:pPr>
       <w:r>
         <w:rPr>
@@ -8389,10 +8399,9 @@
           <w:tab w:val="clear" w:pos="709"/>
           <w:tab w:val="left" w:pos="0" w:leader="none"/>
         </w:tabs>
+        <w:spacing w:lineRule="auto" w:line="240"/>
         <w:ind w:left="709" w:hanging="283"/>
-        <w:rPr>
-          <w:lang w:val="es-VE"/>
-        </w:rPr>
+        <w:rPr/>
       </w:pPr>
       <w:r>
         <w:rPr>
@@ -8432,10 +8441,9 @@
           <w:tab w:val="clear" w:pos="709"/>
           <w:tab w:val="left" w:pos="0" w:leader="none"/>
         </w:tabs>
+        <w:spacing w:lineRule="auto" w:line="240"/>
         <w:ind w:left="709" w:hanging="283"/>
-        <w:rPr>
-          <w:lang w:val="es-VE"/>
-        </w:rPr>
+        <w:rPr/>
       </w:pPr>
       <w:r>
         <w:rPr>
@@ -8468,13 +8476,11 @@
       <w:pPr>
         <w:pStyle w:val="TextBody"/>
         <w:suppressAutoHyphens w:val="true"/>
-        <w:overflowPunct w:val="true"/>
+        <w:overflowPunct w:val="false"/>
         <w:bidi w:val="0"/>
         <w:spacing w:lineRule="auto" w:line="240" w:before="0" w:after="140"/>
         <w:jc w:val="both"/>
-        <w:rPr>
-          <w:lang w:val="es-VE"/>
-        </w:rPr>
+        <w:rPr/>
       </w:pPr>
       <w:r>
         <w:rPr/>
@@ -13496,6 +13502,262 @@
     </w:lvl>
   </w:abstractNum>
   <w:abstractNum w:abstractNumId="39">
+    <w:lvl w:ilvl="0">
+      <w:start w:val="1"/>
+      <w:numFmt w:val="decimal"/>
+      <w:lvlText w:val="%1."/>
+      <w:lvlJc w:val="left"/>
+      <w:pPr>
+        <w:tabs>
+          <w:tab w:val="num" w:pos="709"/>
+        </w:tabs>
+        <w:ind w:left="709" w:hanging="283"/>
+      </w:pPr>
+      <w:rPr/>
+    </w:lvl>
+    <w:lvl w:ilvl="1">
+      <w:start w:val="1"/>
+      <w:numFmt w:val="decimal"/>
+      <w:lvlText w:val="%2."/>
+      <w:lvlJc w:val="left"/>
+      <w:pPr>
+        <w:tabs>
+          <w:tab w:val="num" w:pos="1418"/>
+        </w:tabs>
+        <w:ind w:left="1418" w:hanging="283"/>
+      </w:pPr>
+      <w:rPr/>
+    </w:lvl>
+    <w:lvl w:ilvl="2">
+      <w:start w:val="1"/>
+      <w:numFmt w:val="decimal"/>
+      <w:lvlText w:val="%3."/>
+      <w:lvlJc w:val="left"/>
+      <w:pPr>
+        <w:tabs>
+          <w:tab w:val="num" w:pos="2127"/>
+        </w:tabs>
+        <w:ind w:left="2127" w:hanging="283"/>
+      </w:pPr>
+      <w:rPr/>
+    </w:lvl>
+    <w:lvl w:ilvl="3">
+      <w:start w:val="1"/>
+      <w:numFmt w:val="decimal"/>
+      <w:lvlText w:val="%4."/>
+      <w:lvlJc w:val="left"/>
+      <w:pPr>
+        <w:tabs>
+          <w:tab w:val="num" w:pos="2836"/>
+        </w:tabs>
+        <w:ind w:left="2836" w:hanging="283"/>
+      </w:pPr>
+      <w:rPr/>
+    </w:lvl>
+    <w:lvl w:ilvl="4">
+      <w:start w:val="1"/>
+      <w:numFmt w:val="decimal"/>
+      <w:lvlText w:val="%5."/>
+      <w:lvlJc w:val="left"/>
+      <w:pPr>
+        <w:tabs>
+          <w:tab w:val="num" w:pos="3545"/>
+        </w:tabs>
+        <w:ind w:left="3545" w:hanging="283"/>
+      </w:pPr>
+      <w:rPr/>
+    </w:lvl>
+    <w:lvl w:ilvl="5">
+      <w:start w:val="1"/>
+      <w:numFmt w:val="decimal"/>
+      <w:lvlText w:val="%6."/>
+      <w:lvlJc w:val="left"/>
+      <w:pPr>
+        <w:tabs>
+          <w:tab w:val="num" w:pos="4254"/>
+        </w:tabs>
+        <w:ind w:left="4254" w:hanging="283"/>
+      </w:pPr>
+      <w:rPr/>
+    </w:lvl>
+    <w:lvl w:ilvl="6">
+      <w:start w:val="1"/>
+      <w:numFmt w:val="decimal"/>
+      <w:lvlText w:val="%7."/>
+      <w:lvlJc w:val="left"/>
+      <w:pPr>
+        <w:tabs>
+          <w:tab w:val="num" w:pos="4963"/>
+        </w:tabs>
+        <w:ind w:left="4963" w:hanging="283"/>
+      </w:pPr>
+      <w:rPr/>
+    </w:lvl>
+    <w:lvl w:ilvl="7">
+      <w:start w:val="1"/>
+      <w:numFmt w:val="decimal"/>
+      <w:lvlText w:val="%8."/>
+      <w:lvlJc w:val="left"/>
+      <w:pPr>
+        <w:tabs>
+          <w:tab w:val="num" w:pos="5672"/>
+        </w:tabs>
+        <w:ind w:left="5672" w:hanging="283"/>
+      </w:pPr>
+      <w:rPr/>
+    </w:lvl>
+    <w:lvl w:ilvl="8">
+      <w:start w:val="1"/>
+      <w:numFmt w:val="decimal"/>
+      <w:lvlText w:val="%9."/>
+      <w:lvlJc w:val="left"/>
+      <w:pPr>
+        <w:tabs>
+          <w:tab w:val="num" w:pos="6381"/>
+        </w:tabs>
+        <w:ind w:left="6381" w:hanging="283"/>
+      </w:pPr>
+      <w:rPr/>
+    </w:lvl>
+  </w:abstractNum>
+  <w:abstractNum w:abstractNumId="40">
+    <w:lvl w:ilvl="0">
+      <w:start w:val="1"/>
+      <w:numFmt w:val="bullet"/>
+      <w:lvlText w:val=""/>
+      <w:lvlJc w:val="left"/>
+      <w:pPr>
+        <w:tabs>
+          <w:tab w:val="num" w:pos="709"/>
+        </w:tabs>
+        <w:ind w:left="709" w:hanging="283"/>
+      </w:pPr>
+      <w:rPr>
+        <w:rFonts w:ascii="Symbol" w:hAnsi="Symbol" w:cs="Symbol" w:hint="default"/>
+      </w:rPr>
+    </w:lvl>
+    <w:lvl w:ilvl="1">
+      <w:start w:val="1"/>
+      <w:numFmt w:val="bullet"/>
+      <w:lvlText w:val=""/>
+      <w:lvlJc w:val="left"/>
+      <w:pPr>
+        <w:tabs>
+          <w:tab w:val="num" w:pos="1418"/>
+        </w:tabs>
+        <w:ind w:left="1418" w:hanging="283"/>
+      </w:pPr>
+      <w:rPr>
+        <w:rFonts w:ascii="Symbol" w:hAnsi="Symbol" w:cs="Symbol" w:hint="default"/>
+      </w:rPr>
+    </w:lvl>
+    <w:lvl w:ilvl="2">
+      <w:start w:val="1"/>
+      <w:numFmt w:val="bullet"/>
+      <w:lvlText w:val=""/>
+      <w:lvlJc w:val="left"/>
+      <w:pPr>
+        <w:tabs>
+          <w:tab w:val="num" w:pos="2127"/>
+        </w:tabs>
+        <w:ind w:left="2127" w:hanging="283"/>
+      </w:pPr>
+      <w:rPr>
+        <w:rFonts w:ascii="Symbol" w:hAnsi="Symbol" w:cs="Symbol" w:hint="default"/>
+      </w:rPr>
+    </w:lvl>
+    <w:lvl w:ilvl="3">
+      <w:start w:val="1"/>
+      <w:numFmt w:val="bullet"/>
+      <w:lvlText w:val=""/>
+      <w:lvlJc w:val="left"/>
+      <w:pPr>
+        <w:tabs>
+          <w:tab w:val="num" w:pos="2836"/>
+        </w:tabs>
+        <w:ind w:left="2836" w:hanging="283"/>
+      </w:pPr>
+      <w:rPr>
+        <w:rFonts w:ascii="Symbol" w:hAnsi="Symbol" w:cs="Symbol" w:hint="default"/>
+      </w:rPr>
+    </w:lvl>
+    <w:lvl w:ilvl="4">
+      <w:start w:val="1"/>
+      <w:numFmt w:val="bullet"/>
+      <w:lvlText w:val=""/>
+      <w:lvlJc w:val="left"/>
+      <w:pPr>
+        <w:tabs>
+          <w:tab w:val="num" w:pos="3545"/>
+        </w:tabs>
+        <w:ind w:left="3545" w:hanging="283"/>
+      </w:pPr>
+      <w:rPr>
+        <w:rFonts w:ascii="Symbol" w:hAnsi="Symbol" w:cs="Symbol" w:hint="default"/>
+      </w:rPr>
+    </w:lvl>
+    <w:lvl w:ilvl="5">
+      <w:start w:val="1"/>
+      <w:numFmt w:val="bullet"/>
+      <w:lvlText w:val=""/>
+      <w:lvlJc w:val="left"/>
+      <w:pPr>
+        <w:tabs>
+          <w:tab w:val="num" w:pos="4254"/>
+        </w:tabs>
+        <w:ind w:left="4254" w:hanging="283"/>
+      </w:pPr>
+      <w:rPr>
+        <w:rFonts w:ascii="Symbol" w:hAnsi="Symbol" w:cs="Symbol" w:hint="default"/>
+      </w:rPr>
+    </w:lvl>
+    <w:lvl w:ilvl="6">
+      <w:start w:val="1"/>
+      <w:numFmt w:val="bullet"/>
+      <w:lvlText w:val=""/>
+      <w:lvlJc w:val="left"/>
+      <w:pPr>
+        <w:tabs>
+          <w:tab w:val="num" w:pos="4963"/>
+        </w:tabs>
+        <w:ind w:left="4963" w:hanging="283"/>
+      </w:pPr>
+      <w:rPr>
+        <w:rFonts w:ascii="Symbol" w:hAnsi="Symbol" w:cs="Symbol" w:hint="default"/>
+      </w:rPr>
+    </w:lvl>
+    <w:lvl w:ilvl="7">
+      <w:start w:val="1"/>
+      <w:numFmt w:val="bullet"/>
+      <w:lvlText w:val=""/>
+      <w:lvlJc w:val="left"/>
+      <w:pPr>
+        <w:tabs>
+          <w:tab w:val="num" w:pos="5672"/>
+        </w:tabs>
+        <w:ind w:left="5672" w:hanging="283"/>
+      </w:pPr>
+      <w:rPr>
+        <w:rFonts w:ascii="Symbol" w:hAnsi="Symbol" w:cs="Symbol" w:hint="default"/>
+      </w:rPr>
+    </w:lvl>
+    <w:lvl w:ilvl="8">
+      <w:start w:val="1"/>
+      <w:numFmt w:val="bullet"/>
+      <w:lvlText w:val=""/>
+      <w:lvlJc w:val="left"/>
+      <w:pPr>
+        <w:tabs>
+          <w:tab w:val="num" w:pos="6381"/>
+        </w:tabs>
+        <w:ind w:left="6381" w:hanging="283"/>
+      </w:pPr>
+      <w:rPr>
+        <w:rFonts w:ascii="Symbol" w:hAnsi="Symbol" w:cs="Symbol" w:hint="default"/>
+      </w:rPr>
+    </w:lvl>
+  </w:abstractNum>
+  <w:abstractNum w:abstractNumId="41">
     <w:lvl w:ilvl="0">
       <w:start w:val="1"/>
       <w:numFmt w:val="none"/>
@@ -13731,6 +13993,12 @@
   <w:num w:numId="39">
     <w:abstractNumId w:val="39"/>
   </w:num>
+  <w:num w:numId="40">
+    <w:abstractNumId w:val="40"/>
+  </w:num>
+  <w:num w:numId="41">
+    <w:abstractNumId w:val="41"/>
+  </w:num>
 </w:numbering>
 </file>
 
@@ -13758,7 +14026,7 @@
     <w:pPr>
       <w:widowControl/>
       <w:suppressAutoHyphens w:val="true"/>
-      <w:overflowPunct w:val="true"/>
+      <w:overflowPunct w:val="false"/>
       <w:bidi w:val="0"/>
       <w:spacing w:before="0" w:after="0"/>
       <w:jc w:val="left"/>
@@ -13972,7 +14240,7 @@
     <w:pPr>
       <w:widowControl/>
       <w:suppressAutoHyphens w:val="true"/>
-      <w:overflowPunct w:val="true"/>
+      <w:overflowPunct w:val="false"/>
       <w:bidi w:val="0"/>
       <w:spacing w:lineRule="auto" w:line="240" w:before="0" w:after="0"/>
       <w:jc w:val="left"/>
@@ -14013,5 +14281,15 @@
       <w:szCs w:val="12"/>
     </w:rPr>
   </w:style>
+  <w:style w:type="paragraph" w:styleId="Quotations">
+    <w:name w:val="Quotations"/>
+    <w:basedOn w:val="Normal"/>
+    <w:qFormat/>
+    <w:pPr>
+      <w:spacing w:before="0" w:after="283"/>
+      <w:ind w:left="567" w:right="567" w:hanging="0"/>
+    </w:pPr>
+    <w:rPr/>
+  </w:style>
 </w:styles>
 </file>
</xml_diff>